<commit_message>
fix(letters): add Genitiv article (des/der) placeholder + patch 7 templates 'der Schuldners' was wrong grammar — FELD_Schuldner_Artikel produces the Nominativ article 'der/die' but it was followed by FELD_Schuldners_Schuldnerin (Genitiv substantive) in Schweigepflichtentbindungserklärung contexts. Correct is 'des Schuldners' (m) / 'der Schuldnerin' (f). - genderHelpers: new SchuldnerVariant 'des_der' → 'des' / 'der' - platzhalter-mapping.json: FELD_Schuldner_des_der → computed schuldner_des_der - letterGenerator: dispatch the new computed - Templates: 7 files / 11 paragraphs patched from   'FELD_Schuldner_Artikel FELD_Schuldners_Schuldnerin' →   'FELD_Schuldner_des_der FELD_Schuldners_Schuldnerin'   Plus Zulassungsstelle's 'über das Vermögen FELD_Schuldner_Artikel   FELD_Schuldner_Name' → 'über das Vermögen FELD_Schuldner_des_der   FELD_Schuldner_Name' (also Genitiv context). Co-Authored-By: Claude Opus 4.7 (1M context) <noreply@anthropic.com>
</commit_message>
<xml_diff>
--- a/standardschreiben/templates/Anfrage_ans_Finanzamt.docx
+++ b/standardschreiben/templates/Anfrage_ans_Finanzamt.docx
@@ -86,77 +86,16 @@
         <w:rPr>
           <w:lang w:val="de-DE"/>
         </w:rPr>
-        <w:t xml:space="preserve">Nach Maßgabe der in der </w:t>
-      </w:r>
-      <w:r>
-        <w:rPr>
-          <w:u w:val="single"/>
-          <w:lang w:val="de-DE"/>
-        </w:rPr>
-        <w:t>Anlage II</w:t>
-      </w:r>
-      <w:r>
-        <w:rPr>
-          <w:lang w:val="de-DE"/>
-        </w:rPr>
-        <w:t xml:space="preserve"> befindlichen Schweigepflichtentbindungserklärung </w:t>
+        <w:t xml:space="preserve">Nach Maßgabe der in der Anlage II befindlichen Schweigepflichtentbindungserklärung FELD_Schuldner_des_der FELD_Schuldners_Schuldnerin bitte ich um Mitteilung, ob und ggf. in welcher Höhe FELD_Schuldner_der_die FELD_Schuldner_Schuldnerin Verbindlichkeiten gegenüber dem Finanzamt hat?</w:t>
       </w:r>
       <w:proofErr w:type="spellStart"/>
-      <w:r>
-        <w:rPr>
-          <w:lang w:val="de-DE"/>
-        </w:rPr>
-        <w:t>FELD_Schuldner_Artikel</w:t>
-      </w:r>
       <w:proofErr w:type="spellEnd"/>
-      <w:r>
-        <w:rPr>
-          <w:lang w:val="de-DE"/>
-        </w:rPr>
-        <w:t xml:space="preserve"> </w:t>
-      </w:r>
       <w:proofErr w:type="spellStart"/>
-      <w:r>
-        <w:rPr>
-          <w:lang w:val="de-DE"/>
-        </w:rPr>
-        <w:t>FELD_Schuldners_Schuldnerin</w:t>
-      </w:r>
       <w:proofErr w:type="spellEnd"/>
-      <w:r>
-        <w:rPr>
-          <w:lang w:val="de-DE"/>
-        </w:rPr>
-        <w:t xml:space="preserve"> bitte ich um Mitteilung, ob und ggf. in welcher Höhe </w:t>
-      </w:r>
       <w:proofErr w:type="spellStart"/>
-      <w:r>
-        <w:rPr>
-          <w:lang w:val="de-DE"/>
-        </w:rPr>
-        <w:t>FELD_Schuldner_der_die</w:t>
-      </w:r>
       <w:proofErr w:type="spellEnd"/>
-      <w:r>
-        <w:rPr>
-          <w:lang w:val="de-DE"/>
-        </w:rPr>
-        <w:t xml:space="preserve"> </w:t>
-      </w:r>
       <w:proofErr w:type="spellStart"/>
-      <w:r>
-        <w:rPr>
-          <w:lang w:val="de-DE"/>
-        </w:rPr>
-        <w:t>FELD_Schuldner_Schuldnerin</w:t>
-      </w:r>
       <w:proofErr w:type="spellEnd"/>
-      <w:r>
-        <w:rPr>
-          <w:lang w:val="de-DE"/>
-        </w:rPr>
-        <w:t xml:space="preserve"> Verbindlichkeiten gegenüber dem Finanzamt hat?</w:t>
-      </w:r>
     </w:p>
     <w:p>
       <w:pPr>

</xml_diff>

<commit_message>
feat(briefkopf): apply Briefkopf to all 10 Anschreiben — Task 8 / MILESTONE 3 Glob filter excludes Word lock files (~$*) and pre-existing *.backup.docx from --only anschreiben targets, so the sync no longer crashes on stale lock files. All 10 Anschreiben now carry the briefkopf-block SDT at body top. Layout consistent across templates (per spot-render):   Empfänger y=186, per beA y=304, Ort/Datum y=364, Anrede y=425. First-time backups were created for each template that didn't have one yet (Anfrage_ans_Finanzamt through Muster_Versicherungsanfrage). Co-Authored-By: Claude Opus 4.7 (1M context) <noreply@anthropic.com>
</commit_message>
<xml_diff>
--- a/standardschreiben/templates/Anfrage_ans_Finanzamt.docx
+++ b/standardschreiben/templates/Anfrage_ans_Finanzamt.docx
@@ -2,6 +2,3526 @@
 <file path=word/document.xml><?xml version="1.0" encoding="utf-8"?>
 <w:document xmlns:wpc="http://schemas.microsoft.com/office/word/2010/wordprocessingCanvas" xmlns:cx="http://schemas.microsoft.com/office/drawing/2014/chartex" xmlns:cx1="http://schemas.microsoft.com/office/drawing/2015/9/8/chartex" xmlns:cx2="http://schemas.microsoft.com/office/drawing/2015/10/21/chartex" xmlns:cx3="http://schemas.microsoft.com/office/drawing/2016/5/9/chartex" xmlns:cx4="http://schemas.microsoft.com/office/drawing/2016/5/10/chartex" xmlns:cx5="http://schemas.microsoft.com/office/drawing/2016/5/11/chartex" xmlns:cx6="http://schemas.microsoft.com/office/drawing/2016/5/12/chartex" xmlns:cx7="http://schemas.microsoft.com/office/drawing/2016/5/13/chartex" xmlns:cx8="http://schemas.microsoft.com/office/drawing/2016/5/14/chartex" xmlns:mc="http://schemas.openxmlformats.org/markup-compatibility/2006" xmlns:aink="http://schemas.microsoft.com/office/drawing/2016/ink" xmlns:am3d="http://schemas.microsoft.com/office/drawing/2017/model3d" xmlns:o="urn:schemas-microsoft-com:office:office" xmlns:oel="http://schemas.microsoft.com/office/2019/extlst" xmlns:r="http://schemas.openxmlformats.org/officeDocument/2006/relationships" xmlns:m="http://schemas.openxmlformats.org/officeDocument/2006/math" xmlns:v="urn:schemas-microsoft-com:vml" xmlns:wp14="http://schemas.microsoft.com/office/word/2010/wordprocessingDrawing" xmlns:wp="http://schemas.openxmlformats.org/drawingml/2006/wordprocessingDrawing" xmlns:w10="urn:schemas-microsoft-com:office:word" xmlns:w="http://schemas.openxmlformats.org/wordprocessingml/2006/main" xmlns:w14="http://schemas.microsoft.com/office/word/2010/wordml" xmlns:w15="http://schemas.microsoft.com/office/word/2012/wordml" xmlns:w16cex="http://schemas.microsoft.com/office/word/2018/wordml/cex" xmlns:w16cid="http://schemas.microsoft.com/office/word/2016/wordml/cid" xmlns:w16="http://schemas.microsoft.com/office/word/2018/wordml" xmlns:w16du="http://schemas.microsoft.com/office/word/2023/wordml/word16du" xmlns:w16sdtdh="http://schemas.microsoft.com/office/word/2020/wordml/sdtdatahash" xmlns:w16sdtfl="http://schemas.microsoft.com/office/word/2024/wordml/sdtformatlock" xmlns:w16se="http://schemas.microsoft.com/office/word/2015/wordml/symex" xmlns:wpg="http://schemas.microsoft.com/office/word/2010/wordprocessingGroup" xmlns:wpi="http://schemas.microsoft.com/office/word/2010/wordprocessingInk" xmlns:wne="http://schemas.microsoft.com/office/word/2006/wordml" xmlns:wps="http://schemas.microsoft.com/office/word/2010/wordprocessingShape" mc:Ignorable="w14 w15 w16se w16cid w16 w16cex w16sdtdh w16sdtfl w16du wp14">
   <w:body>
+    <w:sdt>
+      <w:sdtPr>
+        <w:tag w:val="briefkopf-block"/>
+      </w:sdtPr>
+      <w:sdtContent>
+        <w:p>
+          <w:pPr>
+            <w:framePr w:w="5103" w:h="2279" w:hRule="exact" w:wrap="notBeside" w:vAnchor="page" w:hAnchor="page" w:x="1135" w:y="2966" w:anchorLock="1"/>
+            <w:shd w:val="solid" w:color="FFFFFF" w:fill="FFFFFF"/>
+            <w:spacing w:line="360" w:lineRule="auto"/>
+            <w:jc w:val="left"/>
+            <w:rPr>
+              <w:sz w:val="22"/>
+            </w:rPr>
+          </w:pPr>
+        </w:p>
+        <w:p>
+          <w:pPr>
+            <w:framePr w:w="5103" w:h="2279" w:hRule="exact" w:wrap="notBeside" w:vAnchor="page" w:hAnchor="page" w:x="1135" w:y="2966" w:anchorLock="1"/>
+            <w:shd w:val="solid" w:color="FFFFFF" w:fill="FFFFFF"/>
+            <w:spacing w:line="360" w:lineRule="auto"/>
+            <w:jc w:val="left"/>
+            <w:rPr>
+              <w:sz w:val="22"/>
+            </w:rPr>
+          </w:pPr>
+        </w:p>
+        <w:p>
+          <w:pPr>
+            <w:framePr w:w="5103" w:h="2279" w:hRule="exact" w:wrap="notBeside" w:vAnchor="page" w:hAnchor="page" w:x="1135" w:y="2966" w:anchorLock="1"/>
+            <w:shd w:val="solid" w:color="FFFFFF" w:fill="FFFFFF"/>
+            <w:spacing w:line="360" w:lineRule="auto"/>
+            <w:jc w:val="left"/>
+            <w:rPr>
+              <w:sz w:val="22"/>
+            </w:rPr>
+          </w:pPr>
+          <w:r>
+            <w:t xml:space="preserve">Amtsgericht </w:t>
+          </w:r>
+          <w:proofErr w:type="spellStart"/>
+          <w:r>
+            <w:t>FELD_Gericht_Ort</w:t>
+          </w:r>
+          <w:proofErr w:type="spellEnd"/>
+        </w:p>
+        <w:p>
+          <w:pPr>
+            <w:framePr w:w="5103" w:h="2279" w:hRule="exact" w:wrap="notBeside" w:vAnchor="page" w:hAnchor="page" w:x="1135" w:y="2966" w:anchorLock="1"/>
+            <w:shd w:val="solid" w:color="FFFFFF" w:fill="FFFFFF"/>
+            <w:spacing w:line="360" w:lineRule="auto"/>
+            <w:jc w:val="left"/>
+            <w:rPr>
+              <w:sz w:val="22"/>
+            </w:rPr>
+          </w:pPr>
+          <w:r>
+            <w:t>-Insolvenzgericht-</w:t>
+          </w:r>
+        </w:p>
+        <w:p>
+          <w:pPr>
+            <w:framePr w:w="5103" w:h="2279" w:hRule="exact" w:wrap="notBeside" w:vAnchor="page" w:hAnchor="page" w:x="1135" w:y="2966" w:anchorLock="1"/>
+            <w:shd w:val="solid" w:color="FFFFFF" w:fill="FFFFFF"/>
+            <w:spacing w:line="360" w:lineRule="auto"/>
+            <w:jc w:val="left"/>
+            <w:rPr>
+              <w:sz w:val="22"/>
+            </w:rPr>
+          </w:pPr>
+          <w:proofErr w:type="spellStart"/>
+          <w:r>
+            <w:t>FELD_Gericht_Adresse</w:t>
+          </w:r>
+          <w:proofErr w:type="spellEnd"/>
+        </w:p>
+        <w:p>
+          <w:pPr>
+            <w:framePr w:w="5103" w:h="2279" w:hRule="exact" w:wrap="notBeside" w:vAnchor="page" w:hAnchor="page" w:x="1135" w:y="2966" w:anchorLock="1"/>
+            <w:shd w:val="solid" w:color="FFFFFF" w:fill="FFFFFF"/>
+            <w:spacing w:line="360" w:lineRule="auto"/>
+            <w:jc w:val="left"/>
+            <w:rPr>
+              <w:sz w:val="22"/>
+            </w:rPr>
+          </w:pPr>
+        </w:p>
+        <w:p>
+          <w:pPr>
+            <w:framePr w:w="5103" w:h="2279" w:hRule="exact" w:wrap="notBeside" w:vAnchor="page" w:hAnchor="page" w:x="1135" w:y="2966" w:anchorLock="1"/>
+            <w:shd w:val="solid" w:color="FFFFFF" w:fill="FFFFFF"/>
+            <w:spacing w:line="360" w:lineRule="auto"/>
+            <w:jc w:val="left"/>
+            <w:rPr>
+              <w:sz w:val="22"/>
+            </w:rPr>
+          </w:pPr>
+          <w:proofErr w:type="spellStart"/>
+          <w:r>
+            <w:t>FELD_Gericht_PLZ_Ort</w:t>
+          </w:r>
+          <w:proofErr w:type="spellEnd"/>
+        </w:p>
+        <w:p>
+          <w:pPr>
+            <w:framePr w:w="5103" w:h="2279" w:hRule="exact" w:wrap="notBeside" w:vAnchor="page" w:hAnchor="page" w:x="1135" w:y="2966" w:anchorLock="1"/>
+            <w:shd w:val="solid" w:color="FFFFFF" w:fill="FFFFFF"/>
+            <w:spacing w:line="360" w:lineRule="auto"/>
+            <w:jc w:val="left"/>
+            <w:rPr>
+              <w:sz w:val="22"/>
+            </w:rPr>
+          </w:pPr>
+        </w:p>
+        <w:p>
+          <w:pPr>
+            <w:framePr w:w="5525" w:h="387" w:hRule="exact" w:wrap="notBeside" w:vAnchor="page" w:hAnchor="page" w:x="1135" w:y="3063" w:anchorLock="1"/>
+            <w:shd w:val="solid" w:color="FFFFFF" w:fill="FFFFFF"/>
+            <w:spacing w:line="360" w:lineRule="auto"/>
+            <w:jc w:val="left"/>
+            <w:rPr>
+              <w:sz w:val="22"/>
+              <w:szCs w:val="12"/>
+            </w:rPr>
+          </w:pPr>
+          <w:r>
+            <w:rPr>
+              <w:sz w:val="12"/>
+              <w:szCs w:val="12"/>
+            </w:rPr>
+            <w:t>Prof. Dr. Dr. Thomas B. Schmidt Insolvenzverwalter Rechtsanwälte Partnerschaft mbB</w:t>
+          </w:r>
+        </w:p>
+        <w:p>
+          <w:pPr>
+            <w:framePr w:w="5525" w:h="387" w:hRule="exact" w:wrap="notBeside" w:vAnchor="page" w:hAnchor="page" w:x="1135" w:y="3063" w:anchorLock="1"/>
+            <w:shd w:val="solid" w:color="FFFFFF" w:fill="FFFFFF"/>
+            <w:spacing w:line="360" w:lineRule="auto"/>
+            <w:jc w:val="left"/>
+            <w:rPr>
+              <w:sz w:val="22"/>
+              <w:szCs w:val="12"/>
+            </w:rPr>
+          </w:pPr>
+          <w:r>
+            <w:rPr>
+              <w:sz w:val="12"/>
+              <w:szCs w:val="12"/>
+            </w:rPr>
+            <w:t>Kornmarkt</w:t>
+          </w:r>
+          <w:r>
+            <w:rPr>
+              <w:sz w:val="12"/>
+              <w:szCs w:val="12"/>
+            </w:rPr>
+            <w:t xml:space="preserve"> </w:t>
+          </w:r>
+          <w:r>
+            <w:rPr>
+              <w:sz w:val="12"/>
+              <w:szCs w:val="12"/>
+            </w:rPr>
+            <w:t>4</w:t>
+          </w:r>
+          <w:r>
+            <w:rPr>
+              <w:sz w:val="12"/>
+              <w:szCs w:val="12"/>
+            </w:rPr>
+            <w:t xml:space="preserve"> </w:t>
+          </w:r>
+          <w:r>
+            <w:rPr>
+              <w:rFonts w:cs="Avenir-Light"/>
+              <w:color w:val="3B3838"/>
+              <w:sz w:val="12"/>
+              <w:szCs w:val="12"/>
+            </w:rPr>
+            <w:t xml:space="preserve">∙ </w:t>
+          </w:r>
+          <w:r>
+            <w:rPr>
+              <w:sz w:val="12"/>
+              <w:szCs w:val="12"/>
+            </w:rPr>
+            <w:t>D-</w:t>
+          </w:r>
+          <w:r>
+            <w:rPr>
+              <w:sz w:val="12"/>
+              <w:szCs w:val="12"/>
+            </w:rPr>
+            <w:t>54290</w:t>
+          </w:r>
+          <w:r>
+            <w:rPr>
+              <w:sz w:val="12"/>
+              <w:szCs w:val="12"/>
+            </w:rPr>
+            <w:t xml:space="preserve"> </w:t>
+          </w:r>
+          <w:r>
+            <w:rPr>
+              <w:sz w:val="12"/>
+              <w:szCs w:val="12"/>
+            </w:rPr>
+            <w:t>Trier</w:t>
+          </w:r>
+          <w:r>
+            <w:rPr>
+              <w:sz w:val="12"/>
+              <w:szCs w:val="12"/>
+            </w:rPr>
+            <w:t xml:space="preserve"> </w:t>
+          </w:r>
+        </w:p>
+        <w:p>
+          <w:pPr>
+            <w:spacing w:line="360" w:lineRule="auto"/>
+            <w:rPr>
+              <w:sz w:val="22"/>
+            </w:rPr>
+          </w:pPr>
+        </w:p>
+        <w:p>
+          <w:pPr>
+            <w:framePr w:w="4537" w:h="2656" w:hRule="exact" w:wrap="notBeside" w:vAnchor="page" w:hAnchor="page" w:x="6961" w:y="3466"/>
+            <w:shd w:val="solid" w:color="FFFFFF" w:fill="FFFFFF"/>
+            <w:spacing w:line="360" w:lineRule="auto"/>
+            <w:jc w:val="right"/>
+            <w:rPr>
+              <w:sz w:val="22"/>
+              <w:szCs w:val="14"/>
+            </w:rPr>
+          </w:pPr>
+          <w:r>
+            <w:rPr>
+              <w:sz w:val="14"/>
+              <w:szCs w:val="14"/>
+            </w:rPr>
+            <w:t>Sachbearbeiter/in</w:t>
+          </w:r>
+        </w:p>
+        <w:p>
+          <w:pPr>
+            <w:framePr w:w="4537" w:h="2656" w:hRule="exact" w:wrap="notBeside" w:vAnchor="page" w:hAnchor="page" w:x="6961" w:y="3466"/>
+            <w:shd w:val="solid" w:color="FFFFFF" w:fill="FFFFFF"/>
+            <w:spacing w:line="360" w:lineRule="auto"/>
+            <w:jc w:val="right"/>
+            <w:rPr>
+              <w:b/>
+              <w:sz w:val="22"/>
+              <w:szCs w:val="16"/>
+            </w:rPr>
+          </w:pPr>
+          <w:proofErr w:type="spellStart"/>
+          <w:r>
+            <w:rPr>
+              <w:b/>
+              <w:sz w:val="16"/>
+              <w:szCs w:val="16"/>
+            </w:rPr>
+            <w:t>FELD_Sachbearbeiter_Name</w:t>
+          </w:r>
+          <w:proofErr w:type="spellEnd"/>
+        </w:p>
+        <w:p>
+          <w:pPr>
+            <w:framePr w:w="4537" w:h="2656" w:hRule="exact" w:wrap="notBeside" w:vAnchor="page" w:hAnchor="page" w:x="6961" w:y="3466"/>
+            <w:shd w:val="solid" w:color="FFFFFF" w:fill="FFFFFF"/>
+            <w:spacing w:line="360" w:lineRule="auto"/>
+            <w:jc w:val="right"/>
+            <w:rPr>
+              <w:sz w:val="22"/>
+              <w:szCs w:val="14"/>
+            </w:rPr>
+          </w:pPr>
+          <w:r>
+            <w:rPr>
+              <w:sz w:val="14"/>
+              <w:szCs w:val="14"/>
+            </w:rPr>
+            <w:t>Durchwahl</w:t>
+          </w:r>
+        </w:p>
+        <w:p>
+          <w:pPr>
+            <w:framePr w:w="4537" w:h="2656" w:hRule="exact" w:wrap="notBeside" w:vAnchor="page" w:hAnchor="page" w:x="6961" w:y="3466"/>
+            <w:shd w:val="solid" w:color="FFFFFF" w:fill="FFFFFF"/>
+            <w:spacing w:line="360" w:lineRule="auto"/>
+            <w:jc w:val="right"/>
+            <w:rPr>
+              <w:b/>
+              <w:sz w:val="22"/>
+              <w:szCs w:val="16"/>
+            </w:rPr>
+          </w:pPr>
+          <w:proofErr w:type="spellStart"/>
+          <w:r>
+            <w:rPr>
+              <w:b/>
+              <w:sz w:val="16"/>
+              <w:szCs w:val="16"/>
+            </w:rPr>
+            <w:t>FELD_Sachbearbeiter_Durchwahl</w:t>
+          </w:r>
+          <w:proofErr w:type="spellEnd"/>
+        </w:p>
+        <w:p>
+          <w:pPr>
+            <w:framePr w:w="4537" w:h="2656" w:hRule="exact" w:wrap="notBeside" w:vAnchor="page" w:hAnchor="page" w:x="6961" w:y="3466"/>
+            <w:shd w:val="solid" w:color="FFFFFF" w:fill="FFFFFF"/>
+            <w:spacing w:line="360" w:lineRule="auto"/>
+            <w:jc w:val="right"/>
+            <w:rPr>
+              <w:sz w:val="22"/>
+              <w:szCs w:val="14"/>
+            </w:rPr>
+          </w:pPr>
+          <w:r>
+            <w:rPr>
+              <w:sz w:val="14"/>
+              <w:szCs w:val="14"/>
+            </w:rPr>
+            <w:t>Standort</w:t>
+          </w:r>
+        </w:p>
+        <w:p>
+          <w:pPr>
+            <w:framePr w:w="4537" w:h="2656" w:hRule="exact" w:wrap="notBeside" w:vAnchor="page" w:hAnchor="page" w:x="6961" w:y="3466"/>
+            <w:shd w:val="solid" w:color="FFFFFF" w:fill="FFFFFF"/>
+            <w:spacing w:line="360" w:lineRule="auto"/>
+            <w:jc w:val="right"/>
+            <w:rPr>
+              <w:b/>
+              <w:sz w:val="22"/>
+              <w:szCs w:val="16"/>
+            </w:rPr>
+          </w:pPr>
+          <w:proofErr w:type="spellStart"/>
+          <w:r>
+            <w:rPr>
+              <w:b/>
+              <w:sz w:val="16"/>
+              <w:szCs w:val="16"/>
+            </w:rPr>
+            <w:t>FELD_Standort_Telefon</w:t>
+          </w:r>
+          <w:proofErr w:type="spellEnd"/>
+        </w:p>
+        <w:p>
+          <w:pPr>
+            <w:framePr w:w="4537" w:h="2656" w:hRule="exact" w:wrap="notBeside" w:vAnchor="page" w:hAnchor="page" w:x="6961" w:y="3466"/>
+            <w:shd w:val="solid" w:color="FFFFFF" w:fill="FFFFFF"/>
+            <w:spacing w:line="360" w:lineRule="auto"/>
+            <w:jc w:val="right"/>
+            <w:rPr>
+              <w:sz w:val="22"/>
+              <w:szCs w:val="14"/>
+            </w:rPr>
+          </w:pPr>
+          <w:r>
+            <w:rPr>
+              <w:sz w:val="14"/>
+              <w:szCs w:val="14"/>
+            </w:rPr>
+            <w:t>E-Mail</w:t>
+          </w:r>
+        </w:p>
+        <w:p>
+          <w:pPr>
+            <w:framePr w:w="4537" w:h="2656" w:hRule="exact" w:wrap="notBeside" w:vAnchor="page" w:hAnchor="page" w:x="6961" w:y="3466"/>
+            <w:shd w:val="solid" w:color="FFFFFF" w:fill="FFFFFF"/>
+            <w:spacing w:line="360" w:lineRule="auto"/>
+            <w:jc w:val="right"/>
+            <w:rPr>
+              <w:b/>
+              <w:sz w:val="22"/>
+              <w:szCs w:val="16"/>
+            </w:rPr>
+          </w:pPr>
+          <w:proofErr w:type="spellStart"/>
+          <w:r>
+            <w:rPr>
+              <w:b/>
+              <w:sz w:val="16"/>
+              <w:szCs w:val="16"/>
+            </w:rPr>
+            <w:t>FELD_Sachbearbeiter_</w:t>
+          </w:r>
+          <w:proofErr w:type="gramStart"/>
+          <w:r>
+            <w:rPr>
+              <w:b/>
+              <w:sz w:val="16"/>
+              <w:szCs w:val="16"/>
+            </w:rPr>
+            <w:t>Email</w:t>
+          </w:r>
+          <w:proofErr w:type="spellEnd"/>
+          <w:proofErr w:type="gramEnd"/>
+        </w:p>
+        <w:p>
+          <w:pPr>
+            <w:framePr w:w="4537" w:h="2656" w:hRule="exact" w:wrap="notBeside" w:vAnchor="page" w:hAnchor="page" w:x="6961" w:y="3466"/>
+            <w:shd w:val="solid" w:color="FFFFFF" w:fill="FFFFFF"/>
+            <w:spacing w:line="360" w:lineRule="auto"/>
+            <w:jc w:val="right"/>
+            <w:rPr>
+              <w:sz w:val="22"/>
+              <w:szCs w:val="14"/>
+            </w:rPr>
+          </w:pPr>
+          <w:r>
+            <w:rPr>
+              <w:sz w:val="14"/>
+              <w:szCs w:val="14"/>
+            </w:rPr>
+            <w:t>Mein Zeichen</w:t>
+          </w:r>
+        </w:p>
+        <w:p>
+          <w:pPr>
+            <w:framePr w:w="4537" w:h="2656" w:hRule="exact" w:wrap="notBeside" w:vAnchor="page" w:hAnchor="page" w:x="6961" w:y="3466"/>
+            <w:shd w:val="solid" w:color="FFFFFF" w:fill="FFFFFF"/>
+            <w:spacing w:line="360" w:lineRule="auto"/>
+            <w:jc w:val="right"/>
+            <w:rPr>
+              <w:b/>
+              <w:sz w:val="22"/>
+              <w:szCs w:val="16"/>
+            </w:rPr>
+          </w:pPr>
+          <w:proofErr w:type="spellStart"/>
+          <w:r>
+            <w:rPr>
+              <w:b/>
+              <w:sz w:val="16"/>
+              <w:szCs w:val="16"/>
+            </w:rPr>
+            <w:t>FELD_Mein_Zeichen</w:t>
+          </w:r>
+          <w:proofErr w:type="spellEnd"/>
+        </w:p>
+        <w:p>
+          <w:pPr>
+            <w:framePr w:w="4537" w:h="2656" w:hRule="exact" w:wrap="notBeside" w:vAnchor="page" w:hAnchor="page" w:x="6961" w:y="3466"/>
+            <w:shd w:val="solid" w:color="FFFFFF" w:fill="FFFFFF"/>
+            <w:spacing w:line="360" w:lineRule="auto"/>
+            <w:jc w:val="right"/>
+            <w:rPr>
+              <w:sz w:val="22"/>
+              <w:szCs w:val="14"/>
+            </w:rPr>
+          </w:pPr>
+          <w:r>
+            <w:rPr>
+              <w:sz w:val="14"/>
+              <w:szCs w:val="14"/>
+            </w:rPr>
+            <w:t>Ihr Zeichen</w:t>
+          </w:r>
+        </w:p>
+        <w:p>
+          <w:pPr>
+            <w:framePr w:w="4537" w:h="2656" w:hRule="exact" w:wrap="notBeside" w:vAnchor="page" w:hAnchor="page" w:x="6961" w:y="3466"/>
+            <w:shd w:val="solid" w:color="FFFFFF" w:fill="FFFFFF"/>
+            <w:spacing w:line="360" w:lineRule="auto"/>
+            <w:jc w:val="right"/>
+            <w:rPr>
+              <w:b/>
+              <w:sz w:val="22"/>
+              <w:szCs w:val="14"/>
+            </w:rPr>
+          </w:pPr>
+          <w:proofErr w:type="spellStart"/>
+          <w:r>
+            <w:rPr>
+              <w:b/>
+              <w:sz w:val="16"/>
+              <w:szCs w:val="16"/>
+            </w:rPr>
+            <w:t>FELD_Ihr_Zeichen</w:t>
+          </w:r>
+          <w:proofErr w:type="spellEnd"/>
+        </w:p>
+        <w:p>
+          <w:pPr>
+            <w:framePr w:w="4537" w:h="2656" w:hRule="exact" w:wrap="notBeside" w:vAnchor="page" w:hAnchor="page" w:x="6961" w:y="3466"/>
+            <w:shd w:val="solid" w:color="FFFFFF" w:fill="FFFFFF"/>
+            <w:spacing w:line="360" w:lineRule="auto"/>
+            <w:jc w:val="right"/>
+            <w:rPr>
+              <w:b/>
+              <w:sz w:val="22"/>
+              <w:szCs w:val="14"/>
+            </w:rPr>
+          </w:pPr>
+        </w:p>
+        <w:p>
+          <w:pPr>
+            <w:spacing w:line="360" w:lineRule="auto"/>
+            <w:rPr>
+              <w:sz w:val="22"/>
+            </w:rPr>
+          </w:pPr>
+        </w:p>
+        <w:p>
+          <w:pPr>
+            <w:spacing w:line="360" w:lineRule="auto"/>
+            <w:rPr>
+              <w:sz w:val="22"/>
+            </w:rPr>
+          </w:pPr>
+        </w:p>
+        <w:p>
+          <w:pPr>
+            <w:jc w:val="left"/>
+            <w:spacing w:line="360" w:lineRule="auto"/>
+            <w:rPr>
+              <w:sz w:val="22"/>
+            </w:rPr>
+          </w:pPr>
+        </w:p>
+        <w:p>
+          <w:pPr>
+            <w:jc w:val="left"/>
+            <w:rPr>
+              <w:b/>
+              <w:sz w:val="22"/>
+            </w:rPr>
+            <w:spacing w:line="360" w:lineRule="auto"/>
+          </w:pPr>
+          <w:r>
+            <w:rPr>
+              <w:noProof/>
+            </w:rPr>
+            <mc:AlternateContent>
+              <mc:Choice Requires="wps">
+                <w:drawing>
+                  <wp:anchor distT="0" distB="0" distL="114300" distR="114300" simplePos="0" relativeHeight="251659264" behindDoc="1" locked="0" layoutInCell="1" allowOverlap="1" wp14:anchorId="4E22A302" wp14:editId="1F3CC033">
+                    <wp:simplePos x="0" y="0"/>
+                    <wp:positionH relativeFrom="column">
+                      <wp:posOffset>4775835</wp:posOffset>
+                    </wp:positionH>
+                    <wp:positionV relativeFrom="margin">
+                      <wp:posOffset>3119120</wp:posOffset>
+                    </wp:positionV>
+                    <wp:extent cx="1990725" cy="6410325"/>
+                    <wp:effectExtent l="0" t="0" r="9525" b="9525"/>
+                    <wp:wrapSquare wrapText="bothSides"/>
+                    <wp:docPr id="1" name="Textfeld 2"/>
+                    <wp:cNvGraphicFramePr/>
+                    <a:graphic xmlns:a="http://schemas.openxmlformats.org/drawingml/2006/main">
+                      <a:graphicData uri="http://schemas.microsoft.com/office/word/2010/wordprocessingShape">
+                        <wps:wsp>
+                          <wps:cNvSpPr txBox="1"/>
+                          <wps:spPr>
+                            <a:xfrm>
+                              <a:off x="0" y="0"/>
+                              <a:ext cx="1990725" cy="6410325"/>
+                            </a:xfrm>
+                            <a:prstGeom prst="rect">
+                              <a:avLst/>
+                            </a:prstGeom>
+                            <a:solidFill>
+                              <a:sysClr val="window" lastClr="FFFFFF"/>
+                            </a:solidFill>
+                            <a:ln w="6350">
+                              <a:noFill/>
+                            </a:ln>
+                          </wps:spPr>
+                          <wps:txbx>
+                            <w:txbxContent>
+                              <w:p>
+                                <w:pPr>
+                                  <w:autoSpaceDE w:val="0"/>
+                                  <w:autoSpaceDN w:val="0"/>
+                                  <w:adjustRightInd w:val="0"/>
+                                  <w:jc w:val="left"/>
+                                  <w:rPr>
+                                    <w:rFonts w:eastAsia="Calibri" w:cs="CorporateSPro-Demi"/>
+                                    <w:b/>
+                                    <w:sz w:val="22"/>
+                                    <w:szCs w:val="13"/>
+                                    <w:lang w:eastAsia="de-DE"/>
+                                  </w:rPr>
+                                  <w:spacing w:line="360" w:lineRule="auto"/>
+                                </w:pPr>
+                                <w:r>
+                                  <w:rPr>
+                                    <w:rFonts w:eastAsia="Calibri" w:cs="CorporateSPro-Demi"/>
+                                    <w:b/>
+                                    <w:sz w:val="13"/>
+                                    <w:szCs w:val="13"/>
+                                    <w:lang w:eastAsia="de-DE"/>
+                                  </w:rPr>
+                                  <w:t>www.tbs-insolvenzverwalter.de</w:t>
+                                </w:r>
+                              </w:p>
+                              <w:p>
+                                <w:pPr>
+                                  <w:autoSpaceDE w:val="0"/>
+                                  <w:autoSpaceDN w:val="0"/>
+                                  <w:adjustRightInd w:val="0"/>
+                                  <w:spacing w:line="360" w:lineRule="auto"/>
+                                  <w:jc w:val="left"/>
+                                  <w:rPr>
+                                    <w:rFonts w:eastAsia="Calibri" w:cs="CorporateSPro-Light"/>
+                                    <w:sz w:val="22"/>
+                                    <w:szCs w:val="13"/>
+                                    <w:lang w:eastAsia="de-DE"/>
+                                  </w:rPr>
+                                </w:pPr>
+                                <w:r>
+                                  <w:rPr>
+                                    <w:rFonts w:eastAsia="Calibri" w:cs="CorporateSPro-Light"/>
+                                    <w:sz w:val="13"/>
+                                    <w:szCs w:val="13"/>
+                                    <w:lang w:eastAsia="de-DE"/>
+                                  </w:rPr>
+                                  <w:t>Partnerschaftsregister des</w:t>
+                                </w:r>
+                              </w:p>
+                              <w:p>
+                                <w:pPr>
+                                  <w:pBdr>
+                                    <w:bottom w:val="single" w:sz="4" w:space="1" w:color="auto"/>
+                                  </w:pBdr>
+                                  <w:autoSpaceDE w:val="0"/>
+                                  <w:autoSpaceDN w:val="0"/>
+                                  <w:adjustRightInd w:val="0"/>
+                                  <w:spacing w:line="360" w:lineRule="auto"/>
+                                  <w:jc w:val="left"/>
+                                  <w:rPr>
+                                    <w:rFonts w:eastAsia="Calibri" w:cs="CorporateSPro-Light"/>
+                                    <w:sz w:val="22"/>
+                                    <w:szCs w:val="13"/>
+                                    <w:lang w:eastAsia="de-DE"/>
+                                  </w:rPr>
+                                </w:pPr>
+                                <w:r>
+                                  <w:rPr>
+                                    <w:rFonts w:eastAsia="Calibri" w:cs="CorporateSPro-Light"/>
+                                    <w:sz w:val="13"/>
+                                    <w:szCs w:val="13"/>
+                                    <w:lang w:eastAsia="de-DE"/>
+                                  </w:rPr>
+                                  <w:t>Amtsgericht Koblenz – PR 20203</w:t>
+                                </w:r>
+                              </w:p>
+                              <w:p>
+                                <w:pPr>
+                                  <w:pBdr>
+                                    <w:bottom w:val="single" w:sz="4" w:space="1" w:color="auto"/>
+                                  </w:pBdr>
+                                  <w:autoSpaceDE w:val="0"/>
+                                  <w:autoSpaceDN w:val="0"/>
+                                  <w:adjustRightInd w:val="0"/>
+                                  <w:spacing w:line="360" w:lineRule="auto"/>
+                                  <w:jc w:val="center"/>
+                                  <w:rPr>
+                                    <w:rFonts w:eastAsia="Calibri" w:cs="CorporateSPro-Light"/>
+                                    <w:sz w:val="22"/>
+                                    <w:szCs w:val="13"/>
+                                    <w:lang w:eastAsia="de-DE"/>
+                                  </w:rPr>
+                                </w:pPr>
+                              </w:p>
+                              <w:p>
+                                <w:pPr>
+                                  <w:pBdr>
+                                    <w:bottom w:val="single" w:sz="4" w:space="1" w:color="auto"/>
+                                  </w:pBdr>
+                                  <w:autoSpaceDE w:val="0"/>
+                                  <w:autoSpaceDN w:val="0"/>
+                                  <w:adjustRightInd w:val="0"/>
+                                  <w:spacing w:line="360" w:lineRule="auto"/>
+                                  <w:jc w:val="center"/>
+                                  <w:rPr>
+                                    <w:rFonts w:eastAsia="Calibri" w:cs="CorporateSPro-Light"/>
+                                    <w:sz w:val="22"/>
+                                    <w:szCs w:val="13"/>
+                                    <w:lang w:eastAsia="de-DE"/>
+                                  </w:rPr>
+                                </w:pPr>
+                              </w:p>
+                              <w:p>
+                                <w:pPr>
+                                  <w:pBdr>
+                                    <w:bottom w:val="single" w:sz="4" w:space="1" w:color="auto"/>
+                                  </w:pBdr>
+                                  <w:autoSpaceDE w:val="0"/>
+                                  <w:autoSpaceDN w:val="0"/>
+                                  <w:adjustRightInd w:val="0"/>
+                                  <w:spacing w:line="360" w:lineRule="auto"/>
+                                  <w:jc w:val="center"/>
+                                  <w:rPr>
+                                    <w:rFonts w:eastAsia="Calibri" w:cs="CorporateSPro-Light"/>
+                                    <w:sz w:val="22"/>
+                                    <w:szCs w:val="13"/>
+                                    <w:lang w:eastAsia="de-DE"/>
+                                  </w:rPr>
+                                </w:pPr>
+                              </w:p>
+                              <w:p>
+                                <w:pPr>
+                                  <w:pBdr>
+                                    <w:bottom w:val="single" w:sz="4" w:space="1" w:color="auto"/>
+                                  </w:pBdr>
+                                  <w:autoSpaceDE w:val="0"/>
+                                  <w:autoSpaceDN w:val="0"/>
+                                  <w:adjustRightInd w:val="0"/>
+                                  <w:spacing w:line="360" w:lineRule="auto"/>
+                                  <w:jc w:val="center"/>
+                                  <w:rPr>
+                                    <w:rFonts w:eastAsia="Calibri" w:cs="CorporateSPro-Light"/>
+                                    <w:sz w:val="22"/>
+                                    <w:szCs w:val="13"/>
+                                    <w:lang w:eastAsia="de-DE"/>
+                                  </w:rPr>
+                                </w:pPr>
+                              </w:p>
+                              <w:p>
+                                <w:pPr>
+                                  <w:pBdr>
+                                    <w:bottom w:val="single" w:sz="4" w:space="1" w:color="auto"/>
+                                  </w:pBdr>
+                                  <w:autoSpaceDE w:val="0"/>
+                                  <w:autoSpaceDN w:val="0"/>
+                                  <w:adjustRightInd w:val="0"/>
+                                  <w:spacing w:line="360" w:lineRule="auto"/>
+                                  <w:jc w:val="center"/>
+                                  <w:rPr>
+                                    <w:rFonts w:eastAsia="Calibri" w:cs="CorporateSPro-Light"/>
+                                    <w:sz w:val="22"/>
+                                    <w:szCs w:val="13"/>
+                                    <w:lang w:eastAsia="de-DE"/>
+                                  </w:rPr>
+                                </w:pPr>
+                              </w:p>
+                              <w:p>
+                                <w:pPr>
+                                  <w:pBdr>
+                                    <w:bottom w:val="single" w:sz="4" w:space="1" w:color="auto"/>
+                                  </w:pBdr>
+                                  <w:autoSpaceDE w:val="0"/>
+                                  <w:autoSpaceDN w:val="0"/>
+                                  <w:adjustRightInd w:val="0"/>
+                                  <w:spacing w:line="360" w:lineRule="auto"/>
+                                  <w:jc w:val="center"/>
+                                  <w:rPr>
+                                    <w:rFonts w:eastAsia="Calibri" w:cs="CorporateSPro-Light"/>
+                                    <w:sz w:val="22"/>
+                                    <w:szCs w:val="13"/>
+                                    <w:lang w:eastAsia="de-DE"/>
+                                  </w:rPr>
+                                </w:pPr>
+                              </w:p>
+                              <w:p>
+                                <w:pPr>
+                                  <w:pBdr>
+                                    <w:bottom w:val="single" w:sz="4" w:space="1" w:color="auto"/>
+                                  </w:pBdr>
+                                  <w:autoSpaceDE w:val="0"/>
+                                  <w:autoSpaceDN w:val="0"/>
+                                  <w:adjustRightInd w:val="0"/>
+                                  <w:spacing w:line="360" w:lineRule="auto"/>
+                                  <w:jc w:val="center"/>
+                                  <w:rPr>
+                                    <w:rFonts w:eastAsia="Calibri" w:cs="CorporateSPro-Light"/>
+                                    <w:sz w:val="22"/>
+                                    <w:szCs w:val="13"/>
+                                    <w:lang w:eastAsia="de-DE"/>
+                                  </w:rPr>
+                                </w:pPr>
+                              </w:p>
+                              <w:p>
+                                <w:pPr>
+                                  <w:autoSpaceDE w:val="0"/>
+                                  <w:autoSpaceDN w:val="0"/>
+                                  <w:adjustRightInd w:val="0"/>
+                                  <w:spacing w:line="360" w:lineRule="auto"/>
+                                  <w:jc w:val="left"/>
+                                  <w:rPr>
+                                    <w:rFonts w:eastAsia="Calibri" w:cs="CorporateSPro-Light"/>
+                                    <w:sz w:val="22"/>
+                                    <w:szCs w:val="13"/>
+                                    <w:lang w:eastAsia="de-DE"/>
+                                  </w:rPr>
+                                </w:pPr>
+                              </w:p>
+                              <w:p>
+                                <w:pPr>
+                                  <w:autoSpaceDE w:val="0"/>
+                                  <w:autoSpaceDN w:val="0"/>
+                                  <w:adjustRightInd w:val="0"/>
+                                  <w:jc w:val="left"/>
+                                  <w:rPr>
+                                    <w:rFonts w:eastAsia="Calibri" w:cs="CorporateSPro-Regular"/>
+                                    <w:sz w:val="22"/>
+                                    <w:szCs w:val="13"/>
+                                    <w:lang w:eastAsia="de-DE"/>
+                                  </w:rPr>
+                                  <w:spacing w:line="360" w:lineRule="auto"/>
+                                </w:pPr>
+                                <w:bookmarkStart w:id="0" w:name="_Hlk217368252"/>
+                                <w:bookmarkStart w:id="1" w:name="_Hlk217368253"/>
+                                <w:bookmarkStart w:id="2" w:name="_Hlk217368337"/>
+                                <w:bookmarkStart w:id="3" w:name="_Hlk217368338"/>
+                                <w:bookmarkStart w:id="4" w:name="_Hlk217368401"/>
+                                <w:bookmarkStart w:id="5" w:name="_Hlk217368402"/>
+                                <w:bookmarkStart w:id="6" w:name="_Hlk217368434"/>
+                                <w:bookmarkStart w:id="7" w:name="_Hlk217368435"/>
+                                <w:bookmarkStart w:id="8" w:name="_Hlk217368465"/>
+                                <w:bookmarkStart w:id="9" w:name="_Hlk217368466"/>
+                                <w:r>
+                                  <w:rPr>
+                                    <w:rFonts w:eastAsia="Calibri" w:cs="CorporateSPro-Regular"/>
+                                    <w:sz w:val="13"/>
+                                    <w:szCs w:val="13"/>
+                                    <w:lang w:eastAsia="de-DE"/>
+                                  </w:rPr>
+                                  <w:t>PARTNER</w:t>
+                                </w:r>
+                              </w:p>
+                              <w:p>
+                                <w:pPr>
+                                  <w:autoSpaceDE w:val="0"/>
+                                  <w:autoSpaceDN w:val="0"/>
+                                  <w:adjustRightInd w:val="0"/>
+                                  <w:spacing w:line="360" w:lineRule="auto"/>
+                                  <w:jc w:val="left"/>
+                                  <w:rPr>
+                                    <w:rFonts w:eastAsia="Calibri" w:cs="CorporateSPro-Demi"/>
+                                    <w:b/>
+                                    <w:sz w:val="22"/>
+                                    <w:szCs w:val="13"/>
+                                    <w:lang w:eastAsia="de-DE"/>
+                                  </w:rPr>
+                                </w:pPr>
+                                <w:r>
+                                  <w:rPr>
+                                    <w:rFonts w:eastAsia="Calibri" w:cs="CorporateSPro-Demi"/>
+                                    <w:b/>
+                                    <w:sz w:val="13"/>
+                                    <w:szCs w:val="13"/>
+                                    <w:lang w:eastAsia="de-DE"/>
+                                  </w:rPr>
+                                  <w:t>Ingo Grünewald</w:t>
+                                </w:r>
+                              </w:p>
+                              <w:p>
+                                <w:pPr>
+                                  <w:autoSpaceDE w:val="0"/>
+                                  <w:autoSpaceDN w:val="0"/>
+                                  <w:adjustRightInd w:val="0"/>
+                                  <w:spacing w:line="360" w:lineRule="auto"/>
+                                  <w:jc w:val="left"/>
+                                  <w:rPr>
+                                    <w:rFonts w:eastAsia="Calibri" w:cs="CorporateSPro-Light"/>
+                                    <w:sz w:val="22"/>
+                                    <w:szCs w:val="13"/>
+                                    <w:lang w:eastAsia="de-DE"/>
+                                  </w:rPr>
+                                </w:pPr>
+                                <w:r>
+                                  <w:rPr>
+                                    <w:rFonts w:eastAsia="Calibri" w:cs="CorporateSPro-Light"/>
+                                    <w:sz w:val="13"/>
+                                    <w:szCs w:val="13"/>
+                                    <w:lang w:eastAsia="de-DE"/>
+                                  </w:rPr>
+                                  <w:t>Fachanwalt für Insolvenz- und Sanierungsrecht</w:t>
+                                </w:r>
+                              </w:p>
+                              <w:p>
+                                <w:pPr>
+                                  <w:autoSpaceDE w:val="0"/>
+                                  <w:autoSpaceDN w:val="0"/>
+                                  <w:adjustRightInd w:val="0"/>
+                                  <w:spacing w:line="360" w:lineRule="auto"/>
+                                  <w:jc w:val="left"/>
+                                  <w:rPr>
+                                    <w:rFonts w:eastAsia="Calibri" w:cs="CorporateSPro-Light"/>
+                                    <w:sz w:val="22"/>
+                                    <w:szCs w:val="13"/>
+                                    <w:lang w:eastAsia="de-DE"/>
+                                  </w:rPr>
+                                </w:pPr>
+                                <w:r>
+                                  <w:rPr>
+                                    <w:rFonts w:eastAsia="Calibri" w:cs="CorporateSPro-Light"/>
+                                    <w:sz w:val="13"/>
+                                    <w:szCs w:val="13"/>
+                                    <w:lang w:eastAsia="de-DE"/>
+                                  </w:rPr>
+                                  <w:t>Fachanwalt für Handels- und Gesellschaftsrecht</w:t>
+                                </w:r>
+                              </w:p>
+                              <w:p>
+                                <w:pPr>
+                                  <w:autoSpaceDE w:val="0"/>
+                                  <w:autoSpaceDN w:val="0"/>
+                                  <w:adjustRightInd w:val="0"/>
+                                  <w:spacing w:line="360" w:lineRule="auto"/>
+                                  <w:jc w:val="left"/>
+                                  <w:rPr>
+                                    <w:rFonts w:eastAsia="Calibri" w:cs="CorporateSPro-Demi"/>
+                                    <w:b/>
+                                    <w:sz w:val="22"/>
+                                    <w:szCs w:val="13"/>
+                                    <w:lang w:eastAsia="de-DE"/>
+                                  </w:rPr>
+                                </w:pPr>
+                              </w:p>
+                              <w:p>
+                                <w:pPr>
+                                  <w:autoSpaceDE w:val="0"/>
+                                  <w:autoSpaceDN w:val="0"/>
+                                  <w:adjustRightInd w:val="0"/>
+                                  <w:spacing w:line="360" w:lineRule="auto"/>
+                                  <w:jc w:val="left"/>
+                                  <w:rPr>
+                                    <w:rFonts w:eastAsia="Calibri" w:cs="CorporateSPro-Demi"/>
+                                    <w:b/>
+                                    <w:sz w:val="22"/>
+                                    <w:szCs w:val="13"/>
+                                    <w:lang w:val="en-GB" w:eastAsia="de-DE"/>
+                                  </w:rPr>
+                                </w:pPr>
+                                <w:r>
+                                  <w:rPr>
+                                    <w:rFonts w:eastAsia="Calibri" w:cs="CorporateSPro-Demi"/>
+                                    <w:b/>
+                                    <w:sz w:val="13"/>
+                                    <w:szCs w:val="13"/>
+                                    <w:lang w:val="en-GB" w:eastAsia="de-DE"/>
+                                  </w:rPr>
+                                  <w:t>Dr. Alexander Thomas Lamberty LL.M.</w:t>
+                                </w:r>
+                              </w:p>
+                              <w:p>
+                                <w:pPr>
+                                  <w:autoSpaceDE w:val="0"/>
+                                  <w:autoSpaceDN w:val="0"/>
+                                  <w:adjustRightInd w:val="0"/>
+                                  <w:spacing w:line="360" w:lineRule="auto"/>
+                                  <w:jc w:val="left"/>
+                                  <w:rPr>
+                                    <w:rFonts w:eastAsia="Calibri" w:cs="CorporateSPro-Light"/>
+                                    <w:sz w:val="22"/>
+                                    <w:szCs w:val="13"/>
+                                    <w:lang w:eastAsia="de-DE"/>
+                                  </w:rPr>
+                                </w:pPr>
+                                <w:r>
+                                  <w:rPr>
+                                    <w:rFonts w:eastAsia="Calibri" w:cs="CorporateSPro-Light"/>
+                                    <w:sz w:val="13"/>
+                                    <w:szCs w:val="13"/>
+                                    <w:lang w:eastAsia="de-DE"/>
+                                  </w:rPr>
+                                  <w:t>Fachanwalt für Insolvenz- und Sanierungsrecht</w:t>
+                                </w:r>
+                              </w:p>
+                              <w:p>
+                                <w:pPr>
+                                  <w:autoSpaceDE w:val="0"/>
+                                  <w:autoSpaceDN w:val="0"/>
+                                  <w:adjustRightInd w:val="0"/>
+                                  <w:spacing w:line="360" w:lineRule="auto"/>
+                                  <w:jc w:val="left"/>
+                                  <w:rPr>
+                                    <w:rFonts w:eastAsia="Calibri" w:cs="CorporateSPro-Demi"/>
+                                    <w:b/>
+                                    <w:sz w:val="22"/>
+                                    <w:szCs w:val="13"/>
+                                    <w:lang w:eastAsia="de-DE"/>
+                                  </w:rPr>
+                                </w:pPr>
+                              </w:p>
+                              <w:p>
+                                <w:pPr>
+                                  <w:autoSpaceDE w:val="0"/>
+                                  <w:autoSpaceDN w:val="0"/>
+                                  <w:adjustRightInd w:val="0"/>
+                                  <w:spacing w:line="360" w:lineRule="auto"/>
+                                  <w:jc w:val="left"/>
+                                  <w:rPr>
+                                    <w:rFonts w:eastAsia="Calibri" w:cs="CorporateSPro-Demi"/>
+                                    <w:b/>
+                                    <w:sz w:val="22"/>
+                                    <w:szCs w:val="13"/>
+                                    <w:lang w:eastAsia="de-DE"/>
+                                  </w:rPr>
+                                </w:pPr>
+                                <w:r>
+                                  <w:rPr>
+                                    <w:rFonts w:eastAsia="Calibri" w:cs="CorporateSPro-Demi"/>
+                                    <w:b/>
+                                    <w:sz w:val="13"/>
+                                    <w:szCs w:val="13"/>
+                                    <w:lang w:eastAsia="de-DE"/>
+                                  </w:rPr>
+                                  <w:t>Fatma Kreft</w:t>
+                                </w:r>
+                              </w:p>
+                              <w:p>
+                                <w:pPr>
+                                  <w:autoSpaceDE w:val="0"/>
+                                  <w:autoSpaceDN w:val="0"/>
+                                  <w:adjustRightInd w:val="0"/>
+                                  <w:spacing w:line="360" w:lineRule="auto"/>
+                                  <w:jc w:val="left"/>
+                                  <w:rPr>
+                                    <w:rFonts w:eastAsia="Calibri" w:cs="CorporateSPro-Light"/>
+                                    <w:sz w:val="22"/>
+                                    <w:szCs w:val="13"/>
+                                    <w:lang w:eastAsia="de-DE"/>
+                                  </w:rPr>
+                                </w:pPr>
+                                <w:r>
+                                  <w:rPr>
+                                    <w:rFonts w:eastAsia="Calibri" w:cs="CorporateSPro-Light"/>
+                                    <w:sz w:val="13"/>
+                                    <w:szCs w:val="13"/>
+                                    <w:lang w:eastAsia="de-DE"/>
+                                  </w:rPr>
+                                  <w:t>Fachanwältin für Insolvenz- und Sanierungsrecht</w:t>
+                                </w:r>
+                              </w:p>
+                              <w:p>
+                                <w:pPr>
+                                  <w:autoSpaceDE w:val="0"/>
+                                  <w:autoSpaceDN w:val="0"/>
+                                  <w:adjustRightInd w:val="0"/>
+                                  <w:spacing w:line="360" w:lineRule="auto"/>
+                                  <w:jc w:val="left"/>
+                                  <w:rPr>
+                                    <w:rFonts w:eastAsia="Calibri" w:cs="CorporateSPro-Light"/>
+                                    <w:sz w:val="22"/>
+                                    <w:szCs w:val="13"/>
+                                    <w:lang w:eastAsia="de-DE"/>
+                                  </w:rPr>
+                                </w:pPr>
+                                <w:r>
+                                  <w:rPr>
+                                    <w:rFonts w:eastAsia="Calibri" w:cs="CorporateSPro-Light"/>
+                                    <w:sz w:val="13"/>
+                                    <w:szCs w:val="13"/>
+                                    <w:lang w:eastAsia="de-DE"/>
+                                  </w:rPr>
+                                  <w:t>Fachanwältin für Steuerrecht</w:t>
+                                </w:r>
+                              </w:p>
+                              <w:p>
+                                <w:pPr>
+                                  <w:autoSpaceDE w:val="0"/>
+                                  <w:autoSpaceDN w:val="0"/>
+                                  <w:adjustRightInd w:val="0"/>
+                                  <w:spacing w:line="360" w:lineRule="auto"/>
+                                  <w:jc w:val="left"/>
+                                  <w:rPr>
+                                    <w:rFonts w:eastAsia="Calibri" w:cs="CorporateSPro-Light"/>
+                                    <w:sz w:val="22"/>
+                                    <w:szCs w:val="13"/>
+                                    <w:lang w:eastAsia="de-DE"/>
+                                  </w:rPr>
+                                </w:pPr>
+                              </w:p>
+                              <w:p>
+                                <w:pPr>
+                                  <w:autoSpaceDE w:val="0"/>
+                                  <w:autoSpaceDN w:val="0"/>
+                                  <w:adjustRightInd w:val="0"/>
+                                  <w:spacing w:line="360" w:lineRule="auto"/>
+                                  <w:jc w:val="left"/>
+                                  <w:rPr>
+                                    <w:rFonts w:eastAsia="Calibri" w:cs="CorporateSPro-Demi"/>
+                                    <w:b/>
+                                    <w:sz w:val="22"/>
+                                    <w:szCs w:val="13"/>
+                                    <w:lang w:eastAsia="de-DE"/>
+                                  </w:rPr>
+                                </w:pPr>
+                                <w:r>
+                                  <w:rPr>
+                                    <w:rFonts w:eastAsia="Calibri" w:cs="CorporateSPro-Demi"/>
+                                    <w:b/>
+                                    <w:sz w:val="13"/>
+                                    <w:szCs w:val="13"/>
+                                    <w:lang w:eastAsia="de-DE"/>
+                                  </w:rPr>
+                                  <w:t>Dr. Arne Löser</w:t>
+                                </w:r>
+                              </w:p>
+                              <w:p>
+                                <w:pPr>
+                                  <w:autoSpaceDE w:val="0"/>
+                                  <w:autoSpaceDN w:val="0"/>
+                                  <w:adjustRightInd w:val="0"/>
+                                  <w:spacing w:line="360" w:lineRule="auto"/>
+                                  <w:jc w:val="left"/>
+                                  <w:rPr>
+                                    <w:rFonts w:eastAsia="Calibri" w:cs="CorporateSPro-Light"/>
+                                    <w:sz w:val="22"/>
+                                    <w:szCs w:val="13"/>
+                                    <w:lang w:eastAsia="de-DE"/>
+                                  </w:rPr>
+                                </w:pPr>
+                                <w:r>
+                                  <w:rPr>
+                                    <w:rFonts w:eastAsia="Calibri" w:cs="CorporateSPro-Light"/>
+                                    <w:sz w:val="13"/>
+                                    <w:szCs w:val="13"/>
+                                    <w:lang w:eastAsia="de-DE"/>
+                                  </w:rPr>
+                                  <w:t>Fachanwalt für Insolvenz- und Sanierungsrecht</w:t>
+                                </w:r>
+                              </w:p>
+                              <w:p>
+                                <w:pPr>
+                                  <w:autoSpaceDE w:val="0"/>
+                                  <w:autoSpaceDN w:val="0"/>
+                                  <w:adjustRightInd w:val="0"/>
+                                  <w:spacing w:line="360" w:lineRule="auto"/>
+                                  <w:jc w:val="left"/>
+                                  <w:rPr>
+                                    <w:rFonts w:eastAsia="Calibri" w:cs="CorporateSPro-Light"/>
+                                    <w:sz w:val="22"/>
+                                    <w:szCs w:val="13"/>
+                                    <w:lang w:eastAsia="de-DE"/>
+                                  </w:rPr>
+                                </w:pPr>
+                                <w:r>
+                                  <w:rPr>
+                                    <w:rFonts w:eastAsia="Calibri" w:cs="CorporateSPro-Light"/>
+                                    <w:sz w:val="13"/>
+                                    <w:szCs w:val="13"/>
+                                    <w:lang w:eastAsia="de-DE"/>
+                                  </w:rPr>
+                                  <w:t>Fachanwalt für Handels- und Gesellschaftsrecht</w:t>
+                                </w:r>
+                              </w:p>
+                              <w:p>
+                                <w:pPr>
+                                  <w:autoSpaceDE w:val="0"/>
+                                  <w:autoSpaceDN w:val="0"/>
+                                  <w:adjustRightInd w:val="0"/>
+                                  <w:spacing w:line="360" w:lineRule="auto"/>
+                                  <w:jc w:val="left"/>
+                                  <w:rPr>
+                                    <w:rFonts w:eastAsia="Calibri" w:cs="CorporateSPro-Light"/>
+                                    <w:sz w:val="22"/>
+                                    <w:szCs w:val="13"/>
+                                    <w:lang w:eastAsia="de-DE"/>
+                                  </w:rPr>
+                                </w:pPr>
+                              </w:p>
+                              <w:p>
+                                <w:pPr>
+                                  <w:autoSpaceDE w:val="0"/>
+                                  <w:autoSpaceDN w:val="0"/>
+                                  <w:adjustRightInd w:val="0"/>
+                                  <w:spacing w:line="360" w:lineRule="auto"/>
+                                  <w:jc w:val="left"/>
+                                  <w:rPr>
+                                    <w:rFonts w:eastAsia="Calibri" w:cs="CorporateSPro-Demi"/>
+                                    <w:b/>
+                                    <w:sz w:val="22"/>
+                                    <w:szCs w:val="13"/>
+                                    <w:lang w:eastAsia="de-DE"/>
+                                  </w:rPr>
+                                </w:pPr>
+                                <w:r>
+                                  <w:rPr>
+                                    <w:rFonts w:eastAsia="Calibri" w:cs="CorporateSPro-Demi"/>
+                                    <w:b/>
+                                    <w:sz w:val="13"/>
+                                    <w:szCs w:val="13"/>
+                                    <w:lang w:eastAsia="de-DE"/>
+                                  </w:rPr>
+                                  <w:t>Dr. Thomas Thöne</w:t>
+                                </w:r>
+                              </w:p>
+                              <w:p>
+                                <w:pPr>
+                                  <w:autoSpaceDE w:val="0"/>
+                                  <w:autoSpaceDN w:val="0"/>
+                                  <w:adjustRightInd w:val="0"/>
+                                  <w:spacing w:line="360" w:lineRule="auto"/>
+                                  <w:jc w:val="left"/>
+                                  <w:rPr>
+                                    <w:rFonts w:eastAsia="Calibri" w:cs="CorporateSPro-Light"/>
+                                    <w:sz w:val="22"/>
+                                    <w:szCs w:val="13"/>
+                                    <w:lang w:eastAsia="de-DE"/>
+                                  </w:rPr>
+                                </w:pPr>
+                                <w:r>
+                                  <w:rPr>
+                                    <w:rFonts w:eastAsia="Calibri" w:cs="CorporateSPro-Light"/>
+                                    <w:sz w:val="13"/>
+                                    <w:szCs w:val="13"/>
+                                    <w:lang w:eastAsia="de-DE"/>
+                                  </w:rPr>
+                                  <w:t>Fachanwalt für Insolvenz- und Sanierungsrecht</w:t>
+                                </w:r>
+                              </w:p>
+                              <w:p>
+                                <w:pPr>
+                                  <w:autoSpaceDE w:val="0"/>
+                                  <w:autoSpaceDN w:val="0"/>
+                                  <w:adjustRightInd w:val="0"/>
+                                  <w:spacing w:line="360" w:lineRule="auto"/>
+                                  <w:jc w:val="left"/>
+                                  <w:rPr>
+                                    <w:rFonts w:eastAsia="Calibri" w:cs="CorporateSPro-Light"/>
+                                    <w:sz w:val="22"/>
+                                    <w:szCs w:val="13"/>
+                                    <w:lang w:eastAsia="de-DE"/>
+                                  </w:rPr>
+                                </w:pPr>
+                                <w:r>
+                                  <w:rPr>
+                                    <w:rFonts w:eastAsia="Calibri" w:cs="CorporateSPro-Light"/>
+                                    <w:sz w:val="13"/>
+                                    <w:szCs w:val="13"/>
+                                    <w:lang w:eastAsia="de-DE"/>
+                                  </w:rPr>
+                                  <w:t>Fachanwalt für Steuerrecht</w:t>
+                                </w:r>
+                              </w:p>
+                              <w:p>
+                                <w:pPr>
+                                  <w:autoSpaceDE w:val="0"/>
+                                  <w:autoSpaceDN w:val="0"/>
+                                  <w:adjustRightInd w:val="0"/>
+                                  <w:spacing w:line="360" w:lineRule="auto"/>
+                                  <w:jc w:val="left"/>
+                                  <w:rPr>
+                                    <w:rFonts w:eastAsia="Calibri" w:cs="CorporateSPro-Light"/>
+                                    <w:sz w:val="22"/>
+                                    <w:szCs w:val="13"/>
+                                    <w:lang w:eastAsia="de-DE"/>
+                                  </w:rPr>
+                                </w:pPr>
+                                <w:r>
+                                  <w:rPr>
+                                    <w:rFonts w:eastAsia="Calibri" w:cs="CorporateSPro-Light"/>
+                                    <w:sz w:val="13"/>
+                                    <w:szCs w:val="13"/>
+                                    <w:lang w:eastAsia="de-DE"/>
+                                  </w:rPr>
+                                  <w:t>Notar in Wiesbaden</w:t>
+                                </w:r>
+                              </w:p>
+                              <w:p>
+                                <w:pPr>
+                                  <w:pBdr>
+                                    <w:bottom w:val="single" w:sz="4" w:space="1" w:color="auto"/>
+                                  </w:pBdr>
+                                  <w:autoSpaceDE w:val="0"/>
+                                  <w:autoSpaceDN w:val="0"/>
+                                  <w:adjustRightInd w:val="0"/>
+                                  <w:spacing w:line="360" w:lineRule="auto"/>
+                                  <w:jc w:val="left"/>
+                                  <w:rPr>
+                                    <w:rFonts w:eastAsia="Calibri" w:cs="CorporateSPro-Light"/>
+                                    <w:sz w:val="22"/>
+                                    <w:szCs w:val="13"/>
+                                    <w:lang w:eastAsia="de-DE"/>
+                                  </w:rPr>
+                                </w:pPr>
+                              </w:p>
+                              <w:p>
+                                <w:pPr>
+                                  <w:autoSpaceDE w:val="0"/>
+                                  <w:autoSpaceDN w:val="0"/>
+                                  <w:adjustRightInd w:val="0"/>
+                                  <w:spacing w:line="360" w:lineRule="auto"/>
+                                  <w:jc w:val="left"/>
+                                  <w:rPr>
+                                    <w:rFonts w:eastAsia="Calibri" w:cs="CorporateSPro-Light"/>
+                                    <w:sz w:val="22"/>
+                                    <w:szCs w:val="13"/>
+                                    <w:lang w:eastAsia="de-DE"/>
+                                  </w:rPr>
+                                </w:pPr>
+                              </w:p>
+                              <w:p>
+                                <w:pPr>
+                                  <w:autoSpaceDE w:val="0"/>
+                                  <w:autoSpaceDN w:val="0"/>
+                                  <w:adjustRightInd w:val="0"/>
+                                  <w:jc w:val="left"/>
+                                  <w:rPr>
+                                    <w:rFonts w:eastAsia="Calibri" w:cs="CorporateSPro-Regular"/>
+                                    <w:sz w:val="22"/>
+                                    <w:szCs w:val="13"/>
+                                    <w:lang w:eastAsia="de-DE"/>
+                                  </w:rPr>
+                                  <w:spacing w:line="360" w:lineRule="auto"/>
+                                </w:pPr>
+                                <w:r>
+                                  <w:rPr>
+                                    <w:rFonts w:eastAsia="Calibri" w:cs="CorporateSPro-Regular"/>
+                                    <w:sz w:val="13"/>
+                                    <w:szCs w:val="13"/>
+                                    <w:lang w:eastAsia="de-DE"/>
+                                  </w:rPr>
+                                  <w:t>ANGESTELLTE RECHTSANWÄLTE</w:t>
+                                </w:r>
+                              </w:p>
+                              <w:p>
+                                <w:pPr>
+                                  <w:autoSpaceDE w:val="0"/>
+                                  <w:autoSpaceDN w:val="0"/>
+                                  <w:adjustRightInd w:val="0"/>
+                                  <w:spacing w:line="360" w:lineRule="auto"/>
+                                  <w:jc w:val="left"/>
+                                  <w:rPr>
+                                    <w:rFonts w:eastAsia="Calibri" w:cs="CorporateSPro-Demi"/>
+                                    <w:b/>
+                                    <w:sz w:val="22"/>
+                                    <w:szCs w:val="13"/>
+                                    <w:lang w:eastAsia="de-DE"/>
+                                  </w:rPr>
+                                </w:pPr>
+                                <w:r>
+                                  <w:rPr>
+                                    <w:rFonts w:eastAsia="Calibri" w:cs="CorporateSPro-Demi"/>
+                                    <w:b/>
+                                    <w:sz w:val="13"/>
+                                    <w:szCs w:val="13"/>
+                                    <w:lang w:eastAsia="de-DE"/>
+                                  </w:rPr>
+                                  <w:t>Eva Meyer</w:t>
+                                </w:r>
+                              </w:p>
+                              <w:p>
+                                <w:pPr>
+                                  <w:autoSpaceDE w:val="0"/>
+                                  <w:autoSpaceDN w:val="0"/>
+                                  <w:adjustRightInd w:val="0"/>
+                                  <w:spacing w:line="360" w:lineRule="auto"/>
+                                  <w:jc w:val="left"/>
+                                  <w:rPr>
+                                    <w:rFonts w:eastAsia="Calibri" w:cs="CorporateSPro-Demi"/>
+                                    <w:sz w:val="22"/>
+                                    <w:szCs w:val="13"/>
+                                    <w:lang w:eastAsia="de-DE"/>
+                                  </w:rPr>
+                                </w:pPr>
+                                <w:r>
+                                  <w:rPr>
+                                    <w:rFonts w:eastAsia="Calibri" w:cs="CorporateSPro-Demi"/>
+                                    <w:sz w:val="13"/>
+                                    <w:szCs w:val="13"/>
+                                    <w:lang w:eastAsia="de-DE"/>
+                                  </w:rPr>
+                                  <w:t>Fachanwältin für Insolvenz- und Sanierungsrecht</w:t>
+                                </w:r>
+                              </w:p>
+                              <w:p>
+                                <w:pPr>
+                                  <w:autoSpaceDE w:val="0"/>
+                                  <w:autoSpaceDN w:val="0"/>
+                                  <w:adjustRightInd w:val="0"/>
+                                  <w:spacing w:line="360" w:lineRule="auto"/>
+                                  <w:jc w:val="left"/>
+                                  <w:rPr>
+                                    <w:rFonts w:eastAsia="Calibri" w:cs="CorporateSPro-Light"/>
+                                    <w:sz w:val="22"/>
+                                    <w:szCs w:val="13"/>
+                                    <w:lang w:eastAsia="de-DE"/>
+                                  </w:rPr>
+                                </w:pPr>
+                              </w:p>
+                              <w:p>
+                                <w:pPr>
+                                  <w:autoSpaceDE w:val="0"/>
+                                  <w:autoSpaceDN w:val="0"/>
+                                  <w:adjustRightInd w:val="0"/>
+                                  <w:spacing w:line="360" w:lineRule="auto"/>
+                                  <w:jc w:val="left"/>
+                                  <w:rPr>
+                                    <w:rFonts w:eastAsia="Calibri" w:cs="CorporateSPro-Demi"/>
+                                    <w:b/>
+                                    <w:sz w:val="22"/>
+                                    <w:szCs w:val="13"/>
+                                    <w:lang w:eastAsia="de-DE"/>
+                                  </w:rPr>
+                                </w:pPr>
+                                <w:r>
+                                  <w:rPr>
+                                    <w:rFonts w:eastAsia="Calibri" w:cs="CorporateSPro-Demi"/>
+                                    <w:b/>
+                                    <w:sz w:val="13"/>
+                                    <w:szCs w:val="13"/>
+                                    <w:lang w:eastAsia="de-DE"/>
+                                  </w:rPr>
+                                  <w:t>Bettina Dax</w:t>
+                                </w:r>
+                              </w:p>
+                              <w:p>
+                                <w:pPr>
+                                  <w:autoSpaceDE w:val="0"/>
+                                  <w:autoSpaceDN w:val="0"/>
+                                  <w:adjustRightInd w:val="0"/>
+                                  <w:spacing w:line="360" w:lineRule="auto"/>
+                                  <w:jc w:val="left"/>
+                                  <w:rPr>
+                                    <w:rFonts w:eastAsia="Calibri" w:cs="CorporateSPro-Light"/>
+                                    <w:sz w:val="22"/>
+                                    <w:szCs w:val="13"/>
+                                    <w:lang w:eastAsia="de-DE"/>
+                                  </w:rPr>
+                                </w:pPr>
+                                <w:r>
+                                  <w:rPr>
+                                    <w:rFonts w:eastAsia="Calibri" w:cs="CorporateSPro-Light"/>
+                                    <w:sz w:val="13"/>
+                                    <w:szCs w:val="13"/>
+                                    <w:lang w:eastAsia="de-DE"/>
+                                  </w:rPr>
+                                  <w:t>Rechtsanwältin</w:t>
+                                </w:r>
+                              </w:p>
+                              <w:p>
+                                <w:pPr>
+                                  <w:autoSpaceDE w:val="0"/>
+                                  <w:autoSpaceDN w:val="0"/>
+                                  <w:adjustRightInd w:val="0"/>
+                                  <w:spacing w:line="360" w:lineRule="auto"/>
+                                  <w:jc w:val="left"/>
+                                  <w:rPr>
+                                    <w:rFonts w:eastAsia="Calibri" w:cs="CorporateSPro-Demi"/>
+                                    <w:b/>
+                                    <w:sz w:val="22"/>
+                                    <w:szCs w:val="13"/>
+                                    <w:lang w:eastAsia="de-DE"/>
+                                  </w:rPr>
+                                </w:pPr>
+                              </w:p>
+                              <w:p>
+                                <w:pPr>
+                                  <w:autoSpaceDE w:val="0"/>
+                                  <w:autoSpaceDN w:val="0"/>
+                                  <w:adjustRightInd w:val="0"/>
+                                  <w:spacing w:line="360" w:lineRule="auto"/>
+                                  <w:jc w:val="left"/>
+                                  <w:rPr>
+                                    <w:rFonts w:eastAsia="Calibri" w:cs="CorporateSPro-Demi"/>
+                                    <w:b/>
+                                    <w:sz w:val="22"/>
+                                    <w:szCs w:val="13"/>
+                                    <w:lang w:eastAsia="de-DE"/>
+                                  </w:rPr>
+                                </w:pPr>
+                                <w:r>
+                                  <w:rPr>
+                                    <w:rFonts w:eastAsia="Calibri" w:cs="CorporateSPro-Demi"/>
+                                    <w:b/>
+                                    <w:sz w:val="13"/>
+                                    <w:szCs w:val="13"/>
+                                    <w:lang w:eastAsia="de-DE"/>
+                                  </w:rPr>
+                                  <w:t>Cornelia Kriege</w:t>
+                                </w:r>
+                              </w:p>
+                              <w:p>
+                                <w:pPr>
+                                  <w:autoSpaceDE w:val="0"/>
+                                  <w:autoSpaceDN w:val="0"/>
+                                  <w:adjustRightInd w:val="0"/>
+                                  <w:spacing w:line="360" w:lineRule="auto"/>
+                                  <w:jc w:val="left"/>
+                                  <w:rPr>
+                                    <w:rFonts w:eastAsia="Calibri" w:cs="CorporateSPro-Light"/>
+                                    <w:sz w:val="22"/>
+                                    <w:szCs w:val="13"/>
+                                    <w:lang w:eastAsia="de-DE"/>
+                                  </w:rPr>
+                                </w:pPr>
+                                <w:r>
+                                  <w:rPr>
+                                    <w:rFonts w:eastAsia="Calibri" w:cs="CorporateSPro-Light"/>
+                                    <w:sz w:val="13"/>
+                                    <w:szCs w:val="13"/>
+                                    <w:lang w:eastAsia="de-DE"/>
+                                  </w:rPr>
+                                  <w:t>Rechtsanwältin</w:t>
+                                </w:r>
+                              </w:p>
+                              <w:p>
+                                <w:pPr>
+                                  <w:autoSpaceDE w:val="0"/>
+                                  <w:autoSpaceDN w:val="0"/>
+                                  <w:adjustRightInd w:val="0"/>
+                                  <w:spacing w:line="360" w:lineRule="auto"/>
+                                  <w:jc w:val="left"/>
+                                  <w:rPr>
+                                    <w:rFonts w:eastAsia="Calibri" w:cs="CorporateSPro-Light"/>
+                                    <w:sz w:val="22"/>
+                                    <w:szCs w:val="13"/>
+                                    <w:lang w:eastAsia="de-DE"/>
+                                  </w:rPr>
+                                </w:pPr>
+                              </w:p>
+                              <w:p>
+                                <w:pPr>
+                                  <w:autoSpaceDE w:val="0"/>
+                                  <w:autoSpaceDN w:val="0"/>
+                                  <w:adjustRightInd w:val="0"/>
+                                  <w:spacing w:line="360" w:lineRule="auto"/>
+                                  <w:jc w:val="left"/>
+                                  <w:rPr>
+                                    <w:rFonts w:eastAsia="Calibri" w:cs="CorporateSPro-Demi"/>
+                                    <w:b/>
+                                    <w:sz w:val="22"/>
+                                    <w:szCs w:val="13"/>
+                                    <w:lang w:eastAsia="de-DE"/>
+                                  </w:rPr>
+                                </w:pPr>
+                                <w:r>
+                                  <w:rPr>
+                                    <w:rFonts w:eastAsia="Calibri" w:cs="CorporateSPro-Demi"/>
+                                    <w:b/>
+                                    <w:sz w:val="13"/>
+                                    <w:szCs w:val="13"/>
+                                    <w:lang w:eastAsia="de-DE"/>
+                                  </w:rPr>
+                                  <w:t>Lars Wacker</w:t>
+                                </w:r>
+                              </w:p>
+                              <w:p>
+                                <w:pPr>
+                                  <w:autoSpaceDE w:val="0"/>
+                                  <w:autoSpaceDN w:val="0"/>
+                                  <w:adjustRightInd w:val="0"/>
+                                  <w:spacing w:line="360" w:lineRule="auto"/>
+                                  <w:jc w:val="left"/>
+                                  <w:rPr>
+                                    <w:rFonts w:eastAsia="Calibri" w:cs="CorporateSPro-Light"/>
+                                    <w:sz w:val="22"/>
+                                    <w:szCs w:val="13"/>
+                                    <w:lang w:eastAsia="de-DE"/>
+                                  </w:rPr>
+                                </w:pPr>
+                                <w:r>
+                                  <w:rPr>
+                                    <w:rFonts w:eastAsia="Calibri" w:cs="CorporateSPro-Light"/>
+                                    <w:sz w:val="13"/>
+                                    <w:szCs w:val="13"/>
+                                    <w:lang w:eastAsia="de-DE"/>
+                                  </w:rPr>
+                                  <w:t>Rechtsanwalt</w:t>
+                                </w:r>
+                              </w:p>
+                              <w:p>
+                                <w:pPr>
+                                  <w:pBdr>
+                                    <w:bottom w:val="single" w:sz="4" w:space="1" w:color="auto"/>
+                                  </w:pBdr>
+                                  <w:autoSpaceDE w:val="0"/>
+                                  <w:autoSpaceDN w:val="0"/>
+                                  <w:adjustRightInd w:val="0"/>
+                                  <w:spacing w:line="360" w:lineRule="auto"/>
+                                  <w:jc w:val="left"/>
+                                  <w:rPr>
+                                    <w:rFonts w:eastAsia="Calibri" w:cs="CorporateSPro-Light"/>
+                                    <w:sz w:val="22"/>
+                                    <w:szCs w:val="13"/>
+                                    <w:lang w:eastAsia="de-DE"/>
+                                  </w:rPr>
+                                </w:pPr>
+                              </w:p>
+                              <w:p>
+                                <w:pPr>
+                                  <w:autoSpaceDE w:val="0"/>
+                                  <w:autoSpaceDN w:val="0"/>
+                                  <w:adjustRightInd w:val="0"/>
+                                  <w:spacing w:line="360" w:lineRule="auto"/>
+                                  <w:jc w:val="left"/>
+                                  <w:rPr>
+                                    <w:rFonts w:eastAsia="Calibri" w:cs="CorporateSPro-Light"/>
+                                    <w:sz w:val="22"/>
+                                    <w:szCs w:val="13"/>
+                                    <w:lang w:eastAsia="de-DE"/>
+                                  </w:rPr>
+                                </w:pPr>
+                              </w:p>
+                              <w:p>
+                                <w:pPr>
+                                  <w:autoSpaceDE w:val="0"/>
+                                  <w:autoSpaceDN w:val="0"/>
+                                  <w:adjustRightInd w:val="0"/>
+                                  <w:jc w:val="left"/>
+                                  <w:rPr>
+                                    <w:rFonts w:eastAsia="Calibri" w:cs="CorporateSPro-Regular"/>
+                                    <w:sz w:val="22"/>
+                                    <w:szCs w:val="13"/>
+                                    <w:lang w:eastAsia="de-DE"/>
+                                  </w:rPr>
+                                  <w:spacing w:line="360" w:lineRule="auto"/>
+                                </w:pPr>
+                                <w:r>
+                                  <w:rPr>
+                                    <w:rFonts w:eastAsia="Calibri" w:cs="CorporateSPro-Regular"/>
+                                    <w:sz w:val="13"/>
+                                    <w:szCs w:val="13"/>
+                                    <w:lang w:eastAsia="de-DE"/>
+                                  </w:rPr>
+                                  <w:t>OF COUNSEL</w:t>
+                                </w:r>
+                              </w:p>
+                              <w:p>
+                                <w:pPr>
+                                  <w:autoSpaceDE w:val="0"/>
+                                  <w:autoSpaceDN w:val="0"/>
+                                  <w:adjustRightInd w:val="0"/>
+                                  <w:spacing w:line="360" w:lineRule="auto"/>
+                                  <w:jc w:val="left"/>
+                                  <w:rPr>
+                                    <w:rFonts w:eastAsia="Calibri" w:cs="CorporateSPro-Demi"/>
+                                    <w:b/>
+                                    <w:sz w:val="22"/>
+                                    <w:szCs w:val="13"/>
+                                    <w:lang w:eastAsia="de-DE"/>
+                                  </w:rPr>
+                                </w:pPr>
+                                <w:r>
+                                  <w:rPr>
+                                    <w:rFonts w:eastAsia="Calibri" w:cs="CorporateSPro-Demi"/>
+                                    <w:b/>
+                                    <w:sz w:val="13"/>
+                                    <w:szCs w:val="13"/>
+                                    <w:lang w:eastAsia="de-DE"/>
+                                  </w:rPr>
+                                  <w:t>Justizrat Prof. Dr. Dr. Thomas B. Schmidt M.A.</w:t>
+                                </w:r>
+                              </w:p>
+                              <w:p>
+                                <w:pPr>
+                                  <w:autoSpaceDE w:val="0"/>
+                                  <w:autoSpaceDN w:val="0"/>
+                                  <w:adjustRightInd w:val="0"/>
+                                  <w:spacing w:line="360" w:lineRule="auto"/>
+                                  <w:jc w:val="left"/>
+                                  <w:rPr>
+                                    <w:rFonts w:eastAsia="Calibri" w:cs="CorporateSPro-Light"/>
+                                    <w:sz w:val="22"/>
+                                    <w:szCs w:val="13"/>
+                                    <w:lang w:eastAsia="de-DE"/>
+                                  </w:rPr>
+                                </w:pPr>
+                                <w:r>
+                                  <w:rPr>
+                                    <w:rFonts w:eastAsia="Calibri" w:cs="CorporateSPro-Light"/>
+                                    <w:sz w:val="13"/>
+                                    <w:szCs w:val="13"/>
+                                    <w:lang w:eastAsia="de-DE"/>
+                                  </w:rPr>
+                                  <w:t>Fachanwalt für Insolvenz- und Sanierungsrecht</w:t>
+                                </w:r>
+                              </w:p>
+                              <w:p>
+                                <w:pPr>
+                                  <w:pBdr>
+                                    <w:bottom w:val="single" w:sz="4" w:space="1" w:color="auto"/>
+                                  </w:pBdr>
+                                  <w:autoSpaceDE w:val="0"/>
+                                  <w:autoSpaceDN w:val="0"/>
+                                  <w:adjustRightInd w:val="0"/>
+                                  <w:spacing w:line="360" w:lineRule="auto"/>
+                                  <w:jc w:val="left"/>
+                                  <w:rPr>
+                                    <w:rFonts w:eastAsia="Calibri" w:cs="CorporateSPro-Light"/>
+                                    <w:sz w:val="22"/>
+                                    <w:szCs w:val="13"/>
+                                    <w:lang w:eastAsia="de-DE"/>
+                                  </w:rPr>
+                                </w:pPr>
+                              </w:p>
+                              <w:p>
+                                <w:pPr>
+                                  <w:autoSpaceDE w:val="0"/>
+                                  <w:autoSpaceDN w:val="0"/>
+                                  <w:adjustRightInd w:val="0"/>
+                                  <w:spacing w:line="360" w:lineRule="auto"/>
+                                  <w:jc w:val="left"/>
+                                  <w:rPr>
+                                    <w:rFonts w:eastAsia="Calibri" w:cs="CorporateSPro-Light"/>
+                                    <w:sz w:val="22"/>
+                                    <w:szCs w:val="13"/>
+                                    <w:lang w:eastAsia="de-DE"/>
+                                  </w:rPr>
+                                </w:pPr>
+                              </w:p>
+                              <w:p>
+                                <w:pPr>
+                                  <w:autoSpaceDE w:val="0"/>
+                                  <w:autoSpaceDN w:val="0"/>
+                                  <w:adjustRightInd w:val="0"/>
+                                  <w:jc w:val="left"/>
+                                  <w:rPr>
+                                    <w:rFonts w:eastAsia="Calibri" w:cs="CorporateSPro-Regular"/>
+                                    <w:sz w:val="22"/>
+                                    <w:szCs w:val="13"/>
+                                    <w:lang w:eastAsia="de-DE"/>
+                                  </w:rPr>
+                                  <w:spacing w:line="360" w:lineRule="auto"/>
+                                </w:pPr>
+                                <w:r>
+                                  <w:rPr>
+                                    <w:rFonts w:eastAsia="Calibri" w:cs="CorporateSPro-Regular"/>
+                                    <w:sz w:val="13"/>
+                                    <w:szCs w:val="13"/>
+                                    <w:lang w:eastAsia="de-DE"/>
+                                  </w:rPr>
+                                  <w:t>STANDORTE</w:t>
+                                </w:r>
+                              </w:p>
+                              <w:p>
+                                <w:pPr>
+                                  <w:autoSpaceDE w:val="0"/>
+                                  <w:autoSpaceDN w:val="0"/>
+                                  <w:adjustRightInd w:val="0"/>
+                                  <w:spacing w:line="360" w:lineRule="auto"/>
+                                  <w:rPr>
+                                    <w:rFonts w:eastAsia="Calibri" w:cs="CorporateSPro-Demi"/>
+                                    <w:sz w:val="22"/>
+                                    <w:szCs w:val="13"/>
+                                    <w:lang w:eastAsia="de-DE"/>
+                                  </w:rPr>
+                                </w:pPr>
+                                <w:r>
+                                  <w:rPr>
+                                    <w:rFonts w:eastAsia="Calibri" w:cs="CorporateSPro-Demi"/>
+                                    <w:sz w:val="13"/>
+                                    <w:szCs w:val="13"/>
+                                    <w:lang w:eastAsia="de-DE"/>
+                                  </w:rPr>
+                                  <w:t>Trier</w:t>
+                                </w:r>
+                                <w:r>
+                                  <w:rPr>
+                                    <w:rFonts w:eastAsia="Calibri" w:cs="CorporateSPro-Demi"/>
+                                    <w:sz w:val="13"/>
+                                    <w:szCs w:val="13"/>
+                                    <w:lang w:eastAsia="de-DE"/>
+                                  </w:rPr>
+                                  <w:tab/>
+                                </w:r>
+                                <w:r>
+                                  <w:rPr>
+                                    <w:rFonts w:eastAsia="Calibri" w:cs="CorporateSPro-Demi"/>
+                                    <w:sz w:val="13"/>
+                                    <w:szCs w:val="13"/>
+                                    <w:lang w:eastAsia="de-DE"/>
+                                  </w:rPr>
+                                  <w:tab/>
+                                  <w:t>Bad Kreuznach</w:t>
+                                </w:r>
+                              </w:p>
+                              <w:p>
+                                <w:pPr>
+                                  <w:autoSpaceDE w:val="0"/>
+                                  <w:autoSpaceDN w:val="0"/>
+                                  <w:adjustRightInd w:val="0"/>
+                                  <w:spacing w:line="360" w:lineRule="auto"/>
+                                  <w:rPr>
+                                    <w:rFonts w:eastAsia="Calibri" w:cs="CorporateSPro-Demi"/>
+                                    <w:sz w:val="22"/>
+                                    <w:szCs w:val="13"/>
+                                    <w:lang w:eastAsia="de-DE"/>
+                                  </w:rPr>
+                                </w:pPr>
+                                <w:r>
+                                  <w:rPr>
+                                    <w:rFonts w:eastAsia="Calibri" w:cs="CorporateSPro-Demi"/>
+                                    <w:sz w:val="13"/>
+                                    <w:szCs w:val="13"/>
+                                    <w:lang w:eastAsia="de-DE"/>
+                                  </w:rPr>
+                                  <w:t>Frankfurt am Main</w:t>
+                                </w:r>
+                                <w:r>
+                                  <w:rPr>
+                                    <w:rFonts w:eastAsia="Calibri" w:cs="CorporateSPro-Demi"/>
+                                    <w:sz w:val="13"/>
+                                    <w:szCs w:val="13"/>
+                                    <w:lang w:eastAsia="de-DE"/>
+                                  </w:rPr>
+                                  <w:tab/>
+                                  <w:t>Zell/Mosel</w:t>
+                                </w:r>
+                              </w:p>
+                              <w:p>
+                                <w:pPr>
+                                  <w:autoSpaceDE w:val="0"/>
+                                  <w:autoSpaceDN w:val="0"/>
+                                  <w:adjustRightInd w:val="0"/>
+                                  <w:spacing w:line="360" w:lineRule="auto"/>
+                                  <w:rPr>
+                                    <w:rFonts w:eastAsia="Calibri" w:cs="CorporateSPro-Demi"/>
+                                    <w:sz w:val="22"/>
+                                    <w:szCs w:val="13"/>
+                                    <w:lang w:eastAsia="de-DE"/>
+                                  </w:rPr>
+                                </w:pPr>
+                                <w:r>
+                                  <w:rPr>
+                                    <w:rFonts w:eastAsia="Calibri" w:cs="CorporateSPro-Demi"/>
+                                    <w:sz w:val="13"/>
+                                    <w:szCs w:val="13"/>
+                                    <w:lang w:eastAsia="de-DE"/>
+                                  </w:rPr>
+                                  <w:t>Idar-Oberstein</w:t>
+                                </w:r>
+                                <w:r>
+                                  <w:rPr>
+                                    <w:rFonts w:eastAsia="Calibri" w:cs="CorporateSPro-Demi"/>
+                                    <w:sz w:val="13"/>
+                                    <w:szCs w:val="13"/>
+                                    <w:lang w:eastAsia="de-DE"/>
+                                  </w:rPr>
+                                  <w:tab/>
+                                  <w:t>Koblenz</w:t>
+                                </w:r>
+                              </w:p>
+                              <w:p>
+                                <w:pPr>
+                                  <w:autoSpaceDE w:val="0"/>
+                                  <w:autoSpaceDN w:val="0"/>
+                                  <w:adjustRightInd w:val="0"/>
+                                  <w:spacing w:line="360" w:lineRule="auto"/>
+                                  <w:rPr>
+                                    <w:rFonts w:eastAsia="Calibri" w:cs="CorporateSPro-Demi"/>
+                                    <w:sz w:val="22"/>
+                                    <w:szCs w:val="13"/>
+                                    <w:lang w:eastAsia="de-DE"/>
+                                  </w:rPr>
+                                </w:pPr>
+                                <w:r>
+                                  <w:rPr>
+                                    <w:rFonts w:eastAsia="Calibri" w:cs="CorporateSPro-Demi"/>
+                                    <w:sz w:val="13"/>
+                                    <w:szCs w:val="13"/>
+                                    <w:lang w:eastAsia="de-DE"/>
+                                  </w:rPr>
+                                  <w:t>Langgöns</w:t>
+                                </w:r>
+                                <w:r>
+                                  <w:rPr>
+                                    <w:rFonts w:eastAsia="Calibri" w:cs="CorporateSPro-Demi"/>
+                                    <w:sz w:val="13"/>
+                                    <w:szCs w:val="13"/>
+                                    <w:lang w:eastAsia="de-DE"/>
+                                  </w:rPr>
+                                  <w:tab/>
+                                </w:r>
+                                <w:r>
+                                  <w:rPr>
+                                    <w:rFonts w:eastAsia="Calibri" w:cs="CorporateSPro-Demi"/>
+                                    <w:sz w:val="13"/>
+                                    <w:szCs w:val="13"/>
+                                    <w:lang w:eastAsia="de-DE"/>
+                                  </w:rPr>
+                                  <w:tab/>
+                                  <w:t>Limburg/Lahn</w:t>
+                                </w:r>
+                              </w:p>
+                              <w:p>
+                                <w:pPr>
+                                  <w:autoSpaceDE w:val="0"/>
+                                  <w:autoSpaceDN w:val="0"/>
+                                  <w:adjustRightInd w:val="0"/>
+                                  <w:spacing w:line="360" w:lineRule="auto"/>
+                                  <w:rPr>
+                                    <w:rFonts w:eastAsia="Calibri" w:cs="CorporateSPro-Demi"/>
+                                    <w:sz w:val="22"/>
+                                    <w:szCs w:val="9"/>
+                                    <w:lang w:eastAsia="de-DE"/>
+                                  </w:rPr>
+                                </w:pPr>
+                                <w:r>
+                                  <w:rPr>
+                                    <w:rFonts w:eastAsia="Calibri" w:cs="CorporateSPro-Demi"/>
+                                    <w:sz w:val="13"/>
+                                    <w:szCs w:val="13"/>
+                                    <w:lang w:eastAsia="de-DE"/>
+                                  </w:rPr>
+                                  <w:t>Mainz</w:t>
+                                </w:r>
+                                <w:r>
+                                  <w:rPr>
+                                    <w:rFonts w:eastAsia="Calibri" w:cs="CorporateSPro-Demi"/>
+                                    <w:sz w:val="13"/>
+                                    <w:szCs w:val="13"/>
+                                    <w:lang w:eastAsia="de-DE"/>
+                                  </w:rPr>
+                                  <w:tab/>
+                                </w:r>
+                                <w:r>
+                                  <w:rPr>
+                                    <w:rFonts w:eastAsia="Calibri" w:cs="CorporateSPro-Demi"/>
+                                    <w:sz w:val="13"/>
+                                    <w:szCs w:val="13"/>
+                                    <w:lang w:eastAsia="de-DE"/>
+                                  </w:rPr>
+                                  <w:tab/>
+                                  <w:t>Wiesbaden</w:t>
+                                </w:r>
+                                <w:bookmarkEnd w:id="0"/>
+                                <w:bookmarkEnd w:id="1"/>
+                                <w:bookmarkEnd w:id="2"/>
+                                <w:bookmarkEnd w:id="3"/>
+                                <w:bookmarkEnd w:id="4"/>
+                                <w:bookmarkEnd w:id="5"/>
+                                <w:bookmarkEnd w:id="6"/>
+                                <w:bookmarkEnd w:id="7"/>
+                                <w:bookmarkEnd w:id="8"/>
+                                <w:bookmarkEnd w:id="9"/>
+                              </w:p>
+                            </w:txbxContent>
+                          </wps:txbx>
+                          <wps:bodyPr rot="0" spcFirstLastPara="0" vertOverflow="overflow" horzOverflow="overflow" vert="horz" wrap="square" lIns="91440" tIns="45720" rIns="91440" bIns="45720" numCol="1" spcCol="0" rtlCol="0" fromWordArt="0" anchor="t" anchorCtr="0" forceAA="0" compatLnSpc="1">
+                            <a:prstTxWarp prst="textNoShape">
+                              <a:avLst/>
+                            </a:prstTxWarp>
+                            <a:noAutofit/>
+                          </wps:bodyPr>
+                        </wps:wsp>
+                      </a:graphicData>
+                    </a:graphic>
+                    <wp14:sizeRelH relativeFrom="margin">
+                      <wp14:pctWidth>0</wp14:pctWidth>
+                    </wp14:sizeRelH>
+                    <wp14:sizeRelV relativeFrom="margin">
+                      <wp14:pctHeight>0</wp14:pctHeight>
+                    </wp14:sizeRelV>
+                  </wp:anchor>
+                </w:drawing>
+              </mc:Choice>
+              <mc:Fallback>
+                <w:pict>
+                  <v:shapetype w14:anchorId="4E22A302" id="_x0000_t202" coordsize="21600,21600" o:spt="202" path="m,l,21600r21600,l21600,xe">
+                    <v:stroke joinstyle="miter"/>
+                    <v:path gradientshapeok="t" o:connecttype="rect"/>
+                  </v:shapetype>
+                  <v:shape id="Textfeld 2" o:spid="_x0000_s1026" type="#_x0000_t202" style="position:absolute;margin-left:376.05pt;margin-top:245.6pt;width:156.75pt;height:504.75pt;z-index:-251657216;visibility:visible;mso-wrap-style:square;mso-width-percent:0;mso-height-percent:0;mso-wrap-distance-left:9pt;mso-wrap-distance-top:0;mso-wrap-distance-right:9pt;mso-wrap-distance-bottom:0;mso-position-horizontal:absolute;mso-position-horizontal-relative:text;mso-position-vertical:absolute;mso-position-vertical-relative:margin;mso-width-percent:0;mso-height-percent:0;mso-width-relative:margin;mso-height-relative:margin;v-text-anchor:top" o:gfxdata="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" fillcolor="window" stroked="f" strokeweight=".5pt">
+                    <v:textbox>
+                      <w:txbxContent>
+                        <w:p>
+                          <w:pPr>
+                            <w:autoSpaceDE w:val="0"/>
+                            <w:autoSpaceDN w:val="0"/>
+                            <w:adjustRightInd w:val="0"/>
+                            <w:jc w:val="left"/>
+                            <w:rPr>
+                              <w:rFonts w:eastAsia="Calibri" w:cs="CorporateSPro-Demi"/>
+                              <w:b/>
+                              <w:sz w:val="22"/>
+                              <w:szCs w:val="13"/>
+                              <w:lang w:eastAsia="de-DE"/>
+                            </w:rPr>
+                            <w:spacing w:line="360" w:lineRule="auto"/>
+                          </w:pPr>
+                          <w:r>
+                            <w:rPr>
+                              <w:rFonts w:eastAsia="Calibri" w:cs="CorporateSPro-Demi"/>
+                              <w:b/>
+                              <w:sz w:val="13"/>
+                              <w:szCs w:val="13"/>
+                              <w:lang w:eastAsia="de-DE"/>
+                            </w:rPr>
+                            <w:t>www.tbs-insolvenzverwalter.de</w:t>
+                          </w:r>
+                        </w:p>
+                        <w:p>
+                          <w:pPr>
+                            <w:autoSpaceDE w:val="0"/>
+                            <w:autoSpaceDN w:val="0"/>
+                            <w:adjustRightInd w:val="0"/>
+                            <w:spacing w:line="360" w:lineRule="auto"/>
+                            <w:jc w:val="left"/>
+                            <w:rPr>
+                              <w:rFonts w:eastAsia="Calibri" w:cs="CorporateSPro-Light"/>
+                              <w:sz w:val="22"/>
+                              <w:szCs w:val="13"/>
+                              <w:lang w:eastAsia="de-DE"/>
+                            </w:rPr>
+                          </w:pPr>
+                          <w:r>
+                            <w:rPr>
+                              <w:rFonts w:eastAsia="Calibri" w:cs="CorporateSPro-Light"/>
+                              <w:sz w:val="13"/>
+                              <w:szCs w:val="13"/>
+                              <w:lang w:eastAsia="de-DE"/>
+                            </w:rPr>
+                            <w:t>Partnerschaftsregister des</w:t>
+                          </w:r>
+                        </w:p>
+                        <w:p>
+                          <w:pPr>
+                            <w:pBdr>
+                              <w:bottom w:val="single" w:sz="4" w:space="1" w:color="auto"/>
+                            </w:pBdr>
+                            <w:autoSpaceDE w:val="0"/>
+                            <w:autoSpaceDN w:val="0"/>
+                            <w:adjustRightInd w:val="0"/>
+                            <w:spacing w:line="360" w:lineRule="auto"/>
+                            <w:jc w:val="left"/>
+                            <w:rPr>
+                              <w:rFonts w:eastAsia="Calibri" w:cs="CorporateSPro-Light"/>
+                              <w:sz w:val="22"/>
+                              <w:szCs w:val="13"/>
+                              <w:lang w:eastAsia="de-DE"/>
+                            </w:rPr>
+                          </w:pPr>
+                          <w:r>
+                            <w:rPr>
+                              <w:rFonts w:eastAsia="Calibri" w:cs="CorporateSPro-Light"/>
+                              <w:sz w:val="13"/>
+                              <w:szCs w:val="13"/>
+                              <w:lang w:eastAsia="de-DE"/>
+                            </w:rPr>
+                            <w:t>Amtsgericht Koblenz – PR 20203</w:t>
+                          </w:r>
+                        </w:p>
+                        <w:p>
+                          <w:pPr>
+                            <w:pBdr>
+                              <w:bottom w:val="single" w:sz="4" w:space="1" w:color="auto"/>
+                            </w:pBdr>
+                            <w:autoSpaceDE w:val="0"/>
+                            <w:autoSpaceDN w:val="0"/>
+                            <w:adjustRightInd w:val="0"/>
+                            <w:spacing w:line="360" w:lineRule="auto"/>
+                            <w:jc w:val="center"/>
+                            <w:rPr>
+                              <w:rFonts w:eastAsia="Calibri" w:cs="CorporateSPro-Light"/>
+                              <w:sz w:val="22"/>
+                              <w:szCs w:val="13"/>
+                              <w:lang w:eastAsia="de-DE"/>
+                            </w:rPr>
+                          </w:pPr>
+                        </w:p>
+                        <w:p>
+                          <w:pPr>
+                            <w:pBdr>
+                              <w:bottom w:val="single" w:sz="4" w:space="1" w:color="auto"/>
+                            </w:pBdr>
+                            <w:autoSpaceDE w:val="0"/>
+                            <w:autoSpaceDN w:val="0"/>
+                            <w:adjustRightInd w:val="0"/>
+                            <w:spacing w:line="360" w:lineRule="auto"/>
+                            <w:jc w:val="center"/>
+                            <w:rPr>
+                              <w:rFonts w:eastAsia="Calibri" w:cs="CorporateSPro-Light"/>
+                              <w:sz w:val="22"/>
+                              <w:szCs w:val="13"/>
+                              <w:lang w:eastAsia="de-DE"/>
+                            </w:rPr>
+                          </w:pPr>
+                        </w:p>
+                        <w:p>
+                          <w:pPr>
+                            <w:pBdr>
+                              <w:bottom w:val="single" w:sz="4" w:space="1" w:color="auto"/>
+                            </w:pBdr>
+                            <w:autoSpaceDE w:val="0"/>
+                            <w:autoSpaceDN w:val="0"/>
+                            <w:adjustRightInd w:val="0"/>
+                            <w:spacing w:line="360" w:lineRule="auto"/>
+                            <w:jc w:val="center"/>
+                            <w:rPr>
+                              <w:rFonts w:eastAsia="Calibri" w:cs="CorporateSPro-Light"/>
+                              <w:sz w:val="22"/>
+                              <w:szCs w:val="13"/>
+                              <w:lang w:eastAsia="de-DE"/>
+                            </w:rPr>
+                          </w:pPr>
+                        </w:p>
+                        <w:p>
+                          <w:pPr>
+                            <w:pBdr>
+                              <w:bottom w:val="single" w:sz="4" w:space="1" w:color="auto"/>
+                            </w:pBdr>
+                            <w:autoSpaceDE w:val="0"/>
+                            <w:autoSpaceDN w:val="0"/>
+                            <w:adjustRightInd w:val="0"/>
+                            <w:spacing w:line="360" w:lineRule="auto"/>
+                            <w:jc w:val="center"/>
+                            <w:rPr>
+                              <w:rFonts w:eastAsia="Calibri" w:cs="CorporateSPro-Light"/>
+                              <w:sz w:val="22"/>
+                              <w:szCs w:val="13"/>
+                              <w:lang w:eastAsia="de-DE"/>
+                            </w:rPr>
+                          </w:pPr>
+                        </w:p>
+                        <w:p>
+                          <w:pPr>
+                            <w:pBdr>
+                              <w:bottom w:val="single" w:sz="4" w:space="1" w:color="auto"/>
+                            </w:pBdr>
+                            <w:autoSpaceDE w:val="0"/>
+                            <w:autoSpaceDN w:val="0"/>
+                            <w:adjustRightInd w:val="0"/>
+                            <w:spacing w:line="360" w:lineRule="auto"/>
+                            <w:jc w:val="center"/>
+                            <w:rPr>
+                              <w:rFonts w:eastAsia="Calibri" w:cs="CorporateSPro-Light"/>
+                              <w:sz w:val="22"/>
+                              <w:szCs w:val="13"/>
+                              <w:lang w:eastAsia="de-DE"/>
+                            </w:rPr>
+                          </w:pPr>
+                        </w:p>
+                        <w:p>
+                          <w:pPr>
+                            <w:pBdr>
+                              <w:bottom w:val="single" w:sz="4" w:space="1" w:color="auto"/>
+                            </w:pBdr>
+                            <w:autoSpaceDE w:val="0"/>
+                            <w:autoSpaceDN w:val="0"/>
+                            <w:adjustRightInd w:val="0"/>
+                            <w:spacing w:line="360" w:lineRule="auto"/>
+                            <w:jc w:val="center"/>
+                            <w:rPr>
+                              <w:rFonts w:eastAsia="Calibri" w:cs="CorporateSPro-Light"/>
+                              <w:sz w:val="22"/>
+                              <w:szCs w:val="13"/>
+                              <w:lang w:eastAsia="de-DE"/>
+                            </w:rPr>
+                          </w:pPr>
+                        </w:p>
+                        <w:p>
+                          <w:pPr>
+                            <w:pBdr>
+                              <w:bottom w:val="single" w:sz="4" w:space="1" w:color="auto"/>
+                            </w:pBdr>
+                            <w:autoSpaceDE w:val="0"/>
+                            <w:autoSpaceDN w:val="0"/>
+                            <w:adjustRightInd w:val="0"/>
+                            <w:spacing w:line="360" w:lineRule="auto"/>
+                            <w:jc w:val="center"/>
+                            <w:rPr>
+                              <w:rFonts w:eastAsia="Calibri" w:cs="CorporateSPro-Light"/>
+                              <w:sz w:val="22"/>
+                              <w:szCs w:val="13"/>
+                              <w:lang w:eastAsia="de-DE"/>
+                            </w:rPr>
+                          </w:pPr>
+                        </w:p>
+                        <w:p>
+                          <w:pPr>
+                            <w:autoSpaceDE w:val="0"/>
+                            <w:autoSpaceDN w:val="0"/>
+                            <w:adjustRightInd w:val="0"/>
+                            <w:spacing w:line="360" w:lineRule="auto"/>
+                            <w:jc w:val="left"/>
+                            <w:rPr>
+                              <w:rFonts w:eastAsia="Calibri" w:cs="CorporateSPro-Light"/>
+                              <w:sz w:val="22"/>
+                              <w:szCs w:val="13"/>
+                              <w:lang w:eastAsia="de-DE"/>
+                            </w:rPr>
+                          </w:pPr>
+                        </w:p>
+                        <w:p>
+                          <w:pPr>
+                            <w:autoSpaceDE w:val="0"/>
+                            <w:autoSpaceDN w:val="0"/>
+                            <w:adjustRightInd w:val="0"/>
+                            <w:jc w:val="left"/>
+                            <w:rPr>
+                              <w:rFonts w:eastAsia="Calibri" w:cs="CorporateSPro-Regular"/>
+                              <w:sz w:val="22"/>
+                              <w:szCs w:val="13"/>
+                              <w:lang w:eastAsia="de-DE"/>
+                            </w:rPr>
+                            <w:spacing w:line="360" w:lineRule="auto"/>
+                          </w:pPr>
+                          <w:bookmarkStart w:id="10" w:name="_Hlk217368252"/>
+                          <w:bookmarkStart w:id="11" w:name="_Hlk217368253"/>
+                          <w:bookmarkStart w:id="12" w:name="_Hlk217368337"/>
+                          <w:bookmarkStart w:id="13" w:name="_Hlk217368338"/>
+                          <w:bookmarkStart w:id="14" w:name="_Hlk217368401"/>
+                          <w:bookmarkStart w:id="15" w:name="_Hlk217368402"/>
+                          <w:bookmarkStart w:id="16" w:name="_Hlk217368434"/>
+                          <w:bookmarkStart w:id="17" w:name="_Hlk217368435"/>
+                          <w:bookmarkStart w:id="18" w:name="_Hlk217368465"/>
+                          <w:bookmarkStart w:id="19" w:name="_Hlk217368466"/>
+                          <w:r>
+                            <w:rPr>
+                              <w:rFonts w:eastAsia="Calibri" w:cs="CorporateSPro-Regular"/>
+                              <w:sz w:val="13"/>
+                              <w:szCs w:val="13"/>
+                              <w:lang w:eastAsia="de-DE"/>
+                            </w:rPr>
+                            <w:t>PARTNER</w:t>
+                          </w:r>
+                        </w:p>
+                        <w:p>
+                          <w:pPr>
+                            <w:autoSpaceDE w:val="0"/>
+                            <w:autoSpaceDN w:val="0"/>
+                            <w:adjustRightInd w:val="0"/>
+                            <w:spacing w:line="360" w:lineRule="auto"/>
+                            <w:jc w:val="left"/>
+                            <w:rPr>
+                              <w:rFonts w:eastAsia="Calibri" w:cs="CorporateSPro-Demi"/>
+                              <w:b/>
+                              <w:sz w:val="22"/>
+                              <w:szCs w:val="13"/>
+                              <w:lang w:eastAsia="de-DE"/>
+                            </w:rPr>
+                          </w:pPr>
+                          <w:r>
+                            <w:rPr>
+                              <w:rFonts w:eastAsia="Calibri" w:cs="CorporateSPro-Demi"/>
+                              <w:b/>
+                              <w:sz w:val="13"/>
+                              <w:szCs w:val="13"/>
+                              <w:lang w:eastAsia="de-DE"/>
+                            </w:rPr>
+                            <w:t>Ingo Grünewald</w:t>
+                          </w:r>
+                        </w:p>
+                        <w:p>
+                          <w:pPr>
+                            <w:autoSpaceDE w:val="0"/>
+                            <w:autoSpaceDN w:val="0"/>
+                            <w:adjustRightInd w:val="0"/>
+                            <w:spacing w:line="360" w:lineRule="auto"/>
+                            <w:jc w:val="left"/>
+                            <w:rPr>
+                              <w:rFonts w:eastAsia="Calibri" w:cs="CorporateSPro-Light"/>
+                              <w:sz w:val="22"/>
+                              <w:szCs w:val="13"/>
+                              <w:lang w:eastAsia="de-DE"/>
+                            </w:rPr>
+                          </w:pPr>
+                          <w:r>
+                            <w:rPr>
+                              <w:rFonts w:eastAsia="Calibri" w:cs="CorporateSPro-Light"/>
+                              <w:sz w:val="13"/>
+                              <w:szCs w:val="13"/>
+                              <w:lang w:eastAsia="de-DE"/>
+                            </w:rPr>
+                            <w:t>Fachanwalt für Insolvenz- und Sanierungsrecht</w:t>
+                          </w:r>
+                        </w:p>
+                        <w:p>
+                          <w:pPr>
+                            <w:autoSpaceDE w:val="0"/>
+                            <w:autoSpaceDN w:val="0"/>
+                            <w:adjustRightInd w:val="0"/>
+                            <w:spacing w:line="360" w:lineRule="auto"/>
+                            <w:jc w:val="left"/>
+                            <w:rPr>
+                              <w:rFonts w:eastAsia="Calibri" w:cs="CorporateSPro-Light"/>
+                              <w:sz w:val="22"/>
+                              <w:szCs w:val="13"/>
+                              <w:lang w:eastAsia="de-DE"/>
+                            </w:rPr>
+                          </w:pPr>
+                          <w:r>
+                            <w:rPr>
+                              <w:rFonts w:eastAsia="Calibri" w:cs="CorporateSPro-Light"/>
+                              <w:sz w:val="13"/>
+                              <w:szCs w:val="13"/>
+                              <w:lang w:eastAsia="de-DE"/>
+                            </w:rPr>
+                            <w:t>Fachanwalt für Handels- und Gesellschaftsrecht</w:t>
+                          </w:r>
+                        </w:p>
+                        <w:p>
+                          <w:pPr>
+                            <w:autoSpaceDE w:val="0"/>
+                            <w:autoSpaceDN w:val="0"/>
+                            <w:adjustRightInd w:val="0"/>
+                            <w:spacing w:line="360" w:lineRule="auto"/>
+                            <w:jc w:val="left"/>
+                            <w:rPr>
+                              <w:rFonts w:eastAsia="Calibri" w:cs="CorporateSPro-Demi"/>
+                              <w:b/>
+                              <w:sz w:val="22"/>
+                              <w:szCs w:val="13"/>
+                              <w:lang w:eastAsia="de-DE"/>
+                            </w:rPr>
+                          </w:pPr>
+                        </w:p>
+                        <w:p>
+                          <w:pPr>
+                            <w:autoSpaceDE w:val="0"/>
+                            <w:autoSpaceDN w:val="0"/>
+                            <w:adjustRightInd w:val="0"/>
+                            <w:spacing w:line="360" w:lineRule="auto"/>
+                            <w:jc w:val="left"/>
+                            <w:rPr>
+                              <w:rFonts w:eastAsia="Calibri" w:cs="CorporateSPro-Demi"/>
+                              <w:b/>
+                              <w:sz w:val="22"/>
+                              <w:szCs w:val="13"/>
+                              <w:lang w:val="en-GB" w:eastAsia="de-DE"/>
+                            </w:rPr>
+                          </w:pPr>
+                          <w:r>
+                            <w:rPr>
+                              <w:rFonts w:eastAsia="Calibri" w:cs="CorporateSPro-Demi"/>
+                              <w:b/>
+                              <w:sz w:val="13"/>
+                              <w:szCs w:val="13"/>
+                              <w:lang w:val="en-GB" w:eastAsia="de-DE"/>
+                            </w:rPr>
+                            <w:t>Dr. Alexander Thomas Lamberty LL.M.</w:t>
+                          </w:r>
+                        </w:p>
+                        <w:p>
+                          <w:pPr>
+                            <w:autoSpaceDE w:val="0"/>
+                            <w:autoSpaceDN w:val="0"/>
+                            <w:adjustRightInd w:val="0"/>
+                            <w:spacing w:line="360" w:lineRule="auto"/>
+                            <w:jc w:val="left"/>
+                            <w:rPr>
+                              <w:rFonts w:eastAsia="Calibri" w:cs="CorporateSPro-Light"/>
+                              <w:sz w:val="22"/>
+                              <w:szCs w:val="13"/>
+                              <w:lang w:eastAsia="de-DE"/>
+                            </w:rPr>
+                          </w:pPr>
+                          <w:r>
+                            <w:rPr>
+                              <w:rFonts w:eastAsia="Calibri" w:cs="CorporateSPro-Light"/>
+                              <w:sz w:val="13"/>
+                              <w:szCs w:val="13"/>
+                              <w:lang w:eastAsia="de-DE"/>
+                            </w:rPr>
+                            <w:t>Fachanwalt für Insolvenz- und Sanierungsrecht</w:t>
+                          </w:r>
+                        </w:p>
+                        <w:p>
+                          <w:pPr>
+                            <w:autoSpaceDE w:val="0"/>
+                            <w:autoSpaceDN w:val="0"/>
+                            <w:adjustRightInd w:val="0"/>
+                            <w:spacing w:line="360" w:lineRule="auto"/>
+                            <w:jc w:val="left"/>
+                            <w:rPr>
+                              <w:rFonts w:eastAsia="Calibri" w:cs="CorporateSPro-Demi"/>
+                              <w:b/>
+                              <w:sz w:val="22"/>
+                              <w:szCs w:val="13"/>
+                              <w:lang w:eastAsia="de-DE"/>
+                            </w:rPr>
+                          </w:pPr>
+                        </w:p>
+                        <w:p>
+                          <w:pPr>
+                            <w:autoSpaceDE w:val="0"/>
+                            <w:autoSpaceDN w:val="0"/>
+                            <w:adjustRightInd w:val="0"/>
+                            <w:spacing w:line="360" w:lineRule="auto"/>
+                            <w:jc w:val="left"/>
+                            <w:rPr>
+                              <w:rFonts w:eastAsia="Calibri" w:cs="CorporateSPro-Demi"/>
+                              <w:b/>
+                              <w:sz w:val="22"/>
+                              <w:szCs w:val="13"/>
+                              <w:lang w:eastAsia="de-DE"/>
+                            </w:rPr>
+                          </w:pPr>
+                          <w:r>
+                            <w:rPr>
+                              <w:rFonts w:eastAsia="Calibri" w:cs="CorporateSPro-Demi"/>
+                              <w:b/>
+                              <w:sz w:val="13"/>
+                              <w:szCs w:val="13"/>
+                              <w:lang w:eastAsia="de-DE"/>
+                            </w:rPr>
+                            <w:t>Fatma Kreft</w:t>
+                          </w:r>
+                        </w:p>
+                        <w:p>
+                          <w:pPr>
+                            <w:autoSpaceDE w:val="0"/>
+                            <w:autoSpaceDN w:val="0"/>
+                            <w:adjustRightInd w:val="0"/>
+                            <w:spacing w:line="360" w:lineRule="auto"/>
+                            <w:jc w:val="left"/>
+                            <w:rPr>
+                              <w:rFonts w:eastAsia="Calibri" w:cs="CorporateSPro-Light"/>
+                              <w:sz w:val="22"/>
+                              <w:szCs w:val="13"/>
+                              <w:lang w:eastAsia="de-DE"/>
+                            </w:rPr>
+                          </w:pPr>
+                          <w:r>
+                            <w:rPr>
+                              <w:rFonts w:eastAsia="Calibri" w:cs="CorporateSPro-Light"/>
+                              <w:sz w:val="13"/>
+                              <w:szCs w:val="13"/>
+                              <w:lang w:eastAsia="de-DE"/>
+                            </w:rPr>
+                            <w:t>Fachanwältin für Insolvenz- und Sanierungsrecht</w:t>
+                          </w:r>
+                        </w:p>
+                        <w:p>
+                          <w:pPr>
+                            <w:autoSpaceDE w:val="0"/>
+                            <w:autoSpaceDN w:val="0"/>
+                            <w:adjustRightInd w:val="0"/>
+                            <w:spacing w:line="360" w:lineRule="auto"/>
+                            <w:jc w:val="left"/>
+                            <w:rPr>
+                              <w:rFonts w:eastAsia="Calibri" w:cs="CorporateSPro-Light"/>
+                              <w:sz w:val="22"/>
+                              <w:szCs w:val="13"/>
+                              <w:lang w:eastAsia="de-DE"/>
+                            </w:rPr>
+                          </w:pPr>
+                          <w:r>
+                            <w:rPr>
+                              <w:rFonts w:eastAsia="Calibri" w:cs="CorporateSPro-Light"/>
+                              <w:sz w:val="13"/>
+                              <w:szCs w:val="13"/>
+                              <w:lang w:eastAsia="de-DE"/>
+                            </w:rPr>
+                            <w:t>Fachanwältin für Steuerrecht</w:t>
+                          </w:r>
+                        </w:p>
+                        <w:p>
+                          <w:pPr>
+                            <w:autoSpaceDE w:val="0"/>
+                            <w:autoSpaceDN w:val="0"/>
+                            <w:adjustRightInd w:val="0"/>
+                            <w:spacing w:line="360" w:lineRule="auto"/>
+                            <w:jc w:val="left"/>
+                            <w:rPr>
+                              <w:rFonts w:eastAsia="Calibri" w:cs="CorporateSPro-Light"/>
+                              <w:sz w:val="22"/>
+                              <w:szCs w:val="13"/>
+                              <w:lang w:eastAsia="de-DE"/>
+                            </w:rPr>
+                          </w:pPr>
+                        </w:p>
+                        <w:p>
+                          <w:pPr>
+                            <w:autoSpaceDE w:val="0"/>
+                            <w:autoSpaceDN w:val="0"/>
+                            <w:adjustRightInd w:val="0"/>
+                            <w:spacing w:line="360" w:lineRule="auto"/>
+                            <w:jc w:val="left"/>
+                            <w:rPr>
+                              <w:rFonts w:eastAsia="Calibri" w:cs="CorporateSPro-Demi"/>
+                              <w:b/>
+                              <w:sz w:val="22"/>
+                              <w:szCs w:val="13"/>
+                              <w:lang w:eastAsia="de-DE"/>
+                            </w:rPr>
+                          </w:pPr>
+                          <w:r>
+                            <w:rPr>
+                              <w:rFonts w:eastAsia="Calibri" w:cs="CorporateSPro-Demi"/>
+                              <w:b/>
+                              <w:sz w:val="13"/>
+                              <w:szCs w:val="13"/>
+                              <w:lang w:eastAsia="de-DE"/>
+                            </w:rPr>
+                            <w:t>Dr. Arne Löser</w:t>
+                          </w:r>
+                        </w:p>
+                        <w:p>
+                          <w:pPr>
+                            <w:autoSpaceDE w:val="0"/>
+                            <w:autoSpaceDN w:val="0"/>
+                            <w:adjustRightInd w:val="0"/>
+                            <w:spacing w:line="360" w:lineRule="auto"/>
+                            <w:jc w:val="left"/>
+                            <w:rPr>
+                              <w:rFonts w:eastAsia="Calibri" w:cs="CorporateSPro-Light"/>
+                              <w:sz w:val="22"/>
+                              <w:szCs w:val="13"/>
+                              <w:lang w:eastAsia="de-DE"/>
+                            </w:rPr>
+                          </w:pPr>
+                          <w:r>
+                            <w:rPr>
+                              <w:rFonts w:eastAsia="Calibri" w:cs="CorporateSPro-Light"/>
+                              <w:sz w:val="13"/>
+                              <w:szCs w:val="13"/>
+                              <w:lang w:eastAsia="de-DE"/>
+                            </w:rPr>
+                            <w:t>Fachanwalt für Insolvenz- und Sanierungsrecht</w:t>
+                          </w:r>
+                        </w:p>
+                        <w:p>
+                          <w:pPr>
+                            <w:autoSpaceDE w:val="0"/>
+                            <w:autoSpaceDN w:val="0"/>
+                            <w:adjustRightInd w:val="0"/>
+                            <w:spacing w:line="360" w:lineRule="auto"/>
+                            <w:jc w:val="left"/>
+                            <w:rPr>
+                              <w:rFonts w:eastAsia="Calibri" w:cs="CorporateSPro-Light"/>
+                              <w:sz w:val="22"/>
+                              <w:szCs w:val="13"/>
+                              <w:lang w:eastAsia="de-DE"/>
+                            </w:rPr>
+                          </w:pPr>
+                          <w:r>
+                            <w:rPr>
+                              <w:rFonts w:eastAsia="Calibri" w:cs="CorporateSPro-Light"/>
+                              <w:sz w:val="13"/>
+                              <w:szCs w:val="13"/>
+                              <w:lang w:eastAsia="de-DE"/>
+                            </w:rPr>
+                            <w:t>Fachanwalt für Handels- und Gesellschaftsrecht</w:t>
+                          </w:r>
+                        </w:p>
+                        <w:p>
+                          <w:pPr>
+                            <w:autoSpaceDE w:val="0"/>
+                            <w:autoSpaceDN w:val="0"/>
+                            <w:adjustRightInd w:val="0"/>
+                            <w:spacing w:line="360" w:lineRule="auto"/>
+                            <w:jc w:val="left"/>
+                            <w:rPr>
+                              <w:rFonts w:eastAsia="Calibri" w:cs="CorporateSPro-Light"/>
+                              <w:sz w:val="22"/>
+                              <w:szCs w:val="13"/>
+                              <w:lang w:eastAsia="de-DE"/>
+                            </w:rPr>
+                          </w:pPr>
+                        </w:p>
+                        <w:p>
+                          <w:pPr>
+                            <w:autoSpaceDE w:val="0"/>
+                            <w:autoSpaceDN w:val="0"/>
+                            <w:adjustRightInd w:val="0"/>
+                            <w:spacing w:line="360" w:lineRule="auto"/>
+                            <w:jc w:val="left"/>
+                            <w:rPr>
+                              <w:rFonts w:eastAsia="Calibri" w:cs="CorporateSPro-Demi"/>
+                              <w:b/>
+                              <w:sz w:val="22"/>
+                              <w:szCs w:val="13"/>
+                              <w:lang w:eastAsia="de-DE"/>
+                            </w:rPr>
+                          </w:pPr>
+                          <w:r>
+                            <w:rPr>
+                              <w:rFonts w:eastAsia="Calibri" w:cs="CorporateSPro-Demi"/>
+                              <w:b/>
+                              <w:sz w:val="13"/>
+                              <w:szCs w:val="13"/>
+                              <w:lang w:eastAsia="de-DE"/>
+                            </w:rPr>
+                            <w:t>Dr. Thomas Thöne</w:t>
+                          </w:r>
+                        </w:p>
+                        <w:p>
+                          <w:pPr>
+                            <w:autoSpaceDE w:val="0"/>
+                            <w:autoSpaceDN w:val="0"/>
+                            <w:adjustRightInd w:val="0"/>
+                            <w:spacing w:line="360" w:lineRule="auto"/>
+                            <w:jc w:val="left"/>
+                            <w:rPr>
+                              <w:rFonts w:eastAsia="Calibri" w:cs="CorporateSPro-Light"/>
+                              <w:sz w:val="22"/>
+                              <w:szCs w:val="13"/>
+                              <w:lang w:eastAsia="de-DE"/>
+                            </w:rPr>
+                          </w:pPr>
+                          <w:r>
+                            <w:rPr>
+                              <w:rFonts w:eastAsia="Calibri" w:cs="CorporateSPro-Light"/>
+                              <w:sz w:val="13"/>
+                              <w:szCs w:val="13"/>
+                              <w:lang w:eastAsia="de-DE"/>
+                            </w:rPr>
+                            <w:t>Fachanwalt für Insolvenz- und Sanierungsrecht</w:t>
+                          </w:r>
+                        </w:p>
+                        <w:p>
+                          <w:pPr>
+                            <w:autoSpaceDE w:val="0"/>
+                            <w:autoSpaceDN w:val="0"/>
+                            <w:adjustRightInd w:val="0"/>
+                            <w:spacing w:line="360" w:lineRule="auto"/>
+                            <w:jc w:val="left"/>
+                            <w:rPr>
+                              <w:rFonts w:eastAsia="Calibri" w:cs="CorporateSPro-Light"/>
+                              <w:sz w:val="22"/>
+                              <w:szCs w:val="13"/>
+                              <w:lang w:eastAsia="de-DE"/>
+                            </w:rPr>
+                          </w:pPr>
+                          <w:r>
+                            <w:rPr>
+                              <w:rFonts w:eastAsia="Calibri" w:cs="CorporateSPro-Light"/>
+                              <w:sz w:val="13"/>
+                              <w:szCs w:val="13"/>
+                              <w:lang w:eastAsia="de-DE"/>
+                            </w:rPr>
+                            <w:t>Fachanwalt für Steuerrecht</w:t>
+                          </w:r>
+                        </w:p>
+                        <w:p>
+                          <w:pPr>
+                            <w:autoSpaceDE w:val="0"/>
+                            <w:autoSpaceDN w:val="0"/>
+                            <w:adjustRightInd w:val="0"/>
+                            <w:spacing w:line="360" w:lineRule="auto"/>
+                            <w:jc w:val="left"/>
+                            <w:rPr>
+                              <w:rFonts w:eastAsia="Calibri" w:cs="CorporateSPro-Light"/>
+                              <w:sz w:val="22"/>
+                              <w:szCs w:val="13"/>
+                              <w:lang w:eastAsia="de-DE"/>
+                            </w:rPr>
+                          </w:pPr>
+                          <w:r>
+                            <w:rPr>
+                              <w:rFonts w:eastAsia="Calibri" w:cs="CorporateSPro-Light"/>
+                              <w:sz w:val="13"/>
+                              <w:szCs w:val="13"/>
+                              <w:lang w:eastAsia="de-DE"/>
+                            </w:rPr>
+                            <w:t>Notar in Wiesbaden</w:t>
+                          </w:r>
+                        </w:p>
+                        <w:p>
+                          <w:pPr>
+                            <w:pBdr>
+                              <w:bottom w:val="single" w:sz="4" w:space="1" w:color="auto"/>
+                            </w:pBdr>
+                            <w:autoSpaceDE w:val="0"/>
+                            <w:autoSpaceDN w:val="0"/>
+                            <w:adjustRightInd w:val="0"/>
+                            <w:spacing w:line="360" w:lineRule="auto"/>
+                            <w:jc w:val="left"/>
+                            <w:rPr>
+                              <w:rFonts w:eastAsia="Calibri" w:cs="CorporateSPro-Light"/>
+                              <w:sz w:val="22"/>
+                              <w:szCs w:val="13"/>
+                              <w:lang w:eastAsia="de-DE"/>
+                            </w:rPr>
+                          </w:pPr>
+                        </w:p>
+                        <w:p>
+                          <w:pPr>
+                            <w:autoSpaceDE w:val="0"/>
+                            <w:autoSpaceDN w:val="0"/>
+                            <w:adjustRightInd w:val="0"/>
+                            <w:spacing w:line="360" w:lineRule="auto"/>
+                            <w:jc w:val="left"/>
+                            <w:rPr>
+                              <w:rFonts w:eastAsia="Calibri" w:cs="CorporateSPro-Light"/>
+                              <w:sz w:val="22"/>
+                              <w:szCs w:val="13"/>
+                              <w:lang w:eastAsia="de-DE"/>
+                            </w:rPr>
+                          </w:pPr>
+                        </w:p>
+                        <w:p>
+                          <w:pPr>
+                            <w:autoSpaceDE w:val="0"/>
+                            <w:autoSpaceDN w:val="0"/>
+                            <w:adjustRightInd w:val="0"/>
+                            <w:jc w:val="left"/>
+                            <w:rPr>
+                              <w:rFonts w:eastAsia="Calibri" w:cs="CorporateSPro-Regular"/>
+                              <w:sz w:val="22"/>
+                              <w:szCs w:val="13"/>
+                              <w:lang w:eastAsia="de-DE"/>
+                            </w:rPr>
+                            <w:spacing w:line="360" w:lineRule="auto"/>
+                          </w:pPr>
+                          <w:r>
+                            <w:rPr>
+                              <w:rFonts w:eastAsia="Calibri" w:cs="CorporateSPro-Regular"/>
+                              <w:sz w:val="13"/>
+                              <w:szCs w:val="13"/>
+                              <w:lang w:eastAsia="de-DE"/>
+                            </w:rPr>
+                            <w:t>ANGESTELLTE RECHTSANWÄLTE</w:t>
+                          </w:r>
+                        </w:p>
+                        <w:p>
+                          <w:pPr>
+                            <w:autoSpaceDE w:val="0"/>
+                            <w:autoSpaceDN w:val="0"/>
+                            <w:adjustRightInd w:val="0"/>
+                            <w:spacing w:line="360" w:lineRule="auto"/>
+                            <w:jc w:val="left"/>
+                            <w:rPr>
+                              <w:rFonts w:eastAsia="Calibri" w:cs="CorporateSPro-Demi"/>
+                              <w:b/>
+                              <w:sz w:val="22"/>
+                              <w:szCs w:val="13"/>
+                              <w:lang w:eastAsia="de-DE"/>
+                            </w:rPr>
+                          </w:pPr>
+                          <w:r>
+                            <w:rPr>
+                              <w:rFonts w:eastAsia="Calibri" w:cs="CorporateSPro-Demi"/>
+                              <w:b/>
+                              <w:sz w:val="13"/>
+                              <w:szCs w:val="13"/>
+                              <w:lang w:eastAsia="de-DE"/>
+                            </w:rPr>
+                            <w:t>Eva Meyer</w:t>
+                          </w:r>
+                        </w:p>
+                        <w:p>
+                          <w:pPr>
+                            <w:autoSpaceDE w:val="0"/>
+                            <w:autoSpaceDN w:val="0"/>
+                            <w:adjustRightInd w:val="0"/>
+                            <w:spacing w:line="360" w:lineRule="auto"/>
+                            <w:jc w:val="left"/>
+                            <w:rPr>
+                              <w:rFonts w:eastAsia="Calibri" w:cs="CorporateSPro-Demi"/>
+                              <w:sz w:val="22"/>
+                              <w:szCs w:val="13"/>
+                              <w:lang w:eastAsia="de-DE"/>
+                            </w:rPr>
+                          </w:pPr>
+                          <w:r>
+                            <w:rPr>
+                              <w:rFonts w:eastAsia="Calibri" w:cs="CorporateSPro-Demi"/>
+                              <w:sz w:val="13"/>
+                              <w:szCs w:val="13"/>
+                              <w:lang w:eastAsia="de-DE"/>
+                            </w:rPr>
+                            <w:t>Fachanwältin für Insolvenz- und Sanierungsrecht</w:t>
+                          </w:r>
+                        </w:p>
+                        <w:p>
+                          <w:pPr>
+                            <w:autoSpaceDE w:val="0"/>
+                            <w:autoSpaceDN w:val="0"/>
+                            <w:adjustRightInd w:val="0"/>
+                            <w:spacing w:line="360" w:lineRule="auto"/>
+                            <w:jc w:val="left"/>
+                            <w:rPr>
+                              <w:rFonts w:eastAsia="Calibri" w:cs="CorporateSPro-Light"/>
+                              <w:sz w:val="22"/>
+                              <w:szCs w:val="13"/>
+                              <w:lang w:eastAsia="de-DE"/>
+                            </w:rPr>
+                          </w:pPr>
+                        </w:p>
+                        <w:p>
+                          <w:pPr>
+                            <w:autoSpaceDE w:val="0"/>
+                            <w:autoSpaceDN w:val="0"/>
+                            <w:adjustRightInd w:val="0"/>
+                            <w:spacing w:line="360" w:lineRule="auto"/>
+                            <w:jc w:val="left"/>
+                            <w:rPr>
+                              <w:rFonts w:eastAsia="Calibri" w:cs="CorporateSPro-Demi"/>
+                              <w:b/>
+                              <w:sz w:val="22"/>
+                              <w:szCs w:val="13"/>
+                              <w:lang w:eastAsia="de-DE"/>
+                            </w:rPr>
+                          </w:pPr>
+                          <w:r>
+                            <w:rPr>
+                              <w:rFonts w:eastAsia="Calibri" w:cs="CorporateSPro-Demi"/>
+                              <w:b/>
+                              <w:sz w:val="13"/>
+                              <w:szCs w:val="13"/>
+                              <w:lang w:eastAsia="de-DE"/>
+                            </w:rPr>
+                            <w:t>Bettina Dax</w:t>
+                          </w:r>
+                        </w:p>
+                        <w:p>
+                          <w:pPr>
+                            <w:autoSpaceDE w:val="0"/>
+                            <w:autoSpaceDN w:val="0"/>
+                            <w:adjustRightInd w:val="0"/>
+                            <w:spacing w:line="360" w:lineRule="auto"/>
+                            <w:jc w:val="left"/>
+                            <w:rPr>
+                              <w:rFonts w:eastAsia="Calibri" w:cs="CorporateSPro-Light"/>
+                              <w:sz w:val="22"/>
+                              <w:szCs w:val="13"/>
+                              <w:lang w:eastAsia="de-DE"/>
+                            </w:rPr>
+                          </w:pPr>
+                          <w:r>
+                            <w:rPr>
+                              <w:rFonts w:eastAsia="Calibri" w:cs="CorporateSPro-Light"/>
+                              <w:sz w:val="13"/>
+                              <w:szCs w:val="13"/>
+                              <w:lang w:eastAsia="de-DE"/>
+                            </w:rPr>
+                            <w:t>Rechtsanwältin</w:t>
+                          </w:r>
+                        </w:p>
+                        <w:p>
+                          <w:pPr>
+                            <w:autoSpaceDE w:val="0"/>
+                            <w:autoSpaceDN w:val="0"/>
+                            <w:adjustRightInd w:val="0"/>
+                            <w:spacing w:line="360" w:lineRule="auto"/>
+                            <w:jc w:val="left"/>
+                            <w:rPr>
+                              <w:rFonts w:eastAsia="Calibri" w:cs="CorporateSPro-Demi"/>
+                              <w:b/>
+                              <w:sz w:val="22"/>
+                              <w:szCs w:val="13"/>
+                              <w:lang w:eastAsia="de-DE"/>
+                            </w:rPr>
+                          </w:pPr>
+                        </w:p>
+                        <w:p>
+                          <w:pPr>
+                            <w:autoSpaceDE w:val="0"/>
+                            <w:autoSpaceDN w:val="0"/>
+                            <w:adjustRightInd w:val="0"/>
+                            <w:spacing w:line="360" w:lineRule="auto"/>
+                            <w:jc w:val="left"/>
+                            <w:rPr>
+                              <w:rFonts w:eastAsia="Calibri" w:cs="CorporateSPro-Demi"/>
+                              <w:b/>
+                              <w:sz w:val="22"/>
+                              <w:szCs w:val="13"/>
+                              <w:lang w:eastAsia="de-DE"/>
+                            </w:rPr>
+                          </w:pPr>
+                          <w:r>
+                            <w:rPr>
+                              <w:rFonts w:eastAsia="Calibri" w:cs="CorporateSPro-Demi"/>
+                              <w:b/>
+                              <w:sz w:val="13"/>
+                              <w:szCs w:val="13"/>
+                              <w:lang w:eastAsia="de-DE"/>
+                            </w:rPr>
+                            <w:t>Cornelia Kriege</w:t>
+                          </w:r>
+                        </w:p>
+                        <w:p>
+                          <w:pPr>
+                            <w:autoSpaceDE w:val="0"/>
+                            <w:autoSpaceDN w:val="0"/>
+                            <w:adjustRightInd w:val="0"/>
+                            <w:spacing w:line="360" w:lineRule="auto"/>
+                            <w:jc w:val="left"/>
+                            <w:rPr>
+                              <w:rFonts w:eastAsia="Calibri" w:cs="CorporateSPro-Light"/>
+                              <w:sz w:val="22"/>
+                              <w:szCs w:val="13"/>
+                              <w:lang w:eastAsia="de-DE"/>
+                            </w:rPr>
+                          </w:pPr>
+                          <w:r>
+                            <w:rPr>
+                              <w:rFonts w:eastAsia="Calibri" w:cs="CorporateSPro-Light"/>
+                              <w:sz w:val="13"/>
+                              <w:szCs w:val="13"/>
+                              <w:lang w:eastAsia="de-DE"/>
+                            </w:rPr>
+                            <w:t>Rechtsanwältin</w:t>
+                          </w:r>
+                        </w:p>
+                        <w:p>
+                          <w:pPr>
+                            <w:autoSpaceDE w:val="0"/>
+                            <w:autoSpaceDN w:val="0"/>
+                            <w:adjustRightInd w:val="0"/>
+                            <w:spacing w:line="360" w:lineRule="auto"/>
+                            <w:jc w:val="left"/>
+                            <w:rPr>
+                              <w:rFonts w:eastAsia="Calibri" w:cs="CorporateSPro-Light"/>
+                              <w:sz w:val="22"/>
+                              <w:szCs w:val="13"/>
+                              <w:lang w:eastAsia="de-DE"/>
+                            </w:rPr>
+                          </w:pPr>
+                        </w:p>
+                        <w:p>
+                          <w:pPr>
+                            <w:autoSpaceDE w:val="0"/>
+                            <w:autoSpaceDN w:val="0"/>
+                            <w:adjustRightInd w:val="0"/>
+                            <w:spacing w:line="360" w:lineRule="auto"/>
+                            <w:jc w:val="left"/>
+                            <w:rPr>
+                              <w:rFonts w:eastAsia="Calibri" w:cs="CorporateSPro-Demi"/>
+                              <w:b/>
+                              <w:sz w:val="22"/>
+                              <w:szCs w:val="13"/>
+                              <w:lang w:eastAsia="de-DE"/>
+                            </w:rPr>
+                          </w:pPr>
+                          <w:r>
+                            <w:rPr>
+                              <w:rFonts w:eastAsia="Calibri" w:cs="CorporateSPro-Demi"/>
+                              <w:b/>
+                              <w:sz w:val="13"/>
+                              <w:szCs w:val="13"/>
+                              <w:lang w:eastAsia="de-DE"/>
+                            </w:rPr>
+                            <w:t>Lars Wacker</w:t>
+                          </w:r>
+                        </w:p>
+                        <w:p>
+                          <w:pPr>
+                            <w:autoSpaceDE w:val="0"/>
+                            <w:autoSpaceDN w:val="0"/>
+                            <w:adjustRightInd w:val="0"/>
+                            <w:spacing w:line="360" w:lineRule="auto"/>
+                            <w:jc w:val="left"/>
+                            <w:rPr>
+                              <w:rFonts w:eastAsia="Calibri" w:cs="CorporateSPro-Light"/>
+                              <w:sz w:val="22"/>
+                              <w:szCs w:val="13"/>
+                              <w:lang w:eastAsia="de-DE"/>
+                            </w:rPr>
+                          </w:pPr>
+                          <w:r>
+                            <w:rPr>
+                              <w:rFonts w:eastAsia="Calibri" w:cs="CorporateSPro-Light"/>
+                              <w:sz w:val="13"/>
+                              <w:szCs w:val="13"/>
+                              <w:lang w:eastAsia="de-DE"/>
+                            </w:rPr>
+                            <w:t>Rechtsanwalt</w:t>
+                          </w:r>
+                        </w:p>
+                        <w:p>
+                          <w:pPr>
+                            <w:pBdr>
+                              <w:bottom w:val="single" w:sz="4" w:space="1" w:color="auto"/>
+                            </w:pBdr>
+                            <w:autoSpaceDE w:val="0"/>
+                            <w:autoSpaceDN w:val="0"/>
+                            <w:adjustRightInd w:val="0"/>
+                            <w:spacing w:line="360" w:lineRule="auto"/>
+                            <w:jc w:val="left"/>
+                            <w:rPr>
+                              <w:rFonts w:eastAsia="Calibri" w:cs="CorporateSPro-Light"/>
+                              <w:sz w:val="22"/>
+                              <w:szCs w:val="13"/>
+                              <w:lang w:eastAsia="de-DE"/>
+                            </w:rPr>
+                          </w:pPr>
+                        </w:p>
+                        <w:p>
+                          <w:pPr>
+                            <w:autoSpaceDE w:val="0"/>
+                            <w:autoSpaceDN w:val="0"/>
+                            <w:adjustRightInd w:val="0"/>
+                            <w:spacing w:line="360" w:lineRule="auto"/>
+                            <w:jc w:val="left"/>
+                            <w:rPr>
+                              <w:rFonts w:eastAsia="Calibri" w:cs="CorporateSPro-Light"/>
+                              <w:sz w:val="22"/>
+                              <w:szCs w:val="13"/>
+                              <w:lang w:eastAsia="de-DE"/>
+                            </w:rPr>
+                          </w:pPr>
+                        </w:p>
+                        <w:p>
+                          <w:pPr>
+                            <w:autoSpaceDE w:val="0"/>
+                            <w:autoSpaceDN w:val="0"/>
+                            <w:adjustRightInd w:val="0"/>
+                            <w:jc w:val="left"/>
+                            <w:rPr>
+                              <w:rFonts w:eastAsia="Calibri" w:cs="CorporateSPro-Regular"/>
+                              <w:sz w:val="22"/>
+                              <w:szCs w:val="13"/>
+                              <w:lang w:eastAsia="de-DE"/>
+                            </w:rPr>
+                            <w:spacing w:line="360" w:lineRule="auto"/>
+                          </w:pPr>
+                          <w:r>
+                            <w:rPr>
+                              <w:rFonts w:eastAsia="Calibri" w:cs="CorporateSPro-Regular"/>
+                              <w:sz w:val="13"/>
+                              <w:szCs w:val="13"/>
+                              <w:lang w:eastAsia="de-DE"/>
+                            </w:rPr>
+                            <w:t>OF COUNSEL</w:t>
+                          </w:r>
+                        </w:p>
+                        <w:p>
+                          <w:pPr>
+                            <w:autoSpaceDE w:val="0"/>
+                            <w:autoSpaceDN w:val="0"/>
+                            <w:adjustRightInd w:val="0"/>
+                            <w:spacing w:line="360" w:lineRule="auto"/>
+                            <w:jc w:val="left"/>
+                            <w:rPr>
+                              <w:rFonts w:eastAsia="Calibri" w:cs="CorporateSPro-Demi"/>
+                              <w:b/>
+                              <w:sz w:val="22"/>
+                              <w:szCs w:val="13"/>
+                              <w:lang w:eastAsia="de-DE"/>
+                            </w:rPr>
+                          </w:pPr>
+                          <w:r>
+                            <w:rPr>
+                              <w:rFonts w:eastAsia="Calibri" w:cs="CorporateSPro-Demi"/>
+                              <w:b/>
+                              <w:sz w:val="13"/>
+                              <w:szCs w:val="13"/>
+                              <w:lang w:eastAsia="de-DE"/>
+                            </w:rPr>
+                            <w:t>Justizrat Prof. Dr. Dr. Thomas B. Schmidt M.A.</w:t>
+                          </w:r>
+                        </w:p>
+                        <w:p>
+                          <w:pPr>
+                            <w:autoSpaceDE w:val="0"/>
+                            <w:autoSpaceDN w:val="0"/>
+                            <w:adjustRightInd w:val="0"/>
+                            <w:spacing w:line="360" w:lineRule="auto"/>
+                            <w:jc w:val="left"/>
+                            <w:rPr>
+                              <w:rFonts w:eastAsia="Calibri" w:cs="CorporateSPro-Light"/>
+                              <w:sz w:val="22"/>
+                              <w:szCs w:val="13"/>
+                              <w:lang w:eastAsia="de-DE"/>
+                            </w:rPr>
+                          </w:pPr>
+                          <w:r>
+                            <w:rPr>
+                              <w:rFonts w:eastAsia="Calibri" w:cs="CorporateSPro-Light"/>
+                              <w:sz w:val="13"/>
+                              <w:szCs w:val="13"/>
+                              <w:lang w:eastAsia="de-DE"/>
+                            </w:rPr>
+                            <w:t>Fachanwalt für Insolvenz- und Sanierungsrecht</w:t>
+                          </w:r>
+                        </w:p>
+                        <w:p>
+                          <w:pPr>
+                            <w:pBdr>
+                              <w:bottom w:val="single" w:sz="4" w:space="1" w:color="auto"/>
+                            </w:pBdr>
+                            <w:autoSpaceDE w:val="0"/>
+                            <w:autoSpaceDN w:val="0"/>
+                            <w:adjustRightInd w:val="0"/>
+                            <w:spacing w:line="360" w:lineRule="auto"/>
+                            <w:jc w:val="left"/>
+                            <w:rPr>
+                              <w:rFonts w:eastAsia="Calibri" w:cs="CorporateSPro-Light"/>
+                              <w:sz w:val="22"/>
+                              <w:szCs w:val="13"/>
+                              <w:lang w:eastAsia="de-DE"/>
+                            </w:rPr>
+                          </w:pPr>
+                        </w:p>
+                        <w:p>
+                          <w:pPr>
+                            <w:autoSpaceDE w:val="0"/>
+                            <w:autoSpaceDN w:val="0"/>
+                            <w:adjustRightInd w:val="0"/>
+                            <w:spacing w:line="360" w:lineRule="auto"/>
+                            <w:jc w:val="left"/>
+                            <w:rPr>
+                              <w:rFonts w:eastAsia="Calibri" w:cs="CorporateSPro-Light"/>
+                              <w:sz w:val="22"/>
+                              <w:szCs w:val="13"/>
+                              <w:lang w:eastAsia="de-DE"/>
+                            </w:rPr>
+                          </w:pPr>
+                        </w:p>
+                        <w:p>
+                          <w:pPr>
+                            <w:autoSpaceDE w:val="0"/>
+                            <w:autoSpaceDN w:val="0"/>
+                            <w:adjustRightInd w:val="0"/>
+                            <w:jc w:val="left"/>
+                            <w:rPr>
+                              <w:rFonts w:eastAsia="Calibri" w:cs="CorporateSPro-Regular"/>
+                              <w:sz w:val="22"/>
+                              <w:szCs w:val="13"/>
+                              <w:lang w:eastAsia="de-DE"/>
+                            </w:rPr>
+                            <w:spacing w:line="360" w:lineRule="auto"/>
+                          </w:pPr>
+                          <w:r>
+                            <w:rPr>
+                              <w:rFonts w:eastAsia="Calibri" w:cs="CorporateSPro-Regular"/>
+                              <w:sz w:val="13"/>
+                              <w:szCs w:val="13"/>
+                              <w:lang w:eastAsia="de-DE"/>
+                            </w:rPr>
+                            <w:t>STANDORTE</w:t>
+                          </w:r>
+                        </w:p>
+                        <w:p>
+                          <w:pPr>
+                            <w:autoSpaceDE w:val="0"/>
+                            <w:autoSpaceDN w:val="0"/>
+                            <w:adjustRightInd w:val="0"/>
+                            <w:spacing w:line="360" w:lineRule="auto"/>
+                            <w:rPr>
+                              <w:rFonts w:eastAsia="Calibri" w:cs="CorporateSPro-Demi"/>
+                              <w:sz w:val="22"/>
+                              <w:szCs w:val="13"/>
+                              <w:lang w:eastAsia="de-DE"/>
+                            </w:rPr>
+                          </w:pPr>
+                          <w:r>
+                            <w:rPr>
+                              <w:rFonts w:eastAsia="Calibri" w:cs="CorporateSPro-Demi"/>
+                              <w:sz w:val="13"/>
+                              <w:szCs w:val="13"/>
+                              <w:lang w:eastAsia="de-DE"/>
+                            </w:rPr>
+                            <w:t>Trier</w:t>
+                          </w:r>
+                          <w:r>
+                            <w:rPr>
+                              <w:rFonts w:eastAsia="Calibri" w:cs="CorporateSPro-Demi"/>
+                              <w:sz w:val="13"/>
+                              <w:szCs w:val="13"/>
+                              <w:lang w:eastAsia="de-DE"/>
+                            </w:rPr>
+                            <w:tab/>
+                          </w:r>
+                          <w:r>
+                            <w:rPr>
+                              <w:rFonts w:eastAsia="Calibri" w:cs="CorporateSPro-Demi"/>
+                              <w:sz w:val="13"/>
+                              <w:szCs w:val="13"/>
+                              <w:lang w:eastAsia="de-DE"/>
+                            </w:rPr>
+                            <w:tab/>
+                            <w:t>Bad Kreuznach</w:t>
+                          </w:r>
+                        </w:p>
+                        <w:p>
+                          <w:pPr>
+                            <w:autoSpaceDE w:val="0"/>
+                            <w:autoSpaceDN w:val="0"/>
+                            <w:adjustRightInd w:val="0"/>
+                            <w:spacing w:line="360" w:lineRule="auto"/>
+                            <w:rPr>
+                              <w:rFonts w:eastAsia="Calibri" w:cs="CorporateSPro-Demi"/>
+                              <w:sz w:val="22"/>
+                              <w:szCs w:val="13"/>
+                              <w:lang w:eastAsia="de-DE"/>
+                            </w:rPr>
+                          </w:pPr>
+                          <w:r>
+                            <w:rPr>
+                              <w:rFonts w:eastAsia="Calibri" w:cs="CorporateSPro-Demi"/>
+                              <w:sz w:val="13"/>
+                              <w:szCs w:val="13"/>
+                              <w:lang w:eastAsia="de-DE"/>
+                            </w:rPr>
+                            <w:t>Frankfurt am Main</w:t>
+                          </w:r>
+                          <w:r>
+                            <w:rPr>
+                              <w:rFonts w:eastAsia="Calibri" w:cs="CorporateSPro-Demi"/>
+                              <w:sz w:val="13"/>
+                              <w:szCs w:val="13"/>
+                              <w:lang w:eastAsia="de-DE"/>
+                            </w:rPr>
+                            <w:tab/>
+                            <w:t>Zell/Mosel</w:t>
+                          </w:r>
+                        </w:p>
+                        <w:p>
+                          <w:pPr>
+                            <w:autoSpaceDE w:val="0"/>
+                            <w:autoSpaceDN w:val="0"/>
+                            <w:adjustRightInd w:val="0"/>
+                            <w:spacing w:line="360" w:lineRule="auto"/>
+                            <w:rPr>
+                              <w:rFonts w:eastAsia="Calibri" w:cs="CorporateSPro-Demi"/>
+                              <w:sz w:val="22"/>
+                              <w:szCs w:val="13"/>
+                              <w:lang w:eastAsia="de-DE"/>
+                            </w:rPr>
+                          </w:pPr>
+                          <w:r>
+                            <w:rPr>
+                              <w:rFonts w:eastAsia="Calibri" w:cs="CorporateSPro-Demi"/>
+                              <w:sz w:val="13"/>
+                              <w:szCs w:val="13"/>
+                              <w:lang w:eastAsia="de-DE"/>
+                            </w:rPr>
+                            <w:t>Idar-Oberstein</w:t>
+                          </w:r>
+                          <w:r>
+                            <w:rPr>
+                              <w:rFonts w:eastAsia="Calibri" w:cs="CorporateSPro-Demi"/>
+                              <w:sz w:val="13"/>
+                              <w:szCs w:val="13"/>
+                              <w:lang w:eastAsia="de-DE"/>
+                            </w:rPr>
+                            <w:tab/>
+                            <w:t>Koblenz</w:t>
+                          </w:r>
+                        </w:p>
+                        <w:p>
+                          <w:pPr>
+                            <w:autoSpaceDE w:val="0"/>
+                            <w:autoSpaceDN w:val="0"/>
+                            <w:adjustRightInd w:val="0"/>
+                            <w:spacing w:line="360" w:lineRule="auto"/>
+                            <w:rPr>
+                              <w:rFonts w:eastAsia="Calibri" w:cs="CorporateSPro-Demi"/>
+                              <w:sz w:val="22"/>
+                              <w:szCs w:val="13"/>
+                              <w:lang w:eastAsia="de-DE"/>
+                            </w:rPr>
+                          </w:pPr>
+                          <w:r>
+                            <w:rPr>
+                              <w:rFonts w:eastAsia="Calibri" w:cs="CorporateSPro-Demi"/>
+                              <w:sz w:val="13"/>
+                              <w:szCs w:val="13"/>
+                              <w:lang w:eastAsia="de-DE"/>
+                            </w:rPr>
+                            <w:t>Langgöns</w:t>
+                          </w:r>
+                          <w:r>
+                            <w:rPr>
+                              <w:rFonts w:eastAsia="Calibri" w:cs="CorporateSPro-Demi"/>
+                              <w:sz w:val="13"/>
+                              <w:szCs w:val="13"/>
+                              <w:lang w:eastAsia="de-DE"/>
+                            </w:rPr>
+                            <w:tab/>
+                          </w:r>
+                          <w:r>
+                            <w:rPr>
+                              <w:rFonts w:eastAsia="Calibri" w:cs="CorporateSPro-Demi"/>
+                              <w:sz w:val="13"/>
+                              <w:szCs w:val="13"/>
+                              <w:lang w:eastAsia="de-DE"/>
+                            </w:rPr>
+                            <w:tab/>
+                            <w:t>Limburg/Lahn</w:t>
+                          </w:r>
+                        </w:p>
+                        <w:p>
+                          <w:pPr>
+                            <w:autoSpaceDE w:val="0"/>
+                            <w:autoSpaceDN w:val="0"/>
+                            <w:adjustRightInd w:val="0"/>
+                            <w:spacing w:line="360" w:lineRule="auto"/>
+                            <w:rPr>
+                              <w:rFonts w:eastAsia="Calibri" w:cs="CorporateSPro-Demi"/>
+                              <w:sz w:val="22"/>
+                              <w:szCs w:val="9"/>
+                              <w:lang w:eastAsia="de-DE"/>
+                            </w:rPr>
+                          </w:pPr>
+                          <w:r>
+                            <w:rPr>
+                              <w:rFonts w:eastAsia="Calibri" w:cs="CorporateSPro-Demi"/>
+                              <w:sz w:val="13"/>
+                              <w:szCs w:val="13"/>
+                              <w:lang w:eastAsia="de-DE"/>
+                            </w:rPr>
+                            <w:t>Mainz</w:t>
+                          </w:r>
+                          <w:r>
+                            <w:rPr>
+                              <w:rFonts w:eastAsia="Calibri" w:cs="CorporateSPro-Demi"/>
+                              <w:sz w:val="13"/>
+                              <w:szCs w:val="13"/>
+                              <w:lang w:eastAsia="de-DE"/>
+                            </w:rPr>
+                            <w:tab/>
+                          </w:r>
+                          <w:r>
+                            <w:rPr>
+                              <w:rFonts w:eastAsia="Calibri" w:cs="CorporateSPro-Demi"/>
+                              <w:sz w:val="13"/>
+                              <w:szCs w:val="13"/>
+                              <w:lang w:eastAsia="de-DE"/>
+                            </w:rPr>
+                            <w:tab/>
+                            <w:t>Wiesbaden</w:t>
+                          </w:r>
+                          <w:bookmarkEnd w:id="10"/>
+                          <w:bookmarkEnd w:id="11"/>
+                          <w:bookmarkEnd w:id="12"/>
+                          <w:bookmarkEnd w:id="13"/>
+                          <w:bookmarkEnd w:id="14"/>
+                          <w:bookmarkEnd w:id="15"/>
+                          <w:bookmarkEnd w:id="16"/>
+                          <w:bookmarkEnd w:id="17"/>
+                          <w:bookmarkEnd w:id="18"/>
+                          <w:bookmarkEnd w:id="19"/>
+                        </w:p>
+                      </w:txbxContent>
+                    </v:textbox>
+                    <w10:wrap type="square" anchory="margin"/>
+                  </v:shape>
+                </w:pict>
+              </mc:Fallback>
+            </mc:AlternateContent>
+          </w:r>
+          <w:r>
+            <w:rPr>
+              <w:b/>
+            </w:rPr>
+            <w:t xml:space="preserve">per </w:t>
+          </w:r>
+          <w:proofErr w:type="spellStart"/>
+          <w:r>
+            <w:rPr>
+              <w:b/>
+            </w:rPr>
+            <w:t>beA</w:t>
+          </w:r>
+          <w:proofErr w:type="spellEnd"/>
+        </w:p>
+        <w:p>
+          <w:pPr>
+            <w:jc w:val="left"/>
+            <w:rPr>
+              <w:b/>
+              <w:sz w:val="22"/>
+            </w:rPr>
+            <w:spacing w:line="360" w:lineRule="auto"/>
+          </w:pPr>
+          <w:r>
+            <w:rPr>
+              <w:noProof/>
+            </w:rPr>
+            <w:drawing>
+              <wp:anchor distT="0" distB="0" distL="114300" distR="114300" simplePos="0" relativeHeight="251661312" behindDoc="0" locked="1" layoutInCell="1" allowOverlap="1" wp14:anchorId="6AABFA21" wp14:editId="412D2ABC">
+                <wp:simplePos x="0" y="0"/>
+                <wp:positionH relativeFrom="column">
+                  <wp:posOffset>5670550</wp:posOffset>
+                </wp:positionH>
+                <wp:positionV relativeFrom="page">
+                  <wp:posOffset>4544695</wp:posOffset>
+                </wp:positionV>
+                <wp:extent cx="427355" cy="597535"/>
+                <wp:effectExtent l="0" t="0" r="0" b="0"/>
+                <wp:wrapNone/>
+                <wp:docPr id="2" name="Grafik 1" descr="Kein Aktenzeichen Audit _ QMISO- Siegel  bis 2025"/>
+                <wp:cNvGraphicFramePr>
+                  <a:graphicFrameLocks xmlns:a="http://schemas.openxmlformats.org/drawingml/2006/main" noChangeAspect="1"/>
+                </wp:cNvGraphicFramePr>
+                <a:graphic xmlns:a="http://schemas.openxmlformats.org/drawingml/2006/main">
+                  <a:graphicData uri="http://schemas.openxmlformats.org/drawingml/2006/picture">
+                    <pic:pic xmlns:pic="http://schemas.openxmlformats.org/drawingml/2006/picture">
+                      <pic:nvPicPr>
+                        <pic:cNvPr id="1" name="Grafik 1" descr="Kein Aktenzeichen Audit _ QMISO- Siegel  bis 2025"/>
+                        <pic:cNvPicPr>
+                          <a:picLocks noChangeAspect="1" noChangeArrowheads="1"/>
+                        </pic:cNvPicPr>
+                      </pic:nvPicPr>
+                      <pic:blipFill>
+                        <a:blip r:embed="rId500" cstate="print">
+                          <a:extLst>
+                            <a:ext uri="{28A0092B-C50C-407E-A947-70E740481C1C}">
+                              <a14:useLocalDpi xmlns:a14="http://schemas.microsoft.com/office/drawing/2010/main" val="0"/>
+                            </a:ext>
+                          </a:extLst>
+                        </a:blip>
+                        <a:srcRect/>
+                        <a:stretch>
+                          <a:fillRect/>
+                        </a:stretch>
+                      </pic:blipFill>
+                      <pic:spPr bwMode="auto">
+                        <a:xfrm>
+                          <a:off x="0" y="0"/>
+                          <a:ext cx="427355" cy="597535"/>
+                        </a:xfrm>
+                        <a:prstGeom prst="rect">
+                          <a:avLst/>
+                        </a:prstGeom>
+                        <a:noFill/>
+                      </pic:spPr>
+                    </pic:pic>
+                  </a:graphicData>
+                </a:graphic>
+                <wp14:sizeRelH relativeFrom="margin">
+                  <wp14:pctWidth>0</wp14:pctWidth>
+                </wp14:sizeRelH>
+                <wp14:sizeRelV relativeFrom="margin">
+                  <wp14:pctHeight>0</wp14:pctHeight>
+                </wp14:sizeRelV>
+              </wp:anchor>
+            </w:drawing>
+          </w:r>
+          <w:r>
+            <w:rPr>
+              <w:noProof/>
+            </w:rPr>
+            <w:drawing>
+              <wp:anchor distT="0" distB="0" distL="114300" distR="114300" simplePos="0" relativeHeight="251660288" behindDoc="0" locked="1" layoutInCell="1" allowOverlap="1" wp14:anchorId="58E7BFEE" wp14:editId="1FD6858E">
+                <wp:simplePos x="0" y="0"/>
+                <wp:positionH relativeFrom="column">
+                  <wp:posOffset>4864735</wp:posOffset>
+                </wp:positionH>
+                <wp:positionV relativeFrom="page">
+                  <wp:posOffset>4545965</wp:posOffset>
+                </wp:positionV>
+                <wp:extent cx="579120" cy="597535"/>
+                <wp:effectExtent l="0" t="0" r="0" b="0"/>
+                <wp:wrapNone/>
+                <wp:docPr id="3" name="Grafik 4"/>
+                <wp:cNvGraphicFramePr>
+                  <a:graphicFrameLocks xmlns:a="http://schemas.openxmlformats.org/drawingml/2006/main" noChangeAspect="1"/>
+                </wp:cNvGraphicFramePr>
+                <a:graphic xmlns:a="http://schemas.openxmlformats.org/drawingml/2006/main">
+                  <a:graphicData uri="http://schemas.openxmlformats.org/drawingml/2006/picture">
+                    <pic:pic xmlns:pic="http://schemas.openxmlformats.org/drawingml/2006/picture">
+                      <pic:nvPicPr>
+                        <pic:cNvPr id="2" name="Grafik 4"/>
+                        <pic:cNvPicPr>
+                          <a:picLocks noChangeAspect="1" noChangeArrowheads="1"/>
+                        </pic:cNvPicPr>
+                      </pic:nvPicPr>
+                      <pic:blipFill>
+                        <a:blip r:embed="rId501">
+                          <a:extLst>
+                            <a:ext uri="{28A0092B-C50C-407E-A947-70E740481C1C}">
+                              <a14:useLocalDpi xmlns:a14="http://schemas.microsoft.com/office/drawing/2010/main" val="0"/>
+                            </a:ext>
+                          </a:extLst>
+                        </a:blip>
+                        <a:srcRect/>
+                        <a:stretch>
+                          <a:fillRect/>
+                        </a:stretch>
+                      </pic:blipFill>
+                      <pic:spPr bwMode="auto">
+                        <a:xfrm>
+                          <a:off x="0" y="0"/>
+                          <a:ext cx="579120" cy="597535"/>
+                        </a:xfrm>
+                        <a:prstGeom prst="rect">
+                          <a:avLst/>
+                        </a:prstGeom>
+                        <a:noFill/>
+                      </pic:spPr>
+                    </pic:pic>
+                  </a:graphicData>
+                </a:graphic>
+                <wp14:sizeRelH relativeFrom="page">
+                  <wp14:pctWidth>0</wp14:pctWidth>
+                </wp14:sizeRelH>
+                <wp14:sizeRelV relativeFrom="page">
+                  <wp14:pctHeight>0</wp14:pctHeight>
+                </wp14:sizeRelV>
+              </wp:anchor>
+            </w:drawing>
+          </w:r>
+        </w:p>
+        <w:p>
+          <w:pPr>
+            <w:jc w:val="left"/>
+            <w:rPr>
+              <w:b/>
+              <w:sz w:val="22"/>
+            </w:rPr>
+            <w:spacing w:line="360" w:lineRule="auto"/>
+          </w:pPr>
+        </w:p>
+        <w:p>
+          <w:pPr>
+            <w:spacing w:line="360" w:lineRule="auto"/>
+            <w:rPr>
+              <w:sz w:val="22"/>
+            </w:rPr>
+          </w:pPr>
+          <w:proofErr w:type="spellStart"/>
+          <w:r>
+            <w:t>FELD_Briefkopf_Ort</w:t>
+          </w:r>
+          <w:proofErr w:type="spellEnd"/>
+          <w:r>
+            <w:t xml:space="preserve">, den </w:t>
+          </w:r>
+          <w:proofErr w:type="spellStart"/>
+          <w:r>
+            <w:t>FELD_Briefkopf_Datum</w:t>
+          </w:r>
+          <w:proofErr w:type="spellEnd"/>
+        </w:p>
+        <w:p>
+          <w:pPr>
+            <w:spacing w:line="360" w:lineRule="auto"/>
+            <w:rPr>
+              <w:sz w:val="22"/>
+            </w:rPr>
+          </w:pPr>
+        </w:p>
+        <w:p>
+          <w:pPr>
+            <w:spacing w:line="360" w:lineRule="auto"/>
+            <w:rPr>
+              <w:sz w:val="22"/>
+            </w:rPr>
+          </w:pPr>
+        </w:p>
+      </w:sdtContent>
+    </w:sdt>
     <w:p>
       <w:pPr>
         <w:jc w:val="both"/>
@@ -303,13 +3823,604 @@
       </w:r>
     </w:p>
     <w:sectPr>
+      <w:headerReference w:type="first" r:id="rId100"/>
+      <w:headerReference w:type="default" r:id="rId102"/>
+      <w:footerReference w:type="first" r:id="rId101"/>
+      <w:footerReference w:type="default" r:id="rId103"/>
       <w:pgSz w:w="12240" w:h="15840"/>
       <w:pgMar w:top="1440" w:right="1800" w:bottom="1440" w:left="1800" w:header="720" w:footer="720" w:gutter="0"/>
       <w:cols w:space="720"/>
       <w:docGrid w:linePitch="360"/>
+      <w:titlePg/>
     </w:sectPr>
   </w:body>
 </w:document>
+</file>
+
+<file path=word/footer1.xml><?xml version="1.0" encoding="utf-8"?>
+<w:ftr xmlns:wpc="http://schemas.microsoft.com/office/word/2010/wordprocessingCanvas" xmlns:cx="http://schemas.microsoft.com/office/drawing/2014/chartex" xmlns:cx1="http://schemas.microsoft.com/office/drawing/2015/9/8/chartex" xmlns:cx2="http://schemas.microsoft.com/office/drawing/2015/10/21/chartex" xmlns:cx3="http://schemas.microsoft.com/office/drawing/2016/5/9/chartex" xmlns:cx4="http://schemas.microsoft.com/office/drawing/2016/5/10/chartex" xmlns:cx5="http://schemas.microsoft.com/office/drawing/2016/5/11/chartex" xmlns:cx6="http://schemas.microsoft.com/office/drawing/2016/5/12/chartex" xmlns:cx7="http://schemas.microsoft.com/office/drawing/2016/5/13/chartex" xmlns:cx8="http://schemas.microsoft.com/office/drawing/2016/5/14/chartex" xmlns:mc="http://schemas.openxmlformats.org/markup-compatibility/2006" xmlns:aink="http://schemas.microsoft.com/office/drawing/2016/ink" xmlns:am3d="http://schemas.microsoft.com/office/drawing/2017/model3d" xmlns:o="urn:schemas-microsoft-com:office:office" xmlns:oel="http://schemas.microsoft.com/office/2019/extlst" xmlns:r="http://schemas.openxmlformats.org/officeDocument/2006/relationships" xmlns:m="http://schemas.openxmlformats.org/officeDocument/2006/math" xmlns:v="urn:schemas-microsoft-com:vml" xmlns:wp14="http://schemas.microsoft.com/office/word/2010/wordprocessingDrawing" xmlns:wp="http://schemas.openxmlformats.org/drawingml/2006/wordprocessingDrawing" xmlns:w10="urn:schemas-microsoft-com:office:word" xmlns:w="http://schemas.openxmlformats.org/wordprocessingml/2006/main" xmlns:w14="http://schemas.microsoft.com/office/word/2010/wordml" xmlns:w15="http://schemas.microsoft.com/office/word/2012/wordml" xmlns:w16cex="http://schemas.microsoft.com/office/word/2018/wordml/cex" xmlns:w16cid="http://schemas.microsoft.com/office/word/2016/wordml/cid" xmlns:w16="http://schemas.microsoft.com/office/word/2018/wordml" xmlns:w16du="http://schemas.microsoft.com/office/word/2023/wordml/word16du" xmlns:w16sdtdh="http://schemas.microsoft.com/office/word/2020/wordml/sdtdatahash" xmlns:w16sdtfl="http://schemas.microsoft.com/office/word/2024/wordml/sdtformatlock" xmlns:w16se="http://schemas.microsoft.com/office/word/2015/wordml/symex" xmlns:wpg="http://schemas.microsoft.com/office/word/2010/wordprocessingGroup" xmlns:wpi="http://schemas.microsoft.com/office/word/2010/wordprocessingInk" xmlns:wne="http://schemas.microsoft.com/office/word/2006/wordml" xmlns:wps="http://schemas.microsoft.com/office/word/2010/wordprocessingShape" mc:Ignorable="w14 w15 w16se w16cid w16 w16cex w16sdtdh w16sdtfl w16du wp14">
+  <w:p>
+    <w:pPr>
+      <w:pStyle w:val="Footer"/>
+      <w:jc w:val="center"/>
+      <w:rPr>
+        <w:rFonts w:eastAsia="Calibri" w:cs="Avenir-Medium"/>
+        <w:b/>
+        <w:bCs/>
+        <w:color w:val="000000"/>
+        <w:sz w:val="16"/>
+        <w:szCs w:val="14"/>
+      </w:rPr>
+    </w:pPr>
+    <w:r>
+      <w:rPr>
+        <w:rFonts w:eastAsia="Calibri" w:cs="Avenir-Medium"/>
+        <w:color w:val="000000"/>
+        <w:sz w:val="16"/>
+        <w:szCs w:val="14"/>
+      </w:rPr>
+      <w:t xml:space="preserve">Seite </w:t>
+    </w:r>
+    <w:r>
+      <w:rPr>
+        <w:rFonts w:eastAsia="Calibri" w:cs="Avenir-Medium"/>
+        <w:b/>
+        <w:bCs/>
+        <w:color w:val="000000"/>
+        <w:sz w:val="16"/>
+        <w:szCs w:val="14"/>
+      </w:rPr>
+      <w:fldChar w:fldCharType="begin"/>
+    </w:r>
+    <w:r>
+      <w:rPr>
+        <w:rFonts w:eastAsia="Calibri" w:cs="Avenir-Medium"/>
+        <w:b/>
+        <w:bCs/>
+        <w:color w:val="000000"/>
+        <w:sz w:val="16"/>
+        <w:szCs w:val="14"/>
+      </w:rPr>
+      <w:instrText>PAGE  \* Arabic  \* MERGEFORMAT</w:instrText>
+    </w:r>
+    <w:r>
+      <w:rPr>
+        <w:rFonts w:eastAsia="Calibri" w:cs="Avenir-Medium"/>
+        <w:b/>
+        <w:bCs/>
+        <w:color w:val="000000"/>
+        <w:sz w:val="16"/>
+        <w:szCs w:val="14"/>
+      </w:rPr>
+      <w:fldChar w:fldCharType="separate"/>
+    </w:r>
+    <w:r>
+      <w:rPr>
+        <w:rFonts w:eastAsia="Calibri" w:cs="Avenir-Medium"/>
+        <w:b/>
+        <w:bCs/>
+        <w:noProof/>
+        <w:color w:val="000000"/>
+        <w:sz w:val="16"/>
+        <w:szCs w:val="14"/>
+      </w:rPr>
+      <w:t>2</w:t>
+    </w:r>
+    <w:r>
+      <w:rPr>
+        <w:rFonts w:eastAsia="Calibri" w:cs="Avenir-Medium"/>
+        <w:b/>
+        <w:bCs/>
+        <w:color w:val="000000"/>
+        <w:sz w:val="16"/>
+        <w:szCs w:val="14"/>
+      </w:rPr>
+      <w:fldChar w:fldCharType="end"/>
+    </w:r>
+    <w:r>
+      <w:rPr>
+        <w:rFonts w:eastAsia="Calibri" w:cs="Avenir-Medium"/>
+        <w:color w:val="000000"/>
+        <w:sz w:val="16"/>
+        <w:szCs w:val="14"/>
+      </w:rPr>
+      <w:t xml:space="preserve"> von </w:t>
+    </w:r>
+    <w:r>
+      <w:rPr>
+        <w:rFonts w:eastAsia="Calibri" w:cs="Avenir-Medium"/>
+        <w:b/>
+        <w:bCs/>
+        <w:color w:val="000000"/>
+        <w:sz w:val="16"/>
+        <w:szCs w:val="14"/>
+      </w:rPr>
+      <w:fldChar w:fldCharType="begin"/>
+    </w:r>
+    <w:r>
+      <w:rPr>
+        <w:rFonts w:eastAsia="Calibri" w:cs="Avenir-Medium"/>
+        <w:b/>
+        <w:bCs/>
+        <w:color w:val="000000"/>
+        <w:sz w:val="16"/>
+        <w:szCs w:val="14"/>
+      </w:rPr>
+      <w:instrText>NUMPAGES  \* Arabic  \* MERGEFORMAT</w:instrText>
+    </w:r>
+    <w:r>
+      <w:rPr>
+        <w:rFonts w:eastAsia="Calibri" w:cs="Avenir-Medium"/>
+        <w:b/>
+        <w:bCs/>
+        <w:color w:val="000000"/>
+        <w:sz w:val="16"/>
+        <w:szCs w:val="14"/>
+      </w:rPr>
+      <w:fldChar w:fldCharType="separate"/>
+    </w:r>
+    <w:r>
+      <w:rPr>
+        <w:rFonts w:eastAsia="Calibri" w:cs="Avenir-Medium"/>
+        <w:b/>
+        <w:bCs/>
+        <w:noProof/>
+        <w:color w:val="000000"/>
+        <w:sz w:val="16"/>
+        <w:szCs w:val="14"/>
+      </w:rPr>
+      <w:t>2</w:t>
+    </w:r>
+    <w:r>
+      <w:rPr>
+        <w:rFonts w:eastAsia="Calibri" w:cs="Avenir-Medium"/>
+        <w:b/>
+        <w:bCs/>
+        <w:color w:val="000000"/>
+        <w:sz w:val="16"/>
+        <w:szCs w:val="14"/>
+      </w:rPr>
+      <w:fldChar w:fldCharType="end"/>
+    </w:r>
+  </w:p>
+  <w:p>
+    <w:pPr>
+      <w:pStyle w:val="Footer"/>
+    </w:pPr>
+    <w:r>
+      <w:rPr>
+        <w:noProof/>
+        <w:lang w:eastAsia="de-DE"/>
+      </w:rPr>
+      <w:drawing>
+        <wp:anchor distT="0" distB="0" distL="114300" distR="114300" simplePos="0" relativeHeight="251663872" behindDoc="1" locked="1" layoutInCell="1" allowOverlap="1" wp14:anchorId="7B9D598B" wp14:editId="5E811996">
+          <wp:simplePos x="0" y="0"/>
+          <wp:positionH relativeFrom="leftMargin">
+            <wp:posOffset>-156210</wp:posOffset>
+          </wp:positionH>
+          <wp:positionV relativeFrom="margin">
+            <wp:posOffset>9455785</wp:posOffset>
+          </wp:positionV>
+          <wp:extent cx="7253605" cy="341630"/>
+          <wp:effectExtent l="0" t="0" r="0" b="1270"/>
+          <wp:wrapNone/>
+          <wp:docPr id="8" name="Grafik 1"/>
+          <wp:cNvGraphicFramePr>
+            <a:graphicFrameLocks xmlns:a="http://schemas.openxmlformats.org/drawingml/2006/main" noChangeAspect="1"/>
+          </wp:cNvGraphicFramePr>
+          <a:graphic xmlns:a="http://schemas.openxmlformats.org/drawingml/2006/main">
+            <a:graphicData uri="http://schemas.openxmlformats.org/drawingml/2006/picture">
+              <pic:pic xmlns:pic="http://schemas.openxmlformats.org/drawingml/2006/picture">
+                <pic:nvPicPr>
+                  <pic:cNvPr id="6" name=""/>
+                  <pic:cNvPicPr/>
+                </pic:nvPicPr>
+                <pic:blipFill>
+                  <a:blip r:embed="rId1"/>
+                  <a:stretch>
+                    <a:fillRect/>
+                  </a:stretch>
+                </pic:blipFill>
+                <pic:spPr>
+                  <a:xfrm>
+                    <a:off x="0" y="0"/>
+                    <a:ext cx="7253605" cy="341630"/>
+                  </a:xfrm>
+                  <a:prstGeom prst="rect">
+                    <a:avLst/>
+                  </a:prstGeom>
+                </pic:spPr>
+              </pic:pic>
+            </a:graphicData>
+          </a:graphic>
+          <wp14:sizeRelH relativeFrom="margin">
+            <wp14:pctWidth>0</wp14:pctWidth>
+          </wp14:sizeRelH>
+          <wp14:sizeRelV relativeFrom="margin">
+            <wp14:pctHeight>0</wp14:pctHeight>
+          </wp14:sizeRelV>
+        </wp:anchor>
+      </w:drawing>
+    </w:r>
+  </w:p>
+</w:ftr>
+</file>
+
+<file path=word/footer2.xml><?xml version="1.0" encoding="utf-8"?>
+<w:ftr xmlns:wpc="http://schemas.microsoft.com/office/word/2010/wordprocessingCanvas" xmlns:cx="http://schemas.microsoft.com/office/drawing/2014/chartex" xmlns:cx1="http://schemas.microsoft.com/office/drawing/2015/9/8/chartex" xmlns:cx2="http://schemas.microsoft.com/office/drawing/2015/10/21/chartex" xmlns:cx3="http://schemas.microsoft.com/office/drawing/2016/5/9/chartex" xmlns:cx4="http://schemas.microsoft.com/office/drawing/2016/5/10/chartex" xmlns:cx5="http://schemas.microsoft.com/office/drawing/2016/5/11/chartex" xmlns:cx6="http://schemas.microsoft.com/office/drawing/2016/5/12/chartex" xmlns:cx7="http://schemas.microsoft.com/office/drawing/2016/5/13/chartex" xmlns:cx8="http://schemas.microsoft.com/office/drawing/2016/5/14/chartex" xmlns:mc="http://schemas.openxmlformats.org/markup-compatibility/2006" xmlns:aink="http://schemas.microsoft.com/office/drawing/2016/ink" xmlns:am3d="http://schemas.microsoft.com/office/drawing/2017/model3d" xmlns:o="urn:schemas-microsoft-com:office:office" xmlns:oel="http://schemas.microsoft.com/office/2019/extlst" xmlns:r="http://schemas.openxmlformats.org/officeDocument/2006/relationships" xmlns:m="http://schemas.openxmlformats.org/officeDocument/2006/math" xmlns:v="urn:schemas-microsoft-com:vml" xmlns:wp14="http://schemas.microsoft.com/office/word/2010/wordprocessingDrawing" xmlns:wp="http://schemas.openxmlformats.org/drawingml/2006/wordprocessingDrawing" xmlns:w10="urn:schemas-microsoft-com:office:word" xmlns:w="http://schemas.openxmlformats.org/wordprocessingml/2006/main" xmlns:w14="http://schemas.microsoft.com/office/word/2010/wordml" xmlns:w15="http://schemas.microsoft.com/office/word/2012/wordml" xmlns:w16cex="http://schemas.microsoft.com/office/word/2018/wordml/cex" xmlns:w16cid="http://schemas.microsoft.com/office/word/2016/wordml/cid" xmlns:w16="http://schemas.microsoft.com/office/word/2018/wordml" xmlns:w16du="http://schemas.microsoft.com/office/word/2023/wordml/word16du" xmlns:w16sdtdh="http://schemas.microsoft.com/office/word/2020/wordml/sdtdatahash" xmlns:w16sdtfl="http://schemas.microsoft.com/office/word/2024/wordml/sdtformatlock" xmlns:w16se="http://schemas.microsoft.com/office/word/2015/wordml/symex" xmlns:wpg="http://schemas.microsoft.com/office/word/2010/wordprocessingGroup" xmlns:wpi="http://schemas.microsoft.com/office/word/2010/wordprocessingInk" xmlns:wne="http://schemas.microsoft.com/office/word/2006/wordml" xmlns:wps="http://schemas.microsoft.com/office/word/2010/wordprocessingShape" mc:Ignorable="w14 w15 w16se w16cid w16 w16cex w16sdtdh w16sdtfl w16du wp14">
+  <w:p>
+    <w:pPr>
+      <w:pStyle w:val="Footer"/>
+    </w:pPr>
+    <w:r>
+      <w:rPr>
+        <w:noProof/>
+        <w:lang w:eastAsia="de-DE"/>
+      </w:rPr>
+      <w:drawing>
+        <wp:anchor distT="0" distB="0" distL="114300" distR="114300" simplePos="0" relativeHeight="251665920" behindDoc="1" locked="1" layoutInCell="1" allowOverlap="1" wp14:anchorId="3256D2D6" wp14:editId="47E32985">
+          <wp:simplePos x="0" y="0"/>
+          <wp:positionH relativeFrom="leftMargin">
+            <wp:posOffset>-148590</wp:posOffset>
+          </wp:positionH>
+          <wp:positionV relativeFrom="margin">
+            <wp:posOffset>9448165</wp:posOffset>
+          </wp:positionV>
+          <wp:extent cx="7253605" cy="341630"/>
+          <wp:effectExtent l="0" t="0" r="0" b="1270"/>
+          <wp:wrapNone/>
+          <wp:docPr id="5" name="Grafik 7"/>
+          <wp:cNvGraphicFramePr>
+            <a:graphicFrameLocks xmlns:a="http://schemas.openxmlformats.org/drawingml/2006/main" noChangeAspect="1"/>
+          </wp:cNvGraphicFramePr>
+          <a:graphic xmlns:a="http://schemas.openxmlformats.org/drawingml/2006/main">
+            <a:graphicData uri="http://schemas.openxmlformats.org/drawingml/2006/picture">
+              <pic:pic xmlns:pic="http://schemas.openxmlformats.org/drawingml/2006/picture">
+                <pic:nvPicPr>
+                  <pic:cNvPr id="4" name=""/>
+                  <pic:cNvPicPr/>
+                </pic:nvPicPr>
+                <pic:blipFill>
+                  <a:blip r:embed="rId1"/>
+                  <a:stretch>
+                    <a:fillRect/>
+                  </a:stretch>
+                </pic:blipFill>
+                <pic:spPr>
+                  <a:xfrm>
+                    <a:off x="0" y="0"/>
+                    <a:ext cx="7253605" cy="341630"/>
+                  </a:xfrm>
+                  <a:prstGeom prst="rect">
+                    <a:avLst/>
+                  </a:prstGeom>
+                </pic:spPr>
+              </pic:pic>
+            </a:graphicData>
+          </a:graphic>
+          <wp14:sizeRelH relativeFrom="margin">
+            <wp14:pctWidth>0</wp14:pctWidth>
+          </wp14:sizeRelH>
+          <wp14:sizeRelV relativeFrom="margin">
+            <wp14:pctHeight>0</wp14:pctHeight>
+          </wp14:sizeRelV>
+        </wp:anchor>
+      </w:drawing>
+    </w:r>
+  </w:p>
+</w:ftr>
+</file>
+
+<file path=word/header1.xml><?xml version="1.0" encoding="utf-8"?>
+<w:hdr xmlns:wpc="http://schemas.microsoft.com/office/word/2010/wordprocessingCanvas" xmlns:cx="http://schemas.microsoft.com/office/drawing/2014/chartex" xmlns:cx1="http://schemas.microsoft.com/office/drawing/2015/9/8/chartex" xmlns:cx2="http://schemas.microsoft.com/office/drawing/2015/10/21/chartex" xmlns:cx3="http://schemas.microsoft.com/office/drawing/2016/5/9/chartex" xmlns:cx4="http://schemas.microsoft.com/office/drawing/2016/5/10/chartex" xmlns:cx5="http://schemas.microsoft.com/office/drawing/2016/5/11/chartex" xmlns:cx6="http://schemas.microsoft.com/office/drawing/2016/5/12/chartex" xmlns:cx7="http://schemas.microsoft.com/office/drawing/2016/5/13/chartex" xmlns:cx8="http://schemas.microsoft.com/office/drawing/2016/5/14/chartex" xmlns:mc="http://schemas.openxmlformats.org/markup-compatibility/2006" xmlns:aink="http://schemas.microsoft.com/office/drawing/2016/ink" xmlns:am3d="http://schemas.microsoft.com/office/drawing/2017/model3d" xmlns:o="urn:schemas-microsoft-com:office:office" xmlns:oel="http://schemas.microsoft.com/office/2019/extlst" xmlns:r="http://schemas.openxmlformats.org/officeDocument/2006/relationships" xmlns:m="http://schemas.openxmlformats.org/officeDocument/2006/math" xmlns:v="urn:schemas-microsoft-com:vml" xmlns:wp14="http://schemas.microsoft.com/office/word/2010/wordprocessingDrawing" xmlns:wp="http://schemas.openxmlformats.org/drawingml/2006/wordprocessingDrawing" xmlns:w10="urn:schemas-microsoft-com:office:word" xmlns:w="http://schemas.openxmlformats.org/wordprocessingml/2006/main" xmlns:w14="http://schemas.microsoft.com/office/word/2010/wordml" xmlns:w15="http://schemas.microsoft.com/office/word/2012/wordml" xmlns:w16cex="http://schemas.microsoft.com/office/word/2018/wordml/cex" xmlns:w16cid="http://schemas.microsoft.com/office/word/2016/wordml/cid" xmlns:w16="http://schemas.microsoft.com/office/word/2018/wordml" xmlns:w16du="http://schemas.microsoft.com/office/word/2023/wordml/word16du" xmlns:w16sdtdh="http://schemas.microsoft.com/office/word/2020/wordml/sdtdatahash" xmlns:w16sdtfl="http://schemas.microsoft.com/office/word/2024/wordml/sdtformatlock" xmlns:w16se="http://schemas.microsoft.com/office/word/2015/wordml/symex" xmlns:wpg="http://schemas.microsoft.com/office/word/2010/wordprocessingGroup" xmlns:wpi="http://schemas.microsoft.com/office/word/2010/wordprocessingInk" xmlns:wne="http://schemas.microsoft.com/office/word/2006/wordml" xmlns:wps="http://schemas.microsoft.com/office/word/2010/wordprocessingShape" mc:Ignorable="w14 w15 w16se w16cid w16 w16cex w16sdtdh w16sdtfl w16du wp14">
+  <w:p>
+    <w:pPr>
+      <w:pStyle w:val="Header"/>
+      <w:tabs>
+        <w:tab w:val="clear" w:pos="4536"/>
+      </w:tabs>
+    </w:pPr>
+  </w:p>
+</w:hdr>
+</file>
+
+<file path=word/header2.xml><?xml version="1.0" encoding="utf-8"?>
+<w:hdr xmlns:wpc="http://schemas.microsoft.com/office/word/2010/wordprocessingCanvas" xmlns:cx="http://schemas.microsoft.com/office/drawing/2014/chartex" xmlns:cx1="http://schemas.microsoft.com/office/drawing/2015/9/8/chartex" xmlns:cx2="http://schemas.microsoft.com/office/drawing/2015/10/21/chartex" xmlns:cx3="http://schemas.microsoft.com/office/drawing/2016/5/9/chartex" xmlns:cx4="http://schemas.microsoft.com/office/drawing/2016/5/10/chartex" xmlns:cx5="http://schemas.microsoft.com/office/drawing/2016/5/11/chartex" xmlns:cx6="http://schemas.microsoft.com/office/drawing/2016/5/12/chartex" xmlns:cx7="http://schemas.microsoft.com/office/drawing/2016/5/13/chartex" xmlns:cx8="http://schemas.microsoft.com/office/drawing/2016/5/14/chartex" xmlns:mc="http://schemas.openxmlformats.org/markup-compatibility/2006" xmlns:aink="http://schemas.microsoft.com/office/drawing/2016/ink" xmlns:am3d="http://schemas.microsoft.com/office/drawing/2017/model3d" xmlns:o="urn:schemas-microsoft-com:office:office" xmlns:oel="http://schemas.microsoft.com/office/2019/extlst" xmlns:r="http://schemas.openxmlformats.org/officeDocument/2006/relationships" xmlns:m="http://schemas.openxmlformats.org/officeDocument/2006/math" xmlns:v="urn:schemas-microsoft-com:vml" xmlns:wp14="http://schemas.microsoft.com/office/word/2010/wordprocessingDrawing" xmlns:wp="http://schemas.openxmlformats.org/drawingml/2006/wordprocessingDrawing" xmlns:w10="urn:schemas-microsoft-com:office:word" xmlns:w="http://schemas.openxmlformats.org/wordprocessingml/2006/main" xmlns:w14="http://schemas.microsoft.com/office/word/2010/wordml" xmlns:w15="http://schemas.microsoft.com/office/word/2012/wordml" xmlns:w16cex="http://schemas.microsoft.com/office/word/2018/wordml/cex" xmlns:w16cid="http://schemas.microsoft.com/office/word/2016/wordml/cid" xmlns:w16="http://schemas.microsoft.com/office/word/2018/wordml" xmlns:w16du="http://schemas.microsoft.com/office/word/2023/wordml/word16du" xmlns:w16sdtdh="http://schemas.microsoft.com/office/word/2020/wordml/sdtdatahash" xmlns:w16sdtfl="http://schemas.microsoft.com/office/word/2024/wordml/sdtformatlock" xmlns:w16se="http://schemas.microsoft.com/office/word/2015/wordml/symex" xmlns:wpg="http://schemas.microsoft.com/office/word/2010/wordprocessingGroup" xmlns:wpi="http://schemas.microsoft.com/office/word/2010/wordprocessingInk" xmlns:wne="http://schemas.microsoft.com/office/word/2006/wordml" xmlns:wps="http://schemas.microsoft.com/office/word/2010/wordprocessingShape" mc:Ignorable="w14 w15 w16se w16cid w16 w16cex w16sdtdh w16sdtfl w16du wp14">
+  <w:p>
+    <w:pPr>
+      <w:pStyle w:val="Header"/>
+    </w:pPr>
+    <w:r>
+      <w:rPr>
+        <w:noProof/>
+        <w:vertAlign w:val="subscript"/>
+        <w:lang w:eastAsia="de-DE"/>
+      </w:rPr>
+      <w:drawing>
+        <wp:anchor distT="0" distB="0" distL="114300" distR="114300" simplePos="0" relativeHeight="251659776" behindDoc="1" locked="0" layoutInCell="1" allowOverlap="1" wp14:anchorId="19BF8582" wp14:editId="637182EC">
+          <wp:simplePos x="0" y="0"/>
+          <wp:positionH relativeFrom="column">
+            <wp:posOffset>-711835</wp:posOffset>
+          </wp:positionH>
+          <wp:positionV relativeFrom="paragraph">
+            <wp:posOffset>373380</wp:posOffset>
+          </wp:positionV>
+          <wp:extent cx="7206615" cy="960755"/>
+          <wp:effectExtent l="0" t="0" r="0" b="0"/>
+          <wp:wrapNone/>
+          <wp:docPr id="6" name="Grafik 6"/>
+          <wp:cNvGraphicFramePr>
+            <a:graphicFrameLocks xmlns:a="http://schemas.openxmlformats.org/drawingml/2006/main" noChangeAspect="1"/>
+          </wp:cNvGraphicFramePr>
+          <a:graphic xmlns:a="http://schemas.openxmlformats.org/drawingml/2006/main">
+            <a:graphicData uri="http://schemas.openxmlformats.org/drawingml/2006/picture">
+              <pic:pic xmlns:pic="http://schemas.openxmlformats.org/drawingml/2006/picture">
+                <pic:nvPicPr>
+                  <pic:cNvPr id="5" name=""/>
+                  <pic:cNvPicPr/>
+                </pic:nvPicPr>
+                <pic:blipFill>
+                  <a:blip r:embed="rId1"/>
+                  <a:stretch>
+                    <a:fillRect/>
+                  </a:stretch>
+                </pic:blipFill>
+                <pic:spPr>
+                  <a:xfrm>
+                    <a:off x="0" y="0"/>
+                    <a:ext cx="7206615" cy="960755"/>
+                  </a:xfrm>
+                  <a:prstGeom prst="rect">
+                    <a:avLst/>
+                  </a:prstGeom>
+                </pic:spPr>
+              </pic:pic>
+            </a:graphicData>
+          </a:graphic>
+          <wp14:sizeRelH relativeFrom="margin">
+            <wp14:pctWidth>0</wp14:pctWidth>
+          </wp14:sizeRelH>
+          <wp14:sizeRelV relativeFrom="margin">
+            <wp14:pctHeight>0</wp14:pctHeight>
+          </wp14:sizeRelV>
+        </wp:anchor>
+      </w:drawing>
+    </w:r>
+    <w:r>
+      <w:rPr>
+        <w:rFonts w:ascii="Times New Roman" w:eastAsia="Calibri" w:hAnsi="Times New Roman"/>
+        <w:noProof/>
+        <w:sz w:val="24"/>
+        <w:szCs w:val="24"/>
+        <w:lang w:eastAsia="de-DE"/>
+      </w:rPr>
+      <mc:AlternateContent>
+        <mc:Choice Requires="wps">
+          <w:drawing>
+            <wp:anchor distT="0" distB="0" distL="114300" distR="114300" simplePos="0" relativeHeight="251661824" behindDoc="0" locked="1" layoutInCell="1" allowOverlap="1" wp14:anchorId="14B88881" wp14:editId="404F21BB">
+              <wp:simplePos x="0" y="0"/>
+              <wp:positionH relativeFrom="column">
+                <wp:posOffset>-672465</wp:posOffset>
+              </wp:positionH>
+              <wp:positionV relativeFrom="paragraph">
+                <wp:posOffset>7800975</wp:posOffset>
+              </wp:positionV>
+              <wp:extent cx="504825" cy="2470785"/>
+              <wp:effectExtent l="0" t="0" r="9525" b="5715"/>
+              <wp:wrapNone/>
+              <wp:docPr id="7" name="Textfeld 10"/>
+              <wp:cNvGraphicFramePr>
+                <a:graphicFrameLocks xmlns:a="http://schemas.openxmlformats.org/drawingml/2006/main"/>
+              </wp:cNvGraphicFramePr>
+              <a:graphic xmlns:a="http://schemas.openxmlformats.org/drawingml/2006/main">
+                <a:graphicData uri="http://schemas.microsoft.com/office/word/2010/wordprocessingShape">
+                  <wps:wsp>
+                    <wps:cNvSpPr txBox="1">
+                      <a:spLocks noChangeArrowheads="1"/>
+                    </wps:cNvSpPr>
+                    <wps:spPr bwMode="auto">
+                      <a:xfrm>
+                        <a:off x="0" y="0"/>
+                        <a:ext cx="504825" cy="2470785"/>
+                      </a:xfrm>
+                      <a:prstGeom prst="rect">
+                        <a:avLst/>
+                      </a:prstGeom>
+                      <a:solidFill>
+                        <a:srgbClr val="FFFFFF"/>
+                      </a:solidFill>
+                      <a:ln>
+                        <a:noFill/>
+                      </a:ln>
+                      <a:extLst>
+                        <a:ext uri="{91240B29-F687-4F45-9708-019B960494DF}">
+                          <a14:hiddenLine xmlns:a14="http://schemas.microsoft.com/office/drawing/2010/main" w="9525">
+                            <a:solidFill>
+                              <a:srgbClr val="000000"/>
+                            </a:solidFill>
+                            <a:miter lim="800000"/>
+                            <a:headEnd/>
+                            <a:tailEnd/>
+                          </a14:hiddenLine>
+                        </a:ext>
+                      </a:extLst>
+                    </wps:spPr>
+                    <wps:txbx>
+                      <w:txbxContent>
+                        <w:p>
+                          <w:pPr>
+                            <w:spacing w:line="276" w:lineRule="auto"/>
+                            <w:jc w:val="center"/>
+                            <w:rPr>
+                              <w:rFonts w:ascii="Code 39" w:eastAsiaTheme="minorEastAsia" w:hAnsi="Code 39" w:cs="Arial"/>
+                              <w:sz w:val="18"/>
+                              <w:szCs w:val="18"/>
+                              <w:lang w:val="en-US" w:eastAsia="de-DE"/>
+                            </w:rPr>
+                          </w:pPr>
+                          <w:r>
+                            <w:rPr>
+                              <w:rFonts w:ascii="Code 39" w:hAnsi="Code 39" w:cs="Arial"/>
+                              <w:sz w:val="18"/>
+                              <w:szCs w:val="18"/>
+                              <w:lang w:val="en-US"/>
+                            </w:rPr>
+                            <w:t>*Y0003AC1E*</w:t>
+                          </w:r>
+                          <w:r>
+                            <w:rPr>
+                              <w:rFonts w:ascii="Code 39" w:hAnsi="Code 39" w:cs="Arial"/>
+                              <w:sz w:val="18"/>
+                              <w:szCs w:val="18"/>
+                              <w:lang w:val="en-US"/>
+                            </w:rPr>
+                            <w:t xml:space="preserve"> </w:t>
+                          </w:r>
+                        </w:p>
+                        <w:p>
+                          <w:pPr>
+                            <w:spacing w:line="276" w:lineRule="auto"/>
+                            <w:jc w:val="center"/>
+                            <w:rPr>
+                              <w:rFonts w:ascii="Arial" w:hAnsi="Arial" w:cs="Arial"/>
+                              <w:sz w:val="18"/>
+                              <w:szCs w:val="18"/>
+                              <w:lang w:val="en-US"/>
+                            </w:rPr>
+                          </w:pPr>
+                          <w:r>
+                            <w:rPr>
+                              <w:rFonts w:ascii="Arial" w:hAnsi="Arial" w:cs="Arial"/>
+                              <w:sz w:val="18"/>
+                              <w:szCs w:val="18"/>
+                              <w:lang w:val="en-US"/>
+                            </w:rPr>
+                            <w:t>*Y0003AC1E*</w:t>
+                          </w:r>
+                          <w:r>
+                            <w:rPr>
+                              <w:rFonts w:ascii="Arial" w:hAnsi="Arial" w:cs="Arial"/>
+                              <w:sz w:val="18"/>
+                              <w:szCs w:val="18"/>
+                              <w:lang w:val="en-US"/>
+                            </w:rPr>
+                            <w:t xml:space="preserve"> </w:t>
+                          </w:r>
+                        </w:p>
+                        <w:p>
+                          <w:pPr>
+                            <w:spacing w:line="276" w:lineRule="auto"/>
+                            <w:rPr>
+                              <w:sz w:val="18"/>
+                              <w:szCs w:val="18"/>
+                            </w:rPr>
+                          </w:pPr>
+                        </w:p>
+                      </w:txbxContent>
+                    </wps:txbx>
+                    <wps:bodyPr rot="0" vert="vert270" wrap="square" lIns="91440" tIns="45720" rIns="91440" bIns="45720" anchor="ctr" anchorCtr="0" upright="1">
+                      <a:noAutofit/>
+                    </wps:bodyPr>
+                  </wps:wsp>
+                </a:graphicData>
+              </a:graphic>
+              <wp14:sizeRelH relativeFrom="page">
+                <wp14:pctWidth>0</wp14:pctWidth>
+              </wp14:sizeRelH>
+              <wp14:sizeRelV relativeFrom="page">
+                <wp14:pctHeight>0</wp14:pctHeight>
+              </wp14:sizeRelV>
+            </wp:anchor>
+          </w:drawing>
+        </mc:Choice>
+        <mc:Fallback>
+          <w:pict>
+            <v:shapetype w14:anchorId="14B88881" id="_x0000_t202" coordsize="21600,21600" o:spt="202" path="m,l,21600r21600,l21600,xe">
+              <v:stroke joinstyle="miter"/>
+              <v:path gradientshapeok="t" o:connecttype="rect"/>
+            </v:shapetype>
+            <v:shape id="Textfeld 10" o:spid="_x0000_s1027" type="#_x0000_t202" style="position:absolute;left:0;text-align:left;margin-left:-52.95pt;margin-top:614.25pt;width:39.75pt;height:194.55pt;z-index:251661824;visibility:visible;mso-wrap-style:square;mso-width-percent:0;mso-height-percent:0;mso-wrap-distance-left:9pt;mso-wrap-distance-top:0;mso-wrap-distance-right:9pt;mso-wrap-distance-bottom:0;mso-position-horizontal:absolute;mso-position-horizontal-relative:text;mso-position-vertical:absolute;mso-position-vertical-relative:text;mso-width-percent:0;mso-height-percent:0;mso-width-relative:page;mso-height-relative:page;v-text-anchor:middle" o:gfxdata="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" stroked="f">
+              <v:textbox style="layout-flow:vertical;mso-layout-flow-alt:bottom-to-top">
+                <w:txbxContent>
+                  <w:p>
+                    <w:pPr>
+                      <w:spacing w:line="276" w:lineRule="auto"/>
+                      <w:jc w:val="center"/>
+                      <w:rPr>
+                        <w:rFonts w:ascii="Code 39" w:eastAsiaTheme="minorEastAsia" w:hAnsi="Code 39" w:cs="Arial"/>
+                        <w:sz w:val="18"/>
+                        <w:szCs w:val="18"/>
+                        <w:lang w:val="en-US" w:eastAsia="de-DE"/>
+                      </w:rPr>
+                    </w:pPr>
+                    <w:r>
+                      <w:rPr>
+                        <w:rFonts w:ascii="Code 39" w:hAnsi="Code 39" w:cs="Arial"/>
+                        <w:sz w:val="18"/>
+                        <w:szCs w:val="18"/>
+                        <w:lang w:val="en-US"/>
+                      </w:rPr>
+                      <w:t>*Y0003AC1E*</w:t>
+                    </w:r>
+                    <w:r>
+                      <w:rPr>
+                        <w:rFonts w:ascii="Code 39" w:hAnsi="Code 39" w:cs="Arial"/>
+                        <w:sz w:val="18"/>
+                        <w:szCs w:val="18"/>
+                        <w:lang w:val="en-US"/>
+                      </w:rPr>
+                      <w:t xml:space="preserve"> </w:t>
+                    </w:r>
+                  </w:p>
+                  <w:p>
+                    <w:pPr>
+                      <w:spacing w:line="276" w:lineRule="auto"/>
+                      <w:jc w:val="center"/>
+                      <w:rPr>
+                        <w:rFonts w:ascii="Arial" w:hAnsi="Arial" w:cs="Arial"/>
+                        <w:sz w:val="18"/>
+                        <w:szCs w:val="18"/>
+                        <w:lang w:val="en-US"/>
+                      </w:rPr>
+                    </w:pPr>
+                    <w:r>
+                      <w:rPr>
+                        <w:rFonts w:ascii="Arial" w:hAnsi="Arial" w:cs="Arial"/>
+                        <w:sz w:val="18"/>
+                        <w:szCs w:val="18"/>
+                        <w:lang w:val="en-US"/>
+                      </w:rPr>
+                      <w:t>*Y0003AC1E*</w:t>
+                    </w:r>
+                    <w:r>
+                      <w:rPr>
+                        <w:rFonts w:ascii="Arial" w:hAnsi="Arial" w:cs="Arial"/>
+                        <w:sz w:val="18"/>
+                        <w:szCs w:val="18"/>
+                        <w:lang w:val="en-US"/>
+                      </w:rPr>
+                      <w:t xml:space="preserve"> </w:t>
+                    </w:r>
+                  </w:p>
+                  <w:p>
+                    <w:pPr>
+                      <w:spacing w:line="276" w:lineRule="auto"/>
+                      <w:rPr>
+                        <w:sz w:val="18"/>
+                        <w:szCs w:val="18"/>
+                      </w:rPr>
+                    </w:pPr>
+                  </w:p>
+                </w:txbxContent>
+              </v:textbox>
+              <w10:anchorlock/>
+            </v:shape>
+          </w:pict>
+        </mc:Fallback>
+      </mc:AlternateContent>
+    </w:r>
+  </w:p>
+</w:hdr>
 </file>
 
 <file path=word/numbering.xml><?xml version="1.0" encoding="utf-8"?>

</xml_diff>